<commit_message>
Add:cartella testing e file per il punto 9, inizializzato TestPlan_EWMS con l'aggiunta del punto 9
</commit_message>
<xml_diff>
--- a/Workspace/ODD/ODD_EWMS.docx
+++ b/Workspace/ODD/ODD_EWMS.docx
@@ -1836,6 +1836,19 @@
       </w:pPr>
     </w:p>
     <w:p>
+      <w:pPr>
+        <w:pStyle w:val="Sommario1"/>
+        <w:tabs>
+          <w:tab w:val="left" w:pos="480"/>
+        </w:tabs>
+        <w:rPr>
+          <w:rFonts w:asciiTheme="minorHAnsi" w:eastAsiaTheme="minorEastAsia" w:hAnsiTheme="minorHAnsi" w:cstheme="minorBidi"/>
+          <w:noProof/>
+          <w:kern w:val="2"/>
+          <w:lang w:eastAsia="it-IT"/>
+          <w14:ligatures w14:val="standardContextual"/>
+        </w:rPr>
+      </w:pPr>
       <w:r>
         <w:fldChar w:fldCharType="begin"/>
       </w:r>
@@ -1845,14 +1858,1027 @@
       <w:r>
         <w:fldChar w:fldCharType="separate"/>
       </w:r>
-      <w:r>
+      <w:hyperlink w:anchor="_Toc217035658" w:history="1">
+        <w:r>
+          <w:rPr>
+            <w:rStyle w:val="Collegamentoipertestuale"/>
+            <w:noProof/>
+          </w:rPr>
+          <w:t>1.</w:t>
+        </w:r>
+        <w:r>
+          <w:rPr>
+            <w:rFonts w:asciiTheme="minorHAnsi" w:eastAsiaTheme="minorEastAsia" w:hAnsiTheme="minorHAnsi" w:cstheme="minorBidi"/>
+            <w:noProof/>
+            <w:kern w:val="2"/>
+            <w:lang w:eastAsia="it-IT"/>
+            <w14:ligatures w14:val="standardContextual"/>
+          </w:rPr>
+          <w:tab/>
+        </w:r>
+        <w:r>
+          <w:rPr>
+            <w:rStyle w:val="Collegamentoipertestuale"/>
+            <w:noProof/>
+          </w:rPr>
+          <w:t>Introduzione</w:t>
+        </w:r>
+        <w:r>
+          <w:rPr>
+            <w:noProof/>
+            <w:webHidden/>
+          </w:rPr>
+          <w:tab/>
+        </w:r>
+        <w:r>
+          <w:rPr>
+            <w:noProof/>
+            <w:webHidden/>
+          </w:rPr>
+          <w:fldChar w:fldCharType="begin"/>
+        </w:r>
+        <w:r>
+          <w:rPr>
+            <w:noProof/>
+            <w:webHidden/>
+          </w:rPr>
+          <w:instrText xml:space="preserve"> PAGEREF _Toc217035658 \h </w:instrText>
+        </w:r>
+        <w:r>
+          <w:rPr>
+            <w:noProof/>
+            <w:webHidden/>
+          </w:rPr>
+        </w:r>
+        <w:r>
+          <w:rPr>
+            <w:noProof/>
+            <w:webHidden/>
+          </w:rPr>
+          <w:fldChar w:fldCharType="separate"/>
+        </w:r>
+        <w:r>
+          <w:rPr>
+            <w:noProof/>
+            <w:webHidden/>
+          </w:rPr>
+          <w:t>4</w:t>
+        </w:r>
+        <w:r>
+          <w:rPr>
+            <w:noProof/>
+            <w:webHidden/>
+          </w:rPr>
+          <w:fldChar w:fldCharType="end"/>
+        </w:r>
+      </w:hyperlink>
+    </w:p>
+    <w:p>
+      <w:pPr>
+        <w:pStyle w:val="Sommario2"/>
+        <w:tabs>
+          <w:tab w:val="left" w:pos="1132"/>
+        </w:tabs>
         <w:rPr>
-          <w:b/>
-          <w:bCs/>
+          <w:rFonts w:asciiTheme="minorHAnsi" w:eastAsiaTheme="minorEastAsia" w:hAnsiTheme="minorHAnsi" w:cstheme="minorBidi"/>
           <w:noProof/>
+          <w:kern w:val="2"/>
+          <w:lang w:eastAsia="it-IT"/>
+          <w14:ligatures w14:val="standardContextual"/>
         </w:rPr>
-        <w:t>Nessuna voce di sommario trovata.</w:t>
-      </w:r>
+      </w:pPr>
+      <w:hyperlink w:anchor="_Toc217035659" w:history="1">
+        <w:r>
+          <w:rPr>
+            <w:rStyle w:val="Collegamentoipertestuale"/>
+            <w:noProof/>
+          </w:rPr>
+          <w:t>1.1</w:t>
+        </w:r>
+        <w:r>
+          <w:rPr>
+            <w:rFonts w:asciiTheme="minorHAnsi" w:eastAsiaTheme="minorEastAsia" w:hAnsiTheme="minorHAnsi" w:cstheme="minorBidi"/>
+            <w:noProof/>
+            <w:kern w:val="2"/>
+            <w:lang w:eastAsia="it-IT"/>
+            <w14:ligatures w14:val="standardContextual"/>
+          </w:rPr>
+          <w:tab/>
+        </w:r>
+        <w:r>
+          <w:rPr>
+            <w:rStyle w:val="Collegamentoipertestuale"/>
+            <w:noProof/>
+          </w:rPr>
+          <w:t>Object design trade-offs</w:t>
+        </w:r>
+        <w:r>
+          <w:rPr>
+            <w:noProof/>
+            <w:webHidden/>
+          </w:rPr>
+          <w:tab/>
+        </w:r>
+        <w:r>
+          <w:rPr>
+            <w:noProof/>
+            <w:webHidden/>
+          </w:rPr>
+          <w:fldChar w:fldCharType="begin"/>
+        </w:r>
+        <w:r>
+          <w:rPr>
+            <w:noProof/>
+            <w:webHidden/>
+          </w:rPr>
+          <w:instrText xml:space="preserve"> PAGEREF _Toc217035659 \h </w:instrText>
+        </w:r>
+        <w:r>
+          <w:rPr>
+            <w:noProof/>
+            <w:webHidden/>
+          </w:rPr>
+        </w:r>
+        <w:r>
+          <w:rPr>
+            <w:noProof/>
+            <w:webHidden/>
+          </w:rPr>
+          <w:fldChar w:fldCharType="separate"/>
+        </w:r>
+        <w:r>
+          <w:rPr>
+            <w:noProof/>
+            <w:webHidden/>
+          </w:rPr>
+          <w:t>4</w:t>
+        </w:r>
+        <w:r>
+          <w:rPr>
+            <w:noProof/>
+            <w:webHidden/>
+          </w:rPr>
+          <w:fldChar w:fldCharType="end"/>
+        </w:r>
+      </w:hyperlink>
+    </w:p>
+    <w:p>
+      <w:pPr>
+        <w:pStyle w:val="Sommario2"/>
+        <w:tabs>
+          <w:tab w:val="left" w:pos="1132"/>
+        </w:tabs>
+        <w:rPr>
+          <w:rFonts w:asciiTheme="minorHAnsi" w:eastAsiaTheme="minorEastAsia" w:hAnsiTheme="minorHAnsi" w:cstheme="minorBidi"/>
+          <w:noProof/>
+          <w:kern w:val="2"/>
+          <w:lang w:eastAsia="it-IT"/>
+          <w14:ligatures w14:val="standardContextual"/>
+        </w:rPr>
+      </w:pPr>
+      <w:hyperlink w:anchor="_Toc217035660" w:history="1">
+        <w:r>
+          <w:rPr>
+            <w:rStyle w:val="Collegamentoipertestuale"/>
+            <w:noProof/>
+          </w:rPr>
+          <w:t>1.2</w:t>
+        </w:r>
+        <w:r>
+          <w:rPr>
+            <w:rFonts w:asciiTheme="minorHAnsi" w:eastAsiaTheme="minorEastAsia" w:hAnsiTheme="minorHAnsi" w:cstheme="minorBidi"/>
+            <w:noProof/>
+            <w:kern w:val="2"/>
+            <w:lang w:eastAsia="it-IT"/>
+            <w14:ligatures w14:val="standardContextual"/>
+          </w:rPr>
+          <w:tab/>
+        </w:r>
+        <w:r>
+          <w:rPr>
+            <w:rStyle w:val="Collegamentoipertestuale"/>
+            <w:noProof/>
+          </w:rPr>
+          <w:t>Interface documentation guidelines</w:t>
+        </w:r>
+        <w:r>
+          <w:rPr>
+            <w:noProof/>
+            <w:webHidden/>
+          </w:rPr>
+          <w:tab/>
+        </w:r>
+        <w:r>
+          <w:rPr>
+            <w:noProof/>
+            <w:webHidden/>
+          </w:rPr>
+          <w:fldChar w:fldCharType="begin"/>
+        </w:r>
+        <w:r>
+          <w:rPr>
+            <w:noProof/>
+            <w:webHidden/>
+          </w:rPr>
+          <w:instrText xml:space="preserve"> PAGEREF _Toc217035660 \h </w:instrText>
+        </w:r>
+        <w:r>
+          <w:rPr>
+            <w:noProof/>
+            <w:webHidden/>
+          </w:rPr>
+        </w:r>
+        <w:r>
+          <w:rPr>
+            <w:noProof/>
+            <w:webHidden/>
+          </w:rPr>
+          <w:fldChar w:fldCharType="separate"/>
+        </w:r>
+        <w:r>
+          <w:rPr>
+            <w:noProof/>
+            <w:webHidden/>
+          </w:rPr>
+          <w:t>5</w:t>
+        </w:r>
+        <w:r>
+          <w:rPr>
+            <w:noProof/>
+            <w:webHidden/>
+          </w:rPr>
+          <w:fldChar w:fldCharType="end"/>
+        </w:r>
+      </w:hyperlink>
+    </w:p>
+    <w:p>
+      <w:pPr>
+        <w:pStyle w:val="Sommario1"/>
+        <w:tabs>
+          <w:tab w:val="left" w:pos="480"/>
+        </w:tabs>
+        <w:rPr>
+          <w:rFonts w:asciiTheme="minorHAnsi" w:eastAsiaTheme="minorEastAsia" w:hAnsiTheme="minorHAnsi" w:cstheme="minorBidi"/>
+          <w:noProof/>
+          <w:kern w:val="2"/>
+          <w:lang w:eastAsia="it-IT"/>
+          <w14:ligatures w14:val="standardContextual"/>
+        </w:rPr>
+      </w:pPr>
+      <w:hyperlink w:anchor="_Toc217035661" w:history="1">
+        <w:r>
+          <w:rPr>
+            <w:rStyle w:val="Collegamentoipertestuale"/>
+            <w:noProof/>
+          </w:rPr>
+          <w:t>2.</w:t>
+        </w:r>
+        <w:r>
+          <w:rPr>
+            <w:rFonts w:asciiTheme="minorHAnsi" w:eastAsiaTheme="minorEastAsia" w:hAnsiTheme="minorHAnsi" w:cstheme="minorBidi"/>
+            <w:noProof/>
+            <w:kern w:val="2"/>
+            <w:lang w:eastAsia="it-IT"/>
+            <w14:ligatures w14:val="standardContextual"/>
+          </w:rPr>
+          <w:tab/>
+        </w:r>
+        <w:r>
+          <w:rPr>
+            <w:rStyle w:val="Collegamentoipertestuale"/>
+            <w:noProof/>
+          </w:rPr>
+          <w:t>Pacchetti</w:t>
+        </w:r>
+        <w:r>
+          <w:rPr>
+            <w:noProof/>
+            <w:webHidden/>
+          </w:rPr>
+          <w:tab/>
+        </w:r>
+        <w:r>
+          <w:rPr>
+            <w:noProof/>
+            <w:webHidden/>
+          </w:rPr>
+          <w:fldChar w:fldCharType="begin"/>
+        </w:r>
+        <w:r>
+          <w:rPr>
+            <w:noProof/>
+            <w:webHidden/>
+          </w:rPr>
+          <w:instrText xml:space="preserve"> PAGEREF _Toc217035661 \h </w:instrText>
+        </w:r>
+        <w:r>
+          <w:rPr>
+            <w:noProof/>
+            <w:webHidden/>
+          </w:rPr>
+        </w:r>
+        <w:r>
+          <w:rPr>
+            <w:noProof/>
+            <w:webHidden/>
+          </w:rPr>
+          <w:fldChar w:fldCharType="separate"/>
+        </w:r>
+        <w:r>
+          <w:rPr>
+            <w:noProof/>
+            <w:webHidden/>
+          </w:rPr>
+          <w:t>7</w:t>
+        </w:r>
+        <w:r>
+          <w:rPr>
+            <w:noProof/>
+            <w:webHidden/>
+          </w:rPr>
+          <w:fldChar w:fldCharType="end"/>
+        </w:r>
+      </w:hyperlink>
+    </w:p>
+    <w:p>
+      <w:pPr>
+        <w:pStyle w:val="Sommario2"/>
+        <w:rPr>
+          <w:rFonts w:asciiTheme="minorHAnsi" w:eastAsiaTheme="minorEastAsia" w:hAnsiTheme="minorHAnsi" w:cstheme="minorBidi"/>
+          <w:noProof/>
+          <w:kern w:val="2"/>
+          <w:lang w:eastAsia="it-IT"/>
+          <w14:ligatures w14:val="standardContextual"/>
+        </w:rPr>
+      </w:pPr>
+      <w:hyperlink w:anchor="_Toc217035662" w:history="1">
+        <w:r>
+          <w:rPr>
+            <w:rStyle w:val="Collegamentoipertestuale"/>
+            <w:noProof/>
+          </w:rPr>
+          <w:t>2.1 Decomposizione dei sottosistemi in package</w:t>
+        </w:r>
+        <w:r>
+          <w:rPr>
+            <w:noProof/>
+            <w:webHidden/>
+          </w:rPr>
+          <w:tab/>
+        </w:r>
+        <w:r>
+          <w:rPr>
+            <w:noProof/>
+            <w:webHidden/>
+          </w:rPr>
+          <w:fldChar w:fldCharType="begin"/>
+        </w:r>
+        <w:r>
+          <w:rPr>
+            <w:noProof/>
+            <w:webHidden/>
+          </w:rPr>
+          <w:instrText xml:space="preserve"> PAGEREF _Toc217035662 \h </w:instrText>
+        </w:r>
+        <w:r>
+          <w:rPr>
+            <w:noProof/>
+            <w:webHidden/>
+          </w:rPr>
+        </w:r>
+        <w:r>
+          <w:rPr>
+            <w:noProof/>
+            <w:webHidden/>
+          </w:rPr>
+          <w:fldChar w:fldCharType="separate"/>
+        </w:r>
+        <w:r>
+          <w:rPr>
+            <w:noProof/>
+            <w:webHidden/>
+          </w:rPr>
+          <w:t>7</w:t>
+        </w:r>
+        <w:r>
+          <w:rPr>
+            <w:noProof/>
+            <w:webHidden/>
+          </w:rPr>
+          <w:fldChar w:fldCharType="end"/>
+        </w:r>
+      </w:hyperlink>
+    </w:p>
+    <w:p>
+      <w:pPr>
+        <w:pStyle w:val="Sommario2"/>
+        <w:rPr>
+          <w:rFonts w:asciiTheme="minorHAnsi" w:eastAsiaTheme="minorEastAsia" w:hAnsiTheme="minorHAnsi" w:cstheme="minorBidi"/>
+          <w:noProof/>
+          <w:kern w:val="2"/>
+          <w:lang w:eastAsia="it-IT"/>
+          <w14:ligatures w14:val="standardContextual"/>
+        </w:rPr>
+      </w:pPr>
+      <w:hyperlink w:anchor="_Toc217035663" w:history="1">
+        <w:r>
+          <w:rPr>
+            <w:rStyle w:val="Collegamentoipertestuale"/>
+            <w:noProof/>
+          </w:rPr>
+          <w:t>2.3 Dipendenze tra package</w:t>
+        </w:r>
+        <w:r>
+          <w:rPr>
+            <w:noProof/>
+            <w:webHidden/>
+          </w:rPr>
+          <w:tab/>
+        </w:r>
+        <w:r>
+          <w:rPr>
+            <w:noProof/>
+            <w:webHidden/>
+          </w:rPr>
+          <w:fldChar w:fldCharType="begin"/>
+        </w:r>
+        <w:r>
+          <w:rPr>
+            <w:noProof/>
+            <w:webHidden/>
+          </w:rPr>
+          <w:instrText xml:space="preserve"> PAGEREF _Toc217035663 \h </w:instrText>
+        </w:r>
+        <w:r>
+          <w:rPr>
+            <w:noProof/>
+            <w:webHidden/>
+          </w:rPr>
+        </w:r>
+        <w:r>
+          <w:rPr>
+            <w:noProof/>
+            <w:webHidden/>
+          </w:rPr>
+          <w:fldChar w:fldCharType="separate"/>
+        </w:r>
+        <w:r>
+          <w:rPr>
+            <w:noProof/>
+            <w:webHidden/>
+          </w:rPr>
+          <w:t>9</w:t>
+        </w:r>
+        <w:r>
+          <w:rPr>
+            <w:noProof/>
+            <w:webHidden/>
+          </w:rPr>
+          <w:fldChar w:fldCharType="end"/>
+        </w:r>
+      </w:hyperlink>
+    </w:p>
+    <w:p>
+      <w:pPr>
+        <w:pStyle w:val="Sommario1"/>
+        <w:tabs>
+          <w:tab w:val="left" w:pos="480"/>
+        </w:tabs>
+        <w:rPr>
+          <w:rFonts w:asciiTheme="minorHAnsi" w:eastAsiaTheme="minorEastAsia" w:hAnsiTheme="minorHAnsi" w:cstheme="minorBidi"/>
+          <w:noProof/>
+          <w:kern w:val="2"/>
+          <w:lang w:eastAsia="it-IT"/>
+          <w14:ligatures w14:val="standardContextual"/>
+        </w:rPr>
+      </w:pPr>
+      <w:hyperlink w:anchor="_Toc217035664" w:history="1">
+        <w:r>
+          <w:rPr>
+            <w:rStyle w:val="Collegamentoipertestuale"/>
+            <w:noProof/>
+          </w:rPr>
+          <w:t>3.</w:t>
+        </w:r>
+        <w:r>
+          <w:rPr>
+            <w:rFonts w:asciiTheme="minorHAnsi" w:eastAsiaTheme="minorEastAsia" w:hAnsiTheme="minorHAnsi" w:cstheme="minorBidi"/>
+            <w:noProof/>
+            <w:kern w:val="2"/>
+            <w:lang w:eastAsia="it-IT"/>
+            <w14:ligatures w14:val="standardContextual"/>
+          </w:rPr>
+          <w:tab/>
+        </w:r>
+        <w:r>
+          <w:rPr>
+            <w:rStyle w:val="Collegamentoipertestuale"/>
+            <w:noProof/>
+          </w:rPr>
+          <w:t>Class interfaces</w:t>
+        </w:r>
+        <w:r>
+          <w:rPr>
+            <w:noProof/>
+            <w:webHidden/>
+          </w:rPr>
+          <w:tab/>
+        </w:r>
+        <w:r>
+          <w:rPr>
+            <w:noProof/>
+            <w:webHidden/>
+          </w:rPr>
+          <w:fldChar w:fldCharType="begin"/>
+        </w:r>
+        <w:r>
+          <w:rPr>
+            <w:noProof/>
+            <w:webHidden/>
+          </w:rPr>
+          <w:instrText xml:space="preserve"> PAGEREF _Toc217035664 \h </w:instrText>
+        </w:r>
+        <w:r>
+          <w:rPr>
+            <w:noProof/>
+            <w:webHidden/>
+          </w:rPr>
+        </w:r>
+        <w:r>
+          <w:rPr>
+            <w:noProof/>
+            <w:webHidden/>
+          </w:rPr>
+          <w:fldChar w:fldCharType="separate"/>
+        </w:r>
+        <w:r>
+          <w:rPr>
+            <w:noProof/>
+            <w:webHidden/>
+          </w:rPr>
+          <w:t>10</w:t>
+        </w:r>
+        <w:r>
+          <w:rPr>
+            <w:noProof/>
+            <w:webHidden/>
+          </w:rPr>
+          <w:fldChar w:fldCharType="end"/>
+        </w:r>
+      </w:hyperlink>
+    </w:p>
+    <w:p>
+      <w:pPr>
+        <w:pStyle w:val="Sommario2"/>
+        <w:tabs>
+          <w:tab w:val="left" w:pos="1132"/>
+        </w:tabs>
+        <w:rPr>
+          <w:rFonts w:asciiTheme="minorHAnsi" w:eastAsiaTheme="minorEastAsia" w:hAnsiTheme="minorHAnsi" w:cstheme="minorBidi"/>
+          <w:noProof/>
+          <w:kern w:val="2"/>
+          <w:lang w:eastAsia="it-IT"/>
+          <w14:ligatures w14:val="standardContextual"/>
+        </w:rPr>
+      </w:pPr>
+      <w:hyperlink w:anchor="_Toc217035665" w:history="1">
+        <w:r>
+          <w:rPr>
+            <w:rStyle w:val="Collegamentoipertestuale"/>
+            <w:noProof/>
+          </w:rPr>
+          <w:t>3.1</w:t>
+        </w:r>
+        <w:r>
+          <w:rPr>
+            <w:rFonts w:asciiTheme="minorHAnsi" w:eastAsiaTheme="minorEastAsia" w:hAnsiTheme="minorHAnsi" w:cstheme="minorBidi"/>
+            <w:noProof/>
+            <w:kern w:val="2"/>
+            <w:lang w:eastAsia="it-IT"/>
+            <w14:ligatures w14:val="standardContextual"/>
+          </w:rPr>
+          <w:tab/>
+        </w:r>
+        <w:r>
+          <w:rPr>
+            <w:rStyle w:val="Collegamentoipertestuale"/>
+            <w:noProof/>
+          </w:rPr>
+          <w:t>AccessManagement</w:t>
+        </w:r>
+        <w:r>
+          <w:rPr>
+            <w:noProof/>
+            <w:webHidden/>
+          </w:rPr>
+          <w:tab/>
+        </w:r>
+        <w:r>
+          <w:rPr>
+            <w:noProof/>
+            <w:webHidden/>
+          </w:rPr>
+          <w:fldChar w:fldCharType="begin"/>
+        </w:r>
+        <w:r>
+          <w:rPr>
+            <w:noProof/>
+            <w:webHidden/>
+          </w:rPr>
+          <w:instrText xml:space="preserve"> PAGEREF _Toc217035665 \h </w:instrText>
+        </w:r>
+        <w:r>
+          <w:rPr>
+            <w:noProof/>
+            <w:webHidden/>
+          </w:rPr>
+        </w:r>
+        <w:r>
+          <w:rPr>
+            <w:noProof/>
+            <w:webHidden/>
+          </w:rPr>
+          <w:fldChar w:fldCharType="separate"/>
+        </w:r>
+        <w:r>
+          <w:rPr>
+            <w:noProof/>
+            <w:webHidden/>
+          </w:rPr>
+          <w:t>10</w:t>
+        </w:r>
+        <w:r>
+          <w:rPr>
+            <w:noProof/>
+            <w:webHidden/>
+          </w:rPr>
+          <w:fldChar w:fldCharType="end"/>
+        </w:r>
+      </w:hyperlink>
+    </w:p>
+    <w:p>
+      <w:pPr>
+        <w:pStyle w:val="Sommario2"/>
+        <w:tabs>
+          <w:tab w:val="left" w:pos="1132"/>
+        </w:tabs>
+        <w:rPr>
+          <w:rFonts w:asciiTheme="minorHAnsi" w:eastAsiaTheme="minorEastAsia" w:hAnsiTheme="minorHAnsi" w:cstheme="minorBidi"/>
+          <w:noProof/>
+          <w:kern w:val="2"/>
+          <w:lang w:eastAsia="it-IT"/>
+          <w14:ligatures w14:val="standardContextual"/>
+        </w:rPr>
+      </w:pPr>
+      <w:hyperlink w:anchor="_Toc217035666" w:history="1">
+        <w:r>
+          <w:rPr>
+            <w:rStyle w:val="Collegamentoipertestuale"/>
+            <w:noProof/>
+          </w:rPr>
+          <w:t>3.2</w:t>
+        </w:r>
+        <w:r>
+          <w:rPr>
+            <w:rFonts w:asciiTheme="minorHAnsi" w:eastAsiaTheme="minorEastAsia" w:hAnsiTheme="minorHAnsi" w:cstheme="minorBidi"/>
+            <w:noProof/>
+            <w:kern w:val="2"/>
+            <w:lang w:eastAsia="it-IT"/>
+            <w14:ligatures w14:val="standardContextual"/>
+          </w:rPr>
+          <w:tab/>
+        </w:r>
+        <w:r>
+          <w:rPr>
+            <w:rStyle w:val="Collegamentoipertestuale"/>
+            <w:noProof/>
+          </w:rPr>
+          <w:t>AccountManagement</w:t>
+        </w:r>
+        <w:r>
+          <w:rPr>
+            <w:noProof/>
+            <w:webHidden/>
+          </w:rPr>
+          <w:tab/>
+        </w:r>
+        <w:r>
+          <w:rPr>
+            <w:noProof/>
+            <w:webHidden/>
+          </w:rPr>
+          <w:fldChar w:fldCharType="begin"/>
+        </w:r>
+        <w:r>
+          <w:rPr>
+            <w:noProof/>
+            <w:webHidden/>
+          </w:rPr>
+          <w:instrText xml:space="preserve"> PAGEREF _Toc217035666 \h </w:instrText>
+        </w:r>
+        <w:r>
+          <w:rPr>
+            <w:noProof/>
+            <w:webHidden/>
+          </w:rPr>
+        </w:r>
+        <w:r>
+          <w:rPr>
+            <w:noProof/>
+            <w:webHidden/>
+          </w:rPr>
+          <w:fldChar w:fldCharType="separate"/>
+        </w:r>
+        <w:r>
+          <w:rPr>
+            <w:noProof/>
+            <w:webHidden/>
+          </w:rPr>
+          <w:t>11</w:t>
+        </w:r>
+        <w:r>
+          <w:rPr>
+            <w:noProof/>
+            <w:webHidden/>
+          </w:rPr>
+          <w:fldChar w:fldCharType="end"/>
+        </w:r>
+      </w:hyperlink>
+    </w:p>
+    <w:p>
+      <w:pPr>
+        <w:pStyle w:val="Sommario2"/>
+        <w:tabs>
+          <w:tab w:val="left" w:pos="1132"/>
+        </w:tabs>
+        <w:rPr>
+          <w:rFonts w:asciiTheme="minorHAnsi" w:eastAsiaTheme="minorEastAsia" w:hAnsiTheme="minorHAnsi" w:cstheme="minorBidi"/>
+          <w:noProof/>
+          <w:kern w:val="2"/>
+          <w:lang w:eastAsia="it-IT"/>
+          <w14:ligatures w14:val="standardContextual"/>
+        </w:rPr>
+      </w:pPr>
+      <w:hyperlink w:anchor="_Toc217035667" w:history="1">
+        <w:r>
+          <w:rPr>
+            <w:rStyle w:val="Collegamentoipertestuale"/>
+            <w:noProof/>
+            <w:lang w:val="en-GB"/>
+          </w:rPr>
+          <w:t>3.3</w:t>
+        </w:r>
+        <w:r>
+          <w:rPr>
+            <w:rFonts w:asciiTheme="minorHAnsi" w:eastAsiaTheme="minorEastAsia" w:hAnsiTheme="minorHAnsi" w:cstheme="minorBidi"/>
+            <w:noProof/>
+            <w:kern w:val="2"/>
+            <w:lang w:eastAsia="it-IT"/>
+            <w14:ligatures w14:val="standardContextual"/>
+          </w:rPr>
+          <w:tab/>
+        </w:r>
+        <w:r>
+          <w:rPr>
+            <w:rStyle w:val="Collegamentoipertestuale"/>
+            <w:noProof/>
+            <w:lang w:val="en-GB"/>
+          </w:rPr>
+          <w:t>TaskManagement</w:t>
+        </w:r>
+        <w:r>
+          <w:rPr>
+            <w:noProof/>
+            <w:webHidden/>
+          </w:rPr>
+          <w:tab/>
+        </w:r>
+        <w:r>
+          <w:rPr>
+            <w:noProof/>
+            <w:webHidden/>
+          </w:rPr>
+          <w:fldChar w:fldCharType="begin"/>
+        </w:r>
+        <w:r>
+          <w:rPr>
+            <w:noProof/>
+            <w:webHidden/>
+          </w:rPr>
+          <w:instrText xml:space="preserve"> PAGEREF _Toc217035667 \h </w:instrText>
+        </w:r>
+        <w:r>
+          <w:rPr>
+            <w:noProof/>
+            <w:webHidden/>
+          </w:rPr>
+        </w:r>
+        <w:r>
+          <w:rPr>
+            <w:noProof/>
+            <w:webHidden/>
+          </w:rPr>
+          <w:fldChar w:fldCharType="separate"/>
+        </w:r>
+        <w:r>
+          <w:rPr>
+            <w:noProof/>
+            <w:webHidden/>
+          </w:rPr>
+          <w:t>15</w:t>
+        </w:r>
+        <w:r>
+          <w:rPr>
+            <w:noProof/>
+            <w:webHidden/>
+          </w:rPr>
+          <w:fldChar w:fldCharType="end"/>
+        </w:r>
+      </w:hyperlink>
+    </w:p>
+    <w:p>
+      <w:pPr>
+        <w:pStyle w:val="Sommario2"/>
+        <w:tabs>
+          <w:tab w:val="left" w:pos="1132"/>
+        </w:tabs>
+        <w:rPr>
+          <w:rFonts w:asciiTheme="minorHAnsi" w:eastAsiaTheme="minorEastAsia" w:hAnsiTheme="minorHAnsi" w:cstheme="minorBidi"/>
+          <w:noProof/>
+          <w:kern w:val="2"/>
+          <w:lang w:eastAsia="it-IT"/>
+          <w14:ligatures w14:val="standardContextual"/>
+        </w:rPr>
+      </w:pPr>
+      <w:hyperlink w:anchor="_Toc217035668" w:history="1">
+        <w:r>
+          <w:rPr>
+            <w:rStyle w:val="Collegamentoipertestuale"/>
+            <w:noProof/>
+            <w:lang w:val="en-GB"/>
+          </w:rPr>
+          <w:t>3.4</w:t>
+        </w:r>
+        <w:r>
+          <w:rPr>
+            <w:rFonts w:asciiTheme="minorHAnsi" w:eastAsiaTheme="minorEastAsia" w:hAnsiTheme="minorHAnsi" w:cstheme="minorBidi"/>
+            <w:noProof/>
+            <w:kern w:val="2"/>
+            <w:lang w:eastAsia="it-IT"/>
+            <w14:ligatures w14:val="standardContextual"/>
+          </w:rPr>
+          <w:tab/>
+        </w:r>
+        <w:r>
+          <w:rPr>
+            <w:rStyle w:val="Collegamentoipertestuale"/>
+            <w:noProof/>
+            <w:lang w:val="en-GB"/>
+          </w:rPr>
+          <w:t>NotificheManagement</w:t>
+        </w:r>
+        <w:r>
+          <w:rPr>
+            <w:noProof/>
+            <w:webHidden/>
+          </w:rPr>
+          <w:tab/>
+        </w:r>
+        <w:r>
+          <w:rPr>
+            <w:noProof/>
+            <w:webHidden/>
+          </w:rPr>
+          <w:fldChar w:fldCharType="begin"/>
+        </w:r>
+        <w:r>
+          <w:rPr>
+            <w:noProof/>
+            <w:webHidden/>
+          </w:rPr>
+          <w:instrText xml:space="preserve"> PAGEREF _Toc217035668 \h </w:instrText>
+        </w:r>
+        <w:r>
+          <w:rPr>
+            <w:noProof/>
+            <w:webHidden/>
+          </w:rPr>
+        </w:r>
+        <w:r>
+          <w:rPr>
+            <w:noProof/>
+            <w:webHidden/>
+          </w:rPr>
+          <w:fldChar w:fldCharType="separate"/>
+        </w:r>
+        <w:r>
+          <w:rPr>
+            <w:noProof/>
+            <w:webHidden/>
+          </w:rPr>
+          <w:t>20</w:t>
+        </w:r>
+        <w:r>
+          <w:rPr>
+            <w:noProof/>
+            <w:webHidden/>
+          </w:rPr>
+          <w:fldChar w:fldCharType="end"/>
+        </w:r>
+      </w:hyperlink>
+    </w:p>
+    <w:p>
+      <w:pPr>
+        <w:pStyle w:val="Sommario2"/>
+        <w:tabs>
+          <w:tab w:val="left" w:pos="1132"/>
+        </w:tabs>
+        <w:rPr>
+          <w:rFonts w:asciiTheme="minorHAnsi" w:eastAsiaTheme="minorEastAsia" w:hAnsiTheme="minorHAnsi" w:cstheme="minorBidi"/>
+          <w:noProof/>
+          <w:kern w:val="2"/>
+          <w:lang w:eastAsia="it-IT"/>
+          <w14:ligatures w14:val="standardContextual"/>
+        </w:rPr>
+      </w:pPr>
+      <w:hyperlink w:anchor="_Toc217035669" w:history="1">
+        <w:r>
+          <w:rPr>
+            <w:rStyle w:val="Collegamentoipertestuale"/>
+            <w:noProof/>
+            <w:lang w:val="en-GB"/>
+          </w:rPr>
+          <w:t>3.5</w:t>
+        </w:r>
+        <w:r>
+          <w:rPr>
+            <w:rFonts w:asciiTheme="minorHAnsi" w:eastAsiaTheme="minorEastAsia" w:hAnsiTheme="minorHAnsi" w:cstheme="minorBidi"/>
+            <w:noProof/>
+            <w:kern w:val="2"/>
+            <w:lang w:eastAsia="it-IT"/>
+            <w14:ligatures w14:val="standardContextual"/>
+          </w:rPr>
+          <w:tab/>
+        </w:r>
+        <w:r>
+          <w:rPr>
+            <w:rStyle w:val="Collegamentoipertestuale"/>
+            <w:noProof/>
+            <w:lang w:val="en-GB"/>
+          </w:rPr>
+          <w:t>PersistanceManagement</w:t>
+        </w:r>
+        <w:r>
+          <w:rPr>
+            <w:noProof/>
+            <w:webHidden/>
+          </w:rPr>
+          <w:tab/>
+        </w:r>
+        <w:r>
+          <w:rPr>
+            <w:noProof/>
+            <w:webHidden/>
+          </w:rPr>
+          <w:fldChar w:fldCharType="begin"/>
+        </w:r>
+        <w:r>
+          <w:rPr>
+            <w:noProof/>
+            <w:webHidden/>
+          </w:rPr>
+          <w:instrText xml:space="preserve"> PAGEREF _Toc217035669 \h </w:instrText>
+        </w:r>
+        <w:r>
+          <w:rPr>
+            <w:noProof/>
+            <w:webHidden/>
+          </w:rPr>
+        </w:r>
+        <w:r>
+          <w:rPr>
+            <w:noProof/>
+            <w:webHidden/>
+          </w:rPr>
+          <w:fldChar w:fldCharType="separate"/>
+        </w:r>
+        <w:r>
+          <w:rPr>
+            <w:noProof/>
+            <w:webHidden/>
+          </w:rPr>
+          <w:t>21</w:t>
+        </w:r>
+        <w:r>
+          <w:rPr>
+            <w:noProof/>
+            <w:webHidden/>
+          </w:rPr>
+          <w:fldChar w:fldCharType="end"/>
+        </w:r>
+      </w:hyperlink>
+    </w:p>
+    <w:p>
       <w:r>
         <w:rPr>
           <w:b/>
@@ -1897,10 +2923,12 @@
         </w:numPr>
         <w:ind w:left="0"/>
       </w:pPr>
+      <w:bookmarkStart w:id="0" w:name="_Toc217035658"/>
       <w:r>
         <w:lastRenderedPageBreak/>
         <w:t>Introduzione</w:t>
       </w:r>
+      <w:bookmarkEnd w:id="0"/>
     </w:p>
     <w:p/>
     <w:p>
@@ -1923,10 +2951,7 @@
     </w:p>
     <w:p>
       <w:r>
-        <w:t>Inoltre,</w:t>
-      </w:r>
-      <w:r>
-        <w:t xml:space="preserve"> verranno mostrate le strategie di persistenza e gli aspetti che determinano la qualità del design, tutto questo per favorire l’implementazione e lo sviluppo del sistema.</w:t>
+        <w:t>Inoltre, verranno mostrate le strategie di persistenza e gli aspetti che determinano la qualità del design, tutto questo per favorire l’implementazione e lo sviluppo del sistema.</w:t>
       </w:r>
     </w:p>
     <w:p/>
@@ -1940,6 +2965,7 @@
         </w:numPr>
         <w:ind w:left="0"/>
       </w:pPr>
+      <w:bookmarkStart w:id="1" w:name="_Toc217035659"/>
       <w:r>
         <w:t>Object design trade-</w:t>
       </w:r>
@@ -1947,6 +2973,7 @@
       <w:r>
         <w:t>offs</w:t>
       </w:r>
+      <w:bookmarkEnd w:id="1"/>
       <w:proofErr w:type="spellEnd"/>
     </w:p>
     <w:p/>
@@ -1974,15 +3001,7 @@
     </w:p>
     <w:p>
       <w:r>
-        <w:t xml:space="preserve">È nel nostro interesse utilizzare un modello </w:t>
-      </w:r>
-      <w:proofErr w:type="spellStart"/>
-      <w:r>
-        <w:t>ad</w:t>
-      </w:r>
-      <w:proofErr w:type="spellEnd"/>
-      <w:r>
-        <w:t xml:space="preserve"> oggetti semplice e composto da poche classi centrali suddivise in maniera non eccessiva, riducendo il rischio di over-design e accelerando il processo di sviluppo.</w:t>
+        <w:t>È nel nostro interesse utilizzare un modello ad oggetti semplice e composto da poche classi centrali suddivise in maniera non eccessiva, riducendo il rischio di over-design e accelerando il processo di sviluppo.</w:t>
       </w:r>
     </w:p>
     <w:p>
@@ -2115,6 +3134,7 @@
         </w:numPr>
         <w:ind w:left="0"/>
       </w:pPr>
+      <w:bookmarkStart w:id="2" w:name="_Toc217035660"/>
       <w:r>
         <w:t xml:space="preserve">Interface </w:t>
       </w:r>
@@ -2130,6 +3150,7 @@
       <w:r>
         <w:t>guidelines</w:t>
       </w:r>
+      <w:bookmarkEnd w:id="2"/>
       <w:proofErr w:type="spellEnd"/>
     </w:p>
     <w:p/>
@@ -2399,8 +3420,13 @@
       </w:pPr>
       <w:r>
         <w:lastRenderedPageBreak/>
-        <w:t xml:space="preserve"> Pacchetti</w:t>
+        <w:t xml:space="preserve"> </w:t>
       </w:r>
+      <w:bookmarkStart w:id="3" w:name="_Toc217035661"/>
+      <w:r>
+        <w:t>Pacchetti</w:t>
+      </w:r>
+      <w:bookmarkEnd w:id="3"/>
     </w:p>
     <w:p/>
     <w:p>
@@ -2543,9 +3569,11 @@
         <w:pStyle w:val="Titolo2"/>
         <w:ind w:left="-426"/>
       </w:pPr>
+      <w:bookmarkStart w:id="4" w:name="_Toc217035662"/>
       <w:r>
         <w:t>2.1 Decomposizione dei sottosistemi in package</w:t>
       </w:r>
+      <w:bookmarkEnd w:id="4"/>
     </w:p>
     <w:p/>
     <w:p/>
@@ -3057,6 +4085,7 @@
         <w:pStyle w:val="Titolo2"/>
         <w:ind w:left="-567"/>
       </w:pPr>
+      <w:bookmarkStart w:id="5" w:name="_Toc217035663"/>
       <w:r>
         <w:t>2.</w:t>
       </w:r>
@@ -3069,6 +4098,7 @@
       <w:r>
         <w:t xml:space="preserve"> tra package</w:t>
       </w:r>
+      <w:bookmarkEnd w:id="5"/>
     </w:p>
     <w:p/>
     <w:p>
@@ -3241,6 +4271,7 @@
         </w:numPr>
         <w:ind w:left="0"/>
       </w:pPr>
+      <w:bookmarkStart w:id="6" w:name="_Toc217035664"/>
       <w:r>
         <w:lastRenderedPageBreak/>
         <w:t xml:space="preserve">Class </w:t>
@@ -3249,6 +4280,7 @@
       <w:r>
         <w:t>interfaces</w:t>
       </w:r>
+      <w:bookmarkEnd w:id="6"/>
       <w:proofErr w:type="spellEnd"/>
     </w:p>
     <w:p/>
@@ -3281,10 +4313,12 @@
         </w:numPr>
         <w:ind w:left="0"/>
       </w:pPr>
+      <w:bookmarkStart w:id="7" w:name="_Toc217035665"/>
       <w:proofErr w:type="spellStart"/>
       <w:r>
         <w:t>AccessManagement</w:t>
       </w:r>
+      <w:bookmarkEnd w:id="7"/>
       <w:proofErr w:type="spellEnd"/>
     </w:p>
     <w:p/>
@@ -4475,10 +5509,12 @@
         </w:numPr>
         <w:ind w:left="0"/>
       </w:pPr>
+      <w:bookmarkStart w:id="8" w:name="_Toc217035666"/>
       <w:proofErr w:type="spellStart"/>
       <w:r>
         <w:t>AccountManagement</w:t>
       </w:r>
+      <w:bookmarkEnd w:id="8"/>
       <w:proofErr w:type="spellEnd"/>
     </w:p>
     <w:p/>
@@ -9307,6 +10343,7 @@
           <w:lang w:val="en-GB"/>
         </w:rPr>
       </w:pPr>
+      <w:bookmarkStart w:id="9" w:name="_Toc217035667"/>
       <w:proofErr w:type="spellStart"/>
       <w:r>
         <w:rPr>
@@ -9314,6 +10351,7 @@
         </w:rPr>
         <w:t>TaskManagement</w:t>
       </w:r>
+      <w:bookmarkEnd w:id="9"/>
       <w:proofErr w:type="spellEnd"/>
     </w:p>
     <w:p>
@@ -14757,7 +15795,13 @@
             <w:tcW w:w="9627" w:type="dxa"/>
             <w:gridSpan w:val="2"/>
           </w:tcPr>
-          <w:p/>
+          <w:p>
+            <w:pPr>
+              <w:rPr>
+                <w:lang w:val="en-GB"/>
+              </w:rPr>
+            </w:pPr>
+          </w:p>
         </w:tc>
       </w:tr>
       <w:tr>
@@ -15456,6 +16500,7 @@
           <w:lang w:val="en-GB"/>
         </w:rPr>
       </w:pPr>
+      <w:bookmarkStart w:id="10" w:name="_Toc217035668"/>
       <w:proofErr w:type="spellStart"/>
       <w:r>
         <w:rPr>
@@ -15463,6 +16508,7 @@
         </w:rPr>
         <w:t>NotificheManagement</w:t>
       </w:r>
+      <w:bookmarkEnd w:id="10"/>
       <w:proofErr w:type="spellEnd"/>
     </w:p>
     <w:p>
@@ -16361,6 +17407,7 @@
           <w:lang w:val="en-GB"/>
         </w:rPr>
       </w:pPr>
+      <w:bookmarkStart w:id="11" w:name="_Toc217035669"/>
       <w:proofErr w:type="spellStart"/>
       <w:r>
         <w:rPr>
@@ -16368,6 +17415,7 @@
         </w:rPr>
         <w:t>PersistanceManagement</w:t>
       </w:r>
+      <w:bookmarkEnd w:id="11"/>
       <w:proofErr w:type="spellEnd"/>
     </w:p>
     <w:p>
@@ -21647,14 +22695,12 @@
             </w:rPr>
             <w:t xml:space="preserve">Object Design </w:t>
           </w:r>
-          <w:proofErr w:type="spellStart"/>
           <w:r>
             <w:rPr>
               <w:sz w:val="20"/>
             </w:rPr>
             <w:t>Document</w:t>
           </w:r>
-          <w:proofErr w:type="spellEnd"/>
         </w:p>
       </w:tc>
       <w:tc>
@@ -23278,27 +24324,9 @@
   </w:num>
   <w:num w:numId="9" w16cid:durableId="1245408946">
     <w:abstractNumId w:val="7"/>
-    <w:lvlOverride w:ilvl="0"/>
-    <w:lvlOverride w:ilvl="1"/>
-    <w:lvlOverride w:ilvl="2"/>
-    <w:lvlOverride w:ilvl="3"/>
-    <w:lvlOverride w:ilvl="4"/>
-    <w:lvlOverride w:ilvl="5"/>
-    <w:lvlOverride w:ilvl="6"/>
-    <w:lvlOverride w:ilvl="7"/>
-    <w:lvlOverride w:ilvl="8"/>
   </w:num>
   <w:num w:numId="10" w16cid:durableId="103504632">
     <w:abstractNumId w:val="5"/>
-    <w:lvlOverride w:ilvl="0"/>
-    <w:lvlOverride w:ilvl="1"/>
-    <w:lvlOverride w:ilvl="2"/>
-    <w:lvlOverride w:ilvl="3"/>
-    <w:lvlOverride w:ilvl="4"/>
-    <w:lvlOverride w:ilvl="5"/>
-    <w:lvlOverride w:ilvl="6"/>
-    <w:lvlOverride w:ilvl="7"/>
-    <w:lvlOverride w:ilvl="8"/>
   </w:num>
   <w:num w:numId="11" w16cid:durableId="2064675232">
     <w:abstractNumId w:val="9"/>
@@ -23917,6 +24945,7 @@
   <w:style w:type="character" w:default="1" w:styleId="Carpredefinitoparagrafo">
     <w:name w:val="Default Paragraph Font"/>
     <w:uiPriority w:val="1"/>
+    <w:semiHidden/>
     <w:unhideWhenUsed/>
   </w:style>
   <w:style w:type="table" w:default="1" w:styleId="Tabellanormale">

</xml_diff>

<commit_message>
Mod: modificato SDD per tenerlo aggiornato con il progetto
Add: aggiunto DBI_EWMS, documento per descrivere lo schema ER del database
</commit_message>
<xml_diff>
--- a/Workspace/ODD/ODD_EWMS.docx
+++ b/Workspace/ODD/ODD_EWMS.docx
@@ -3001,7 +3001,15 @@
     </w:p>
     <w:p>
       <w:r>
-        <w:t>È nel nostro interesse utilizzare un modello ad oggetti semplice e composto da poche classi centrali suddivise in maniera non eccessiva, riducendo il rischio di over-design e accelerando il processo di sviluppo.</w:t>
+        <w:t xml:space="preserve">È nel nostro interesse utilizzare un modello </w:t>
+      </w:r>
+      <w:proofErr w:type="spellStart"/>
+      <w:r>
+        <w:t>ad</w:t>
+      </w:r>
+      <w:proofErr w:type="spellEnd"/>
+      <w:r>
+        <w:t xml:space="preserve"> oggetti semplice e composto da poche classi centrali suddivise in maniera non eccessiva, riducendo il rischio di over-design e accelerando il processo di sviluppo.</w:t>
       </w:r>
     </w:p>
     <w:p>
@@ -3449,15 +3457,7 @@
         <w:t>Easy Work Management System</w:t>
       </w:r>
       <w:r>
-        <w:t xml:space="preserve"> (E.W.M.S.). L'organizzazione dei package segue l'architettura Three-</w:t>
-      </w:r>
-      <w:proofErr w:type="spellStart"/>
-      <w:r>
-        <w:t>Tier</w:t>
-      </w:r>
-      <w:proofErr w:type="spellEnd"/>
-      <w:r>
-        <w:t xml:space="preserve"> definita nel System Design </w:t>
+        <w:t xml:space="preserve"> (E.W.M.S.). L'organizzazione dei package segue l'architettura Three-Tier definita nel System Design </w:t>
       </w:r>
       <w:proofErr w:type="spellStart"/>
       <w:r>
@@ -3492,15 +3492,7 @@
       </w:r>
       <w:proofErr w:type="spellEnd"/>
       <w:r>
-        <w:t xml:space="preserve"> e l'adozione del pattern Model-</w:t>
-      </w:r>
-      <w:proofErr w:type="spellStart"/>
-      <w:r>
-        <w:t>View</w:t>
-      </w:r>
-      <w:proofErr w:type="spellEnd"/>
-      <w:r>
-        <w:t>-Controller (MVC).</w:t>
+        <w:t xml:space="preserve"> e l'adozione del pattern Model-View-Controller (MVC).</w:t>
       </w:r>
     </w:p>
     <w:p>
@@ -6232,14 +6224,9 @@
             <w:r>
               <w:t xml:space="preserve"> = </w:t>
             </w:r>
-            <w:proofErr w:type="spellStart"/>
             <w:proofErr w:type="gramStart"/>
             <w:r>
-              <w:t>View</w:t>
-            </w:r>
-            <w:proofErr w:type="spellEnd"/>
-            <w:r>
-              <w:t>::</w:t>
+              <w:t>View::</w:t>
             </w:r>
             <w:proofErr w:type="gramEnd"/>
             <w:r>
@@ -6534,14 +6521,9 @@
             <w:r>
               <w:t xml:space="preserve"> = </w:t>
             </w:r>
-            <w:proofErr w:type="spellStart"/>
             <w:proofErr w:type="gramStart"/>
             <w:r>
-              <w:t>View</w:t>
-            </w:r>
-            <w:proofErr w:type="spellEnd"/>
-            <w:r>
-              <w:t>::</w:t>
+              <w:t>View::</w:t>
             </w:r>
             <w:proofErr w:type="spellStart"/>
             <w:proofErr w:type="gramEnd"/>
@@ -8072,14 +8054,9 @@
             <w:r>
               <w:t xml:space="preserve"> = </w:t>
             </w:r>
-            <w:proofErr w:type="spellStart"/>
             <w:proofErr w:type="gramStart"/>
             <w:r>
-              <w:t>View</w:t>
-            </w:r>
-            <w:proofErr w:type="spellEnd"/>
-            <w:r>
-              <w:t>::</w:t>
+              <w:t>View::</w:t>
             </w:r>
             <w:proofErr w:type="gramEnd"/>
             <w:r>
@@ -8570,14 +8547,9 @@
             <w:r>
               <w:t xml:space="preserve"> = </w:t>
             </w:r>
-            <w:proofErr w:type="spellStart"/>
             <w:proofErr w:type="gramStart"/>
             <w:r>
-              <w:t>View</w:t>
-            </w:r>
-            <w:proofErr w:type="spellEnd"/>
-            <w:r>
-              <w:t>::</w:t>
+              <w:t>View::</w:t>
             </w:r>
             <w:proofErr w:type="spellStart"/>
             <w:proofErr w:type="gramEnd"/>
@@ -10300,14 +10272,9 @@
             <w:r>
               <w:t xml:space="preserve"> = </w:t>
             </w:r>
-            <w:proofErr w:type="spellStart"/>
             <w:proofErr w:type="gramStart"/>
             <w:r>
-              <w:t>View</w:t>
-            </w:r>
-            <w:proofErr w:type="spellEnd"/>
-            <w:r>
-              <w:t>::</w:t>
+              <w:t>View::</w:t>
             </w:r>
             <w:proofErr w:type="gramEnd"/>
             <w:r>
@@ -10946,14 +10913,9 @@
             <w:r>
               <w:t xml:space="preserve"> = </w:t>
             </w:r>
-            <w:proofErr w:type="spellStart"/>
             <w:proofErr w:type="gramStart"/>
             <w:r>
-              <w:t>View</w:t>
-            </w:r>
-            <w:proofErr w:type="spellEnd"/>
-            <w:r>
-              <w:t>::</w:t>
+              <w:t>View::</w:t>
             </w:r>
             <w:proofErr w:type="gramEnd"/>
             <w:r>
@@ -11115,14 +11077,9 @@
             <w:r>
               <w:t xml:space="preserve"> = </w:t>
             </w:r>
-            <w:proofErr w:type="spellStart"/>
             <w:proofErr w:type="gramStart"/>
             <w:r>
-              <w:t>View</w:t>
-            </w:r>
-            <w:proofErr w:type="spellEnd"/>
-            <w:r>
-              <w:t>::</w:t>
+              <w:t>View::</w:t>
             </w:r>
             <w:proofErr w:type="gramEnd"/>
             <w:r>
@@ -11354,14 +11311,9 @@
             <w:r>
               <w:t xml:space="preserve"> = </w:t>
             </w:r>
-            <w:proofErr w:type="spellStart"/>
             <w:proofErr w:type="gramStart"/>
             <w:r>
-              <w:t>View</w:t>
-            </w:r>
-            <w:proofErr w:type="spellEnd"/>
-            <w:r>
-              <w:t>::</w:t>
+              <w:t>View::</w:t>
             </w:r>
             <w:proofErr w:type="gramEnd"/>
             <w:r>
@@ -11522,14 +11474,9 @@
             <w:r>
               <w:t xml:space="preserve"> = </w:t>
             </w:r>
-            <w:proofErr w:type="spellStart"/>
             <w:proofErr w:type="gramStart"/>
             <w:r>
-              <w:t>View</w:t>
-            </w:r>
-            <w:proofErr w:type="spellEnd"/>
-            <w:r>
-              <w:t>::</w:t>
+              <w:t>View::</w:t>
             </w:r>
             <w:proofErr w:type="gramEnd"/>
             <w:r>
@@ -13376,14 +13323,9 @@
             <w:r>
               <w:t xml:space="preserve"> = </w:t>
             </w:r>
-            <w:proofErr w:type="spellStart"/>
             <w:proofErr w:type="gramStart"/>
             <w:r>
-              <w:t>View</w:t>
-            </w:r>
-            <w:proofErr w:type="spellEnd"/>
-            <w:r>
-              <w:t>::</w:t>
+              <w:t>View::</w:t>
             </w:r>
             <w:proofErr w:type="spellStart"/>
             <w:proofErr w:type="gramEnd"/>
@@ -13694,14 +13636,9 @@
             <w:r>
               <w:t xml:space="preserve"> = </w:t>
             </w:r>
-            <w:proofErr w:type="spellStart"/>
             <w:proofErr w:type="gramStart"/>
             <w:r>
-              <w:t>View</w:t>
-            </w:r>
-            <w:proofErr w:type="spellEnd"/>
-            <w:r>
-              <w:t>::</w:t>
+              <w:t>View::</w:t>
             </w:r>
             <w:proofErr w:type="gramEnd"/>
             <w:r>
@@ -14552,14 +14489,9 @@
             <w:r>
               <w:t xml:space="preserve"> = </w:t>
             </w:r>
-            <w:proofErr w:type="spellStart"/>
             <w:proofErr w:type="gramStart"/>
             <w:r>
-              <w:t>View</w:t>
-            </w:r>
-            <w:proofErr w:type="spellEnd"/>
-            <w:r>
-              <w:t>::</w:t>
+              <w:t>View::</w:t>
             </w:r>
             <w:proofErr w:type="gramEnd"/>
             <w:r>
@@ -14914,20 +14846,12 @@
               </w:rPr>
               <w:t xml:space="preserve"> = </w:t>
             </w:r>
-            <w:proofErr w:type="spellStart"/>
             <w:proofErr w:type="gramStart"/>
             <w:r>
               <w:rPr>
                 <w:u w:val="single"/>
               </w:rPr>
-              <w:t>View</w:t>
-            </w:r>
-            <w:proofErr w:type="spellEnd"/>
-            <w:r>
-              <w:rPr>
-                <w:u w:val="single"/>
-              </w:rPr>
-              <w:t>::</w:t>
+              <w:t>View::</w:t>
             </w:r>
             <w:proofErr w:type="gramEnd"/>
             <w:r>
@@ -15599,14 +15523,9 @@
             <w:r>
               <w:t xml:space="preserve"> = </w:t>
             </w:r>
-            <w:proofErr w:type="spellStart"/>
             <w:proofErr w:type="gramStart"/>
             <w:r>
-              <w:t>View</w:t>
-            </w:r>
-            <w:proofErr w:type="spellEnd"/>
-            <w:r>
-              <w:t>::</w:t>
+              <w:t>View::</w:t>
             </w:r>
             <w:proofErr w:type="gramEnd"/>
             <w:r>
@@ -16164,14 +16083,9 @@
             <w:r>
               <w:t xml:space="preserve"> = </w:t>
             </w:r>
-            <w:proofErr w:type="spellStart"/>
             <w:proofErr w:type="gramStart"/>
             <w:r>
-              <w:t>View</w:t>
-            </w:r>
-            <w:proofErr w:type="spellEnd"/>
-            <w:r>
-              <w:t>::</w:t>
+              <w:t>View::</w:t>
             </w:r>
             <w:proofErr w:type="gramEnd"/>
             <w:r>
@@ -18554,80 +18468,67 @@
           <w:p>
             <w:pPr>
               <w:spacing w:after="160" w:line="259" w:lineRule="auto"/>
-              <w:rPr>
-                <w:lang w:val="en-GB"/>
-              </w:rPr>
-            </w:pPr>
-            <w:r>
-              <w:rPr>
-                <w:lang w:val="en-GB"/>
-              </w:rPr>
-              <w:t>+ create(</w:t>
-            </w:r>
-            <w:proofErr w:type="spellStart"/>
-            <w:r>
-              <w:rPr>
-                <w:lang w:val="en-GB"/>
-              </w:rPr>
+            </w:pPr>
+            <w:r>
+              <w:t xml:space="preserve">+ </w:t>
+            </w:r>
+            <w:proofErr w:type="spellStart"/>
+            <w:r>
+              <w:t>create</w:t>
+            </w:r>
+            <w:r>
+              <w:t>Utente</w:t>
+            </w:r>
+            <w:proofErr w:type="spellEnd"/>
+            <w:r>
+              <w:t>(</w:t>
+            </w:r>
+            <w:proofErr w:type="spellStart"/>
+            <w:r>
               <w:t>utente:Utente</w:t>
             </w:r>
             <w:proofErr w:type="spellEnd"/>
             <w:r>
-              <w:rPr>
-                <w:lang w:val="en-GB"/>
-              </w:rPr>
-              <w:t xml:space="preserve">) : void </w:t>
+              <w:t xml:space="preserve">) : </w:t>
+            </w:r>
+            <w:proofErr w:type="spellStart"/>
+            <w:r>
+              <w:t>void</w:t>
+            </w:r>
+            <w:proofErr w:type="spellEnd"/>
+            <w:r>
+              <w:t xml:space="preserve"> </w:t>
             </w:r>
           </w:p>
           <w:p>
             <w:pPr>
               <w:spacing w:after="160" w:line="259" w:lineRule="auto"/>
-              <w:rPr>
-                <w:lang w:val="en-GB"/>
-              </w:rPr>
-            </w:pPr>
-            <w:r>
-              <w:rPr>
-                <w:lang w:val="en-GB"/>
-              </w:rPr>
+            </w:pPr>
+            <w:r>
               <w:t xml:space="preserve">+ </w:t>
             </w:r>
             <w:proofErr w:type="spellStart"/>
             <w:r>
-              <w:rPr>
-                <w:lang w:val="en-GB"/>
-              </w:rPr>
-              <w:t>findByEmail</w:t>
-            </w:r>
-            <w:proofErr w:type="spellEnd"/>
-            <w:r>
-              <w:rPr>
-                <w:lang w:val="en-GB"/>
-              </w:rPr>
+              <w:t>findB</w:t>
+            </w:r>
+            <w:r>
+              <w:t>yMatricola</w:t>
+            </w:r>
+            <w:proofErr w:type="spellEnd"/>
+            <w:r>
               <w:t>(</w:t>
             </w:r>
             <w:proofErr w:type="spellStart"/>
             <w:r>
-              <w:rPr>
-                <w:lang w:val="en-GB"/>
-              </w:rPr>
-              <w:t>email:String</w:t>
-            </w:r>
-            <w:proofErr w:type="spellEnd"/>
-            <w:r>
-              <w:rPr>
-                <w:lang w:val="en-GB"/>
-              </w:rPr>
-              <w:t xml:space="preserve">) : </w:t>
-            </w:r>
-            <w:proofErr w:type="spellStart"/>
-            <w:r>
-              <w:rPr>
-                <w:lang w:val="en-GB"/>
-              </w:rPr>
-              <w:t>Utente</w:t>
-            </w:r>
-            <w:proofErr w:type="spellEnd"/>
+              <w:t>matricola</w:t>
+            </w:r>
+            <w:r>
+              <w:t>:String</w:t>
+            </w:r>
+            <w:proofErr w:type="spellEnd"/>
+            <w:r>
+              <w:t>) : Utente</w:t>
+            </w:r>
           </w:p>
           <w:p>
             <w:pPr>
@@ -18743,7 +18644,27 @@
               <w:rPr>
                 <w:lang w:val="en-GB"/>
               </w:rPr>
-              <w:t>+create(</w:t>
+              <w:t>+</w:t>
+            </w:r>
+            <w:proofErr w:type="spellStart"/>
+            <w:r>
+              <w:rPr>
+                <w:lang w:val="en-GB"/>
+              </w:rPr>
+              <w:t>create</w:t>
+            </w:r>
+            <w:r>
+              <w:rPr>
+                <w:lang w:val="en-GB"/>
+              </w:rPr>
+              <w:t>Utente</w:t>
+            </w:r>
+            <w:proofErr w:type="spellEnd"/>
+            <w:r>
+              <w:rPr>
+                <w:lang w:val="en-GB"/>
+              </w:rPr>
+              <w:t>(</w:t>
             </w:r>
             <w:proofErr w:type="spellStart"/>
             <w:r>
@@ -18829,9 +18750,17 @@
             <w:r>
               <w:t>::</w:t>
             </w:r>
+            <w:proofErr w:type="spellStart"/>
             <w:proofErr w:type="gramEnd"/>
             <w:r>
-              <w:t>create(</w:t>
+              <w:t>create</w:t>
+            </w:r>
+            <w:r>
+              <w:t>Utente</w:t>
+            </w:r>
+            <w:proofErr w:type="spellEnd"/>
+            <w:r>
+              <w:t>(</w:t>
             </w:r>
             <w:proofErr w:type="spellStart"/>
             <w:r>
@@ -18896,9 +18825,17 @@
             <w:r>
               <w:t>::</w:t>
             </w:r>
+            <w:proofErr w:type="spellStart"/>
             <w:proofErr w:type="gramEnd"/>
             <w:r>
-              <w:t>create(</w:t>
+              <w:t>create</w:t>
+            </w:r>
+            <w:r>
+              <w:t>Utente</w:t>
+            </w:r>
+            <w:proofErr w:type="spellEnd"/>
+            <w:r>
+              <w:t>(</w:t>
             </w:r>
             <w:proofErr w:type="spellStart"/>
             <w:r>
@@ -18984,7 +18921,13 @@
               <w:rPr>
                 <w:lang w:val="en-GB"/>
               </w:rPr>
-              <w:t>findByEmail</w:t>
+              <w:t>findB</w:t>
+            </w:r>
+            <w:r>
+              <w:rPr>
+                <w:lang w:val="en-GB"/>
+              </w:rPr>
+              <w:t>yMatricola</w:t>
             </w:r>
             <w:proofErr w:type="spellEnd"/>
             <w:r>
@@ -18998,7 +18941,13 @@
               <w:rPr>
                 <w:lang w:val="en-GB"/>
               </w:rPr>
-              <w:t>email:String</w:t>
+              <w:t>matricola</w:t>
+            </w:r>
+            <w:r>
+              <w:rPr>
+                <w:lang w:val="en-GB"/>
+              </w:rPr>
+              <w:t>:String</w:t>
             </w:r>
             <w:proofErr w:type="spellEnd"/>
             <w:r>
@@ -19044,11 +18993,9 @@
             <w:r>
               <w:t xml:space="preserve">Recupera un utente tramite la sua </w:t>
             </w:r>
-            <w:proofErr w:type="gramStart"/>
-            <w:r>
-              <w:t>email</w:t>
-            </w:r>
-            <w:proofErr w:type="gramEnd"/>
+            <w:r>
+              <w:t>matricola</w:t>
+            </w:r>
           </w:p>
         </w:tc>
       </w:tr>
@@ -19073,58 +19020,45 @@
           <w:p>
             <w:pPr>
               <w:spacing w:after="160" w:line="259" w:lineRule="auto"/>
-              <w:rPr>
-                <w:lang w:val="en-GB"/>
-              </w:rPr>
-            </w:pPr>
-            <w:r>
-              <w:rPr>
-                <w:lang w:val="en-GB"/>
-              </w:rPr>
-              <w:t xml:space="preserve">Context </w:t>
+            </w:pPr>
+            <w:proofErr w:type="spellStart"/>
+            <w:r>
+              <w:t>Context</w:t>
+            </w:r>
+            <w:proofErr w:type="spellEnd"/>
+            <w:r>
+              <w:t xml:space="preserve"> </w:t>
             </w:r>
             <w:proofErr w:type="spellStart"/>
             <w:proofErr w:type="gramStart"/>
             <w:r>
-              <w:rPr>
-                <w:lang w:val="en-GB"/>
-              </w:rPr>
               <w:t>UtenteDAO</w:t>
             </w:r>
             <w:proofErr w:type="spellEnd"/>
             <w:r>
-              <w:rPr>
-                <w:lang w:val="en-GB"/>
-              </w:rPr>
               <w:t>::</w:t>
             </w:r>
             <w:proofErr w:type="spellStart"/>
             <w:proofErr w:type="gramEnd"/>
             <w:r>
-              <w:rPr>
-                <w:lang w:val="en-GB"/>
-              </w:rPr>
-              <w:t>findByEmail</w:t>
-            </w:r>
-            <w:proofErr w:type="spellEnd"/>
-            <w:r>
-              <w:rPr>
-                <w:lang w:val="en-GB"/>
-              </w:rPr>
+              <w:t>findBy</w:t>
+            </w:r>
+            <w:r>
+              <w:t>Matricola</w:t>
+            </w:r>
+            <w:proofErr w:type="spellEnd"/>
+            <w:r>
               <w:t>(</w:t>
             </w:r>
             <w:proofErr w:type="spellStart"/>
             <w:r>
-              <w:rPr>
-                <w:lang w:val="en-GB"/>
-              </w:rPr>
-              <w:t>email:String</w:t>
-            </w:r>
-            <w:proofErr w:type="spellEnd"/>
-            <w:r>
-              <w:rPr>
-                <w:lang w:val="en-GB"/>
-              </w:rPr>
+              <w:t>matricola</w:t>
+            </w:r>
+            <w:r>
+              <w:t>:String</w:t>
+            </w:r>
+            <w:proofErr w:type="spellEnd"/>
+            <w:r>
               <w:t xml:space="preserve">) </w:t>
             </w:r>
           </w:p>
@@ -19135,11 +19069,25 @@
                 <w:lang w:val="en-GB"/>
               </w:rPr>
             </w:pPr>
-            <w:r>
-              <w:rPr>
-                <w:lang w:val="en-GB"/>
-              </w:rPr>
-              <w:t>Email &lt;&gt; null</w:t>
+            <w:proofErr w:type="spellStart"/>
+            <w:r>
+              <w:rPr>
+                <w:lang w:val="en-GB"/>
+              </w:rPr>
+              <w:t>matricola</w:t>
+            </w:r>
+            <w:proofErr w:type="spellEnd"/>
+            <w:r>
+              <w:rPr>
+                <w:lang w:val="en-GB"/>
+              </w:rPr>
+              <w:t xml:space="preserve"> </w:t>
+            </w:r>
+            <w:r>
+              <w:rPr>
+                <w:lang w:val="en-GB"/>
+              </w:rPr>
+              <w:t>&lt;&gt; null</w:t>
             </w:r>
           </w:p>
         </w:tc>
@@ -19165,58 +19113,45 @@
           <w:p>
             <w:pPr>
               <w:spacing w:after="160" w:line="259" w:lineRule="auto"/>
-              <w:rPr>
-                <w:lang w:val="en-GB"/>
-              </w:rPr>
-            </w:pPr>
-            <w:r>
-              <w:rPr>
-                <w:lang w:val="en-GB"/>
-              </w:rPr>
-              <w:t xml:space="preserve">Context </w:t>
+            </w:pPr>
+            <w:proofErr w:type="spellStart"/>
+            <w:r>
+              <w:t>Context</w:t>
+            </w:r>
+            <w:proofErr w:type="spellEnd"/>
+            <w:r>
+              <w:t xml:space="preserve"> </w:t>
             </w:r>
             <w:proofErr w:type="spellStart"/>
             <w:proofErr w:type="gramStart"/>
             <w:r>
-              <w:rPr>
-                <w:lang w:val="en-GB"/>
-              </w:rPr>
               <w:t>UtenteDAO</w:t>
             </w:r>
             <w:proofErr w:type="spellEnd"/>
             <w:r>
-              <w:rPr>
-                <w:lang w:val="en-GB"/>
-              </w:rPr>
               <w:t>::</w:t>
             </w:r>
             <w:proofErr w:type="spellStart"/>
             <w:proofErr w:type="gramEnd"/>
             <w:r>
-              <w:rPr>
-                <w:lang w:val="en-GB"/>
-              </w:rPr>
-              <w:t>findByEmail</w:t>
-            </w:r>
-            <w:proofErr w:type="spellEnd"/>
-            <w:r>
-              <w:rPr>
-                <w:lang w:val="en-GB"/>
-              </w:rPr>
+              <w:t>findBy</w:t>
+            </w:r>
+            <w:r>
+              <w:t>Matricola</w:t>
+            </w:r>
+            <w:proofErr w:type="spellEnd"/>
+            <w:r>
               <w:t>(</w:t>
             </w:r>
             <w:proofErr w:type="spellStart"/>
             <w:r>
-              <w:rPr>
-                <w:lang w:val="en-GB"/>
-              </w:rPr>
-              <w:t>email:String</w:t>
-            </w:r>
-            <w:proofErr w:type="spellEnd"/>
-            <w:r>
-              <w:rPr>
-                <w:lang w:val="en-GB"/>
-              </w:rPr>
+              <w:t>matricola</w:t>
+            </w:r>
+            <w:r>
+              <w:t>:String</w:t>
+            </w:r>
+            <w:proofErr w:type="spellEnd"/>
+            <w:r>
               <w:t xml:space="preserve">) </w:t>
             </w:r>
           </w:p>
@@ -19252,14 +19187,40 @@
               <w:rPr>
                 <w:lang w:val="en-GB"/>
               </w:rPr>
-              <w:t>u.email</w:t>
-            </w:r>
-            <w:proofErr w:type="spellEnd"/>
-            <w:r>
-              <w:rPr>
-                <w:lang w:val="en-GB"/>
-              </w:rPr>
-              <w:t xml:space="preserve"> = email)</w:t>
+              <w:t>u.</w:t>
+            </w:r>
+            <w:r>
+              <w:rPr>
+                <w:lang w:val="en-GB"/>
+              </w:rPr>
+              <w:t>matricola</w:t>
+            </w:r>
+            <w:proofErr w:type="spellEnd"/>
+            <w:r>
+              <w:rPr>
+                <w:lang w:val="en-GB"/>
+              </w:rPr>
+              <w:t xml:space="preserve"> =</w:t>
+            </w:r>
+            <w:r>
+              <w:rPr>
+                <w:lang w:val="en-GB"/>
+              </w:rPr>
+              <w:t xml:space="preserve"> </w:t>
+            </w:r>
+            <w:proofErr w:type="spellStart"/>
+            <w:r>
+              <w:rPr>
+                <w:lang w:val="en-GB"/>
+              </w:rPr>
+              <w:t>matricola</w:t>
+            </w:r>
+            <w:proofErr w:type="spellEnd"/>
+            <w:r>
+              <w:rPr>
+                <w:lang w:val="en-GB"/>
+              </w:rPr>
+              <w:t>)</w:t>
             </w:r>
           </w:p>
         </w:tc>
@@ -22695,12 +22656,14 @@
             </w:rPr>
             <w:t xml:space="preserve">Object Design </w:t>
           </w:r>
+          <w:proofErr w:type="spellStart"/>
           <w:r>
             <w:rPr>
               <w:sz w:val="20"/>
             </w:rPr>
             <w:t>Document</w:t>
           </w:r>
+          <w:proofErr w:type="spellEnd"/>
         </w:p>
       </w:tc>
       <w:tc>

</xml_diff>

<commit_message>
Add: aggiunti file test per task
</commit_message>
<xml_diff>
--- a/Workspace/ODD/ODD_EWMS.docx
+++ b/Workspace/ODD/ODD_EWMS.docx
@@ -3104,7 +3104,15 @@
     </w:p>
     <w:p>
       <w:r>
-        <w:t xml:space="preserve">Per quanto riguarda la manutenzione del sistema, se ne occuperà il team di sviluppo originale (vedi RAD, 3.3.4 </w:t>
+        <w:t xml:space="preserve">Per quanto riguarda la manutenzione del sistema, se ne occuperà </w:t>
+      </w:r>
+      <w:proofErr w:type="gramStart"/>
+      <w:r>
+        <w:t>il team</w:t>
+      </w:r>
+      <w:proofErr w:type="gramEnd"/>
+      <w:r>
+        <w:t xml:space="preserve"> di sviluppo originale (vedi RAD, 3.3.4 </w:t>
       </w:r>
       <w:proofErr w:type="spellStart"/>
       <w:r>
@@ -3429,7 +3437,15 @@
     </w:p>
     <w:p>
       <w:r>
-        <w:t>le eccezioni non sono previste come meccanismo di controllo del flusso della fruibilità del sistema ma solo come segnalazioni di condizioni anomale, che potranno essere risolte o comprese anche tramite consulenza al team di sviluppo.</w:t>
+        <w:t xml:space="preserve">le eccezioni non sono previste come meccanismo di controllo del flusso della fruibilità del sistema ma solo come segnalazioni di condizioni anomale, che potranno essere risolte o comprese anche tramite consulenza </w:t>
+      </w:r>
+      <w:proofErr w:type="gramStart"/>
+      <w:r>
+        <w:t>al team</w:t>
+      </w:r>
+      <w:proofErr w:type="gramEnd"/>
+      <w:r>
+        <w:t xml:space="preserve"> di sviluppo.</w:t>
       </w:r>
     </w:p>
     <w:p>
@@ -3457,7 +3473,15 @@
       </w:r>
       <w:proofErr w:type="spellEnd"/>
       <w:r>
-        <w:t xml:space="preserve"> e post-condizioni e eventuali eccezioni che potrebbero essere sollevate.</w:t>
+        <w:t xml:space="preserve"> e post-condizioni </w:t>
+      </w:r>
+      <w:proofErr w:type="gramStart"/>
+      <w:r>
+        <w:t>e</w:t>
+      </w:r>
+      <w:proofErr w:type="gramEnd"/>
+      <w:r>
+        <w:t xml:space="preserve"> eventuali eccezioni che potrebbero essere sollevate.</w:t>
       </w:r>
     </w:p>
     <w:p/>
@@ -4813,14 +4837,28 @@
               <w:rPr>
                 <w:lang w:val="en-GB"/>
               </w:rPr>
-              <w:t>Context:SessionService</w:t>
-            </w:r>
-            <w:proofErr w:type="spellEnd"/>
-            <w:r>
-              <w:rPr>
-                <w:lang w:val="en-GB"/>
-              </w:rPr>
-              <w:t>::login</w:t>
+              <w:t>Context:</w:t>
+            </w:r>
+            <w:proofErr w:type="gramStart"/>
+            <w:r>
+              <w:rPr>
+                <w:lang w:val="en-GB"/>
+              </w:rPr>
+              <w:t>SessionService</w:t>
+            </w:r>
+            <w:proofErr w:type="spellEnd"/>
+            <w:r>
+              <w:rPr>
+                <w:lang w:val="en-GB"/>
+              </w:rPr>
+              <w:t>::</w:t>
+            </w:r>
+            <w:proofErr w:type="gramEnd"/>
+            <w:r>
+              <w:rPr>
+                <w:lang w:val="en-GB"/>
+              </w:rPr>
+              <w:t>login</w:t>
             </w:r>
           </w:p>
           <w:p>
@@ -4874,14 +4912,28 @@
               <w:rPr>
                 <w:lang w:val="en-GB"/>
               </w:rPr>
-              <w:t>Context:SessionService</w:t>
-            </w:r>
-            <w:proofErr w:type="spellEnd"/>
-            <w:r>
-              <w:rPr>
-                <w:lang w:val="en-GB"/>
-              </w:rPr>
-              <w:t>::login</w:t>
+              <w:t>Context:</w:t>
+            </w:r>
+            <w:proofErr w:type="gramStart"/>
+            <w:r>
+              <w:rPr>
+                <w:lang w:val="en-GB"/>
+              </w:rPr>
+              <w:t>SessionService</w:t>
+            </w:r>
+            <w:proofErr w:type="spellEnd"/>
+            <w:r>
+              <w:rPr>
+                <w:lang w:val="en-GB"/>
+              </w:rPr>
+              <w:t>::</w:t>
+            </w:r>
+            <w:proofErr w:type="gramEnd"/>
+            <w:r>
+              <w:rPr>
+                <w:lang w:val="en-GB"/>
+              </w:rPr>
+              <w:t>login</w:t>
             </w:r>
           </w:p>
           <w:p>
@@ -5073,14 +5125,28 @@
               <w:rPr>
                 <w:lang w:val="en-GB"/>
               </w:rPr>
-              <w:t>Context:SessionService</w:t>
-            </w:r>
-            <w:proofErr w:type="spellEnd"/>
-            <w:r>
-              <w:rPr>
-                <w:lang w:val="en-GB"/>
-              </w:rPr>
-              <w:t>::logout</w:t>
+              <w:t>Context:</w:t>
+            </w:r>
+            <w:proofErr w:type="gramStart"/>
+            <w:r>
+              <w:rPr>
+                <w:lang w:val="en-GB"/>
+              </w:rPr>
+              <w:t>SessionService</w:t>
+            </w:r>
+            <w:proofErr w:type="spellEnd"/>
+            <w:r>
+              <w:rPr>
+                <w:lang w:val="en-GB"/>
+              </w:rPr>
+              <w:t>::</w:t>
+            </w:r>
+            <w:proofErr w:type="gramEnd"/>
+            <w:r>
+              <w:rPr>
+                <w:lang w:val="en-GB"/>
+              </w:rPr>
+              <w:t>logout</w:t>
             </w:r>
           </w:p>
           <w:p>
@@ -5160,14 +5226,28 @@
               <w:rPr>
                 <w:lang w:val="en-GB"/>
               </w:rPr>
-              <w:t>Context:SessionService</w:t>
-            </w:r>
-            <w:proofErr w:type="spellEnd"/>
-            <w:r>
-              <w:rPr>
-                <w:lang w:val="en-GB"/>
-              </w:rPr>
-              <w:t>::logout</w:t>
+              <w:t>Context:</w:t>
+            </w:r>
+            <w:proofErr w:type="gramStart"/>
+            <w:r>
+              <w:rPr>
+                <w:lang w:val="en-GB"/>
+              </w:rPr>
+              <w:t>SessionService</w:t>
+            </w:r>
+            <w:proofErr w:type="spellEnd"/>
+            <w:r>
+              <w:rPr>
+                <w:lang w:val="en-GB"/>
+              </w:rPr>
+              <w:t>::</w:t>
+            </w:r>
+            <w:proofErr w:type="gramEnd"/>
+            <w:r>
+              <w:rPr>
+                <w:lang w:val="en-GB"/>
+              </w:rPr>
+              <w:t>logout</w:t>
             </w:r>
           </w:p>
           <w:p>
@@ -5961,7 +6041,14 @@
               <w:rPr>
                 <w:lang w:val="en-GB"/>
               </w:rPr>
-              <w:t>Context:PersonalProfileService</w:t>
+              <w:t>Context:</w:t>
+            </w:r>
+            <w:proofErr w:type="gramStart"/>
+            <w:r>
+              <w:rPr>
+                <w:lang w:val="en-GB"/>
+              </w:rPr>
+              <w:t>PersonalProfileService</w:t>
             </w:r>
             <w:proofErr w:type="spellEnd"/>
             <w:r>
@@ -5971,6 +6058,7 @@
               <w:t>::</w:t>
             </w:r>
             <w:proofErr w:type="spellStart"/>
+            <w:proofErr w:type="gramEnd"/>
             <w:r>
               <w:rPr>
                 <w:lang w:val="en-GB"/>
@@ -6090,7 +6178,14 @@
               <w:rPr>
                 <w:lang w:val="en-GB"/>
               </w:rPr>
-              <w:t>Context:PersonalProfileService</w:t>
+              <w:t>Context:</w:t>
+            </w:r>
+            <w:proofErr w:type="gramStart"/>
+            <w:r>
+              <w:rPr>
+                <w:lang w:val="en-GB"/>
+              </w:rPr>
+              <w:t>PersonalProfileService</w:t>
             </w:r>
             <w:proofErr w:type="spellEnd"/>
             <w:r>
@@ -6100,6 +6195,7 @@
               <w:t>::</w:t>
             </w:r>
             <w:proofErr w:type="spellStart"/>
+            <w:proofErr w:type="gramEnd"/>
             <w:r>
               <w:rPr>
                 <w:lang w:val="en-GB"/>
@@ -6206,7 +6302,15 @@
             </w:r>
             <w:proofErr w:type="spellEnd"/>
             <w:r>
-              <w:t xml:space="preserve"> = View::Profilo</w:t>
+              <w:t xml:space="preserve"> = </w:t>
+            </w:r>
+            <w:proofErr w:type="gramStart"/>
+            <w:r>
+              <w:t>View::</w:t>
+            </w:r>
+            <w:proofErr w:type="gramEnd"/>
+            <w:r>
+              <w:t>Profilo</w:t>
             </w:r>
           </w:p>
         </w:tc>
@@ -6384,7 +6488,14 @@
               <w:rPr>
                 <w:lang w:val="en-GB"/>
               </w:rPr>
-              <w:t>Context:PersonalProfileService</w:t>
+              <w:t>Context:</w:t>
+            </w:r>
+            <w:proofErr w:type="gramStart"/>
+            <w:r>
+              <w:rPr>
+                <w:lang w:val="en-GB"/>
+              </w:rPr>
+              <w:t>PersonalProfileService</w:t>
             </w:r>
             <w:proofErr w:type="spellEnd"/>
             <w:r>
@@ -6394,6 +6505,7 @@
               <w:t>::</w:t>
             </w:r>
             <w:proofErr w:type="spellStart"/>
+            <w:proofErr w:type="gramEnd"/>
             <w:r>
               <w:rPr>
                 <w:lang w:val="en-GB"/>
@@ -6487,9 +6599,14 @@
             </w:r>
             <w:proofErr w:type="spellEnd"/>
             <w:r>
-              <w:t xml:space="preserve"> = View::</w:t>
-            </w:r>
-            <w:proofErr w:type="spellStart"/>
+              <w:t xml:space="preserve"> = </w:t>
+            </w:r>
+            <w:proofErr w:type="gramStart"/>
+            <w:r>
+              <w:t>View::</w:t>
+            </w:r>
+            <w:proofErr w:type="spellStart"/>
+            <w:proofErr w:type="gramEnd"/>
             <w:r>
               <w:t>Profile</w:t>
             </w:r>
@@ -6534,7 +6651,14 @@
               <w:rPr>
                 <w:lang w:val="en-GB"/>
               </w:rPr>
-              <w:t>Context:PersonalProfileService</w:t>
+              <w:t>Context:</w:t>
+            </w:r>
+            <w:proofErr w:type="gramStart"/>
+            <w:r>
+              <w:rPr>
+                <w:lang w:val="en-GB"/>
+              </w:rPr>
+              <w:t>PersonalProfileService</w:t>
             </w:r>
             <w:proofErr w:type="spellEnd"/>
             <w:r>
@@ -6544,6 +6668,7 @@
               <w:t>::</w:t>
             </w:r>
             <w:proofErr w:type="spellStart"/>
+            <w:proofErr w:type="gramEnd"/>
             <w:r>
               <w:rPr>
                 <w:lang w:val="en-GB"/>
@@ -6651,9 +6776,17 @@
               <w:rPr>
                 <w:lang w:val="en-GB"/>
               </w:rPr>
-              <w:t xml:space="preserve"> = View::</w:t>
-            </w:r>
-            <w:proofErr w:type="spellStart"/>
+              <w:t xml:space="preserve"> = </w:t>
+            </w:r>
+            <w:proofErr w:type="gramStart"/>
+            <w:r>
+              <w:rPr>
+                <w:lang w:val="en-GB"/>
+              </w:rPr>
+              <w:t>View::</w:t>
+            </w:r>
+            <w:proofErr w:type="spellStart"/>
+            <w:proofErr w:type="gramEnd"/>
             <w:r>
               <w:rPr>
                 <w:lang w:val="en-GB"/>
@@ -7266,7 +7399,14 @@
               <w:rPr>
                 <w:lang w:val="en-GB"/>
               </w:rPr>
-              <w:t>Context:ProfileManagementService</w:t>
+              <w:t>Context:</w:t>
+            </w:r>
+            <w:proofErr w:type="gramStart"/>
+            <w:r>
+              <w:rPr>
+                <w:lang w:val="en-GB"/>
+              </w:rPr>
+              <w:t>ProfileManagementService</w:t>
             </w:r>
             <w:proofErr w:type="spellEnd"/>
             <w:r>
@@ -7276,6 +7416,7 @@
               <w:t>::</w:t>
             </w:r>
             <w:proofErr w:type="spellStart"/>
+            <w:proofErr w:type="gramEnd"/>
             <w:r>
               <w:rPr>
                 <w:lang w:val="en-GB"/>
@@ -7370,9 +7511,17 @@
               <w:rPr>
                 <w:lang w:val="en-GB"/>
               </w:rPr>
-              <w:t xml:space="preserve"> = role::</w:t>
-            </w:r>
-            <w:proofErr w:type="spellStart"/>
+              <w:t xml:space="preserve"> = </w:t>
+            </w:r>
+            <w:proofErr w:type="gramStart"/>
+            <w:r>
+              <w:rPr>
+                <w:lang w:val="en-GB"/>
+              </w:rPr>
+              <w:t>role::</w:t>
+            </w:r>
+            <w:proofErr w:type="spellStart"/>
+            <w:proofErr w:type="gramEnd"/>
             <w:r>
               <w:rPr>
                 <w:lang w:val="en-GB"/>
@@ -7411,9 +7560,17 @@
               <w:rPr>
                 <w:lang w:val="en-GB"/>
               </w:rPr>
-              <w:t xml:space="preserve"> = View::</w:t>
-            </w:r>
-            <w:proofErr w:type="spellStart"/>
+              <w:t xml:space="preserve"> = </w:t>
+            </w:r>
+            <w:proofErr w:type="gramStart"/>
+            <w:r>
+              <w:rPr>
+                <w:lang w:val="en-GB"/>
+              </w:rPr>
+              <w:t>View::</w:t>
+            </w:r>
+            <w:proofErr w:type="spellStart"/>
+            <w:proofErr w:type="gramEnd"/>
             <w:r>
               <w:rPr>
                 <w:lang w:val="en-GB"/>
@@ -7451,7 +7608,14 @@
               <w:rPr>
                 <w:lang w:val="en-GB"/>
               </w:rPr>
-              <w:t>Context:ProfileManagementService</w:t>
+              <w:t>Context:</w:t>
+            </w:r>
+            <w:proofErr w:type="gramStart"/>
+            <w:r>
+              <w:rPr>
+                <w:lang w:val="en-GB"/>
+              </w:rPr>
+              <w:t>ProfileManagementService</w:t>
             </w:r>
             <w:proofErr w:type="spellEnd"/>
             <w:r>
@@ -7461,6 +7625,7 @@
               <w:t>::</w:t>
             </w:r>
             <w:proofErr w:type="spellStart"/>
+            <w:proofErr w:type="gramEnd"/>
             <w:r>
               <w:rPr>
                 <w:lang w:val="en-GB"/>
@@ -7554,9 +7719,14 @@
             </w:r>
             <w:proofErr w:type="spellStart"/>
             <w:r>
-              <w:t>account.nomeUtente</w:t>
-            </w:r>
-            <w:proofErr w:type="spellEnd"/>
+              <w:t>account.</w:t>
+            </w:r>
+            <w:proofErr w:type="gramStart"/>
+            <w:r>
+              <w:t>nomeUtente</w:t>
+            </w:r>
+            <w:proofErr w:type="spellEnd"/>
+            <w:proofErr w:type="gramEnd"/>
             <w:r>
               <w:t xml:space="preserve"> and</w:t>
             </w:r>
@@ -7681,7 +7851,14 @@
               <w:rPr>
                 <w:lang w:val="en-GB"/>
               </w:rPr>
-              <w:t>Context:ProfileManagementService</w:t>
+              <w:t>Context:</w:t>
+            </w:r>
+            <w:proofErr w:type="gramStart"/>
+            <w:r>
+              <w:rPr>
+                <w:lang w:val="en-GB"/>
+              </w:rPr>
+              <w:t>ProfileManagementService</w:t>
             </w:r>
             <w:proofErr w:type="spellEnd"/>
             <w:r>
@@ -7691,6 +7868,7 @@
               <w:t>::</w:t>
             </w:r>
             <w:proofErr w:type="spellStart"/>
+            <w:proofErr w:type="gramEnd"/>
             <w:r>
               <w:rPr>
                 <w:lang w:val="en-GB"/>
@@ -7771,9 +7949,17 @@
               <w:rPr>
                 <w:lang w:val="en-GB"/>
               </w:rPr>
-              <w:t xml:space="preserve"> = role::</w:t>
-            </w:r>
-            <w:proofErr w:type="spellStart"/>
+              <w:t xml:space="preserve"> = </w:t>
+            </w:r>
+            <w:proofErr w:type="gramStart"/>
+            <w:r>
+              <w:rPr>
+                <w:lang w:val="en-GB"/>
+              </w:rPr>
+              <w:t>role::</w:t>
+            </w:r>
+            <w:proofErr w:type="spellStart"/>
+            <w:proofErr w:type="gramEnd"/>
             <w:r>
               <w:rPr>
                 <w:lang w:val="en-GB"/>
@@ -7812,7 +7998,21 @@
               <w:rPr>
                 <w:lang w:val="en-GB"/>
               </w:rPr>
-              <w:t xml:space="preserve"> = View::Homepage</w:t>
+              <w:t xml:space="preserve"> = </w:t>
+            </w:r>
+            <w:proofErr w:type="gramStart"/>
+            <w:r>
+              <w:rPr>
+                <w:lang w:val="en-GB"/>
+              </w:rPr>
+              <w:t>View::</w:t>
+            </w:r>
+            <w:proofErr w:type="gramEnd"/>
+            <w:r>
+              <w:rPr>
+                <w:lang w:val="en-GB"/>
+              </w:rPr>
+              <w:t>Homepage</w:t>
             </w:r>
           </w:p>
         </w:tc>
@@ -7844,7 +8044,14 @@
               <w:rPr>
                 <w:lang w:val="en-GB"/>
               </w:rPr>
-              <w:t>Context:ProfileManagementService</w:t>
+              <w:t>Context:</w:t>
+            </w:r>
+            <w:proofErr w:type="gramStart"/>
+            <w:r>
+              <w:rPr>
+                <w:lang w:val="en-GB"/>
+              </w:rPr>
+              <w:t>ProfileManagementService</w:t>
             </w:r>
             <w:proofErr w:type="spellEnd"/>
             <w:r>
@@ -7854,6 +8061,7 @@
               <w:t>::</w:t>
             </w:r>
             <w:proofErr w:type="spellStart"/>
+            <w:proofErr w:type="gramEnd"/>
             <w:r>
               <w:rPr>
                 <w:lang w:val="en-GB"/>
@@ -7924,7 +8132,15 @@
             </w:r>
             <w:proofErr w:type="spellEnd"/>
             <w:r>
-              <w:t xml:space="preserve"> = View::Profilo</w:t>
+              <w:t xml:space="preserve"> = </w:t>
+            </w:r>
+            <w:proofErr w:type="gramStart"/>
+            <w:r>
+              <w:t>View::</w:t>
+            </w:r>
+            <w:proofErr w:type="gramEnd"/>
+            <w:r>
+              <w:t>Profilo</w:t>
             </w:r>
           </w:p>
         </w:tc>
@@ -8035,7 +8251,14 @@
               <w:rPr>
                 <w:lang w:val="en-GB"/>
               </w:rPr>
-              <w:t>Context:ProfileManagementService</w:t>
+              <w:t>Context:</w:t>
+            </w:r>
+            <w:proofErr w:type="gramStart"/>
+            <w:r>
+              <w:rPr>
+                <w:lang w:val="en-GB"/>
+              </w:rPr>
+              <w:t>ProfileManagementService</w:t>
             </w:r>
             <w:proofErr w:type="spellEnd"/>
             <w:r>
@@ -8045,6 +8268,7 @@
               <w:t>::</w:t>
             </w:r>
             <w:proofErr w:type="spellStart"/>
+            <w:proofErr w:type="gramEnd"/>
             <w:r>
               <w:rPr>
                 <w:lang w:val="en-GB"/>
@@ -8139,9 +8363,17 @@
               <w:rPr>
                 <w:lang w:val="en-GB"/>
               </w:rPr>
-              <w:t xml:space="preserve"> = role::</w:t>
-            </w:r>
-            <w:proofErr w:type="spellStart"/>
+              <w:t xml:space="preserve"> = </w:t>
+            </w:r>
+            <w:proofErr w:type="gramStart"/>
+            <w:r>
+              <w:rPr>
+                <w:lang w:val="en-GB"/>
+              </w:rPr>
+              <w:t>role::</w:t>
+            </w:r>
+            <w:proofErr w:type="spellStart"/>
+            <w:proofErr w:type="gramEnd"/>
             <w:r>
               <w:rPr>
                 <w:lang w:val="en-GB"/>
@@ -8180,7 +8412,21 @@
               <w:rPr>
                 <w:lang w:val="en-GB"/>
               </w:rPr>
-              <w:t xml:space="preserve"> = View::Profile(</w:t>
+              <w:t xml:space="preserve"> = </w:t>
+            </w:r>
+            <w:proofErr w:type="gramStart"/>
+            <w:r>
+              <w:rPr>
+                <w:lang w:val="en-GB"/>
+              </w:rPr>
+              <w:t>View::</w:t>
+            </w:r>
+            <w:proofErr w:type="gramEnd"/>
+            <w:r>
+              <w:rPr>
+                <w:lang w:val="en-GB"/>
+              </w:rPr>
+              <w:t>Profile(</w:t>
             </w:r>
             <w:proofErr w:type="spellStart"/>
             <w:r>
@@ -8226,14 +8472,28 @@
               <w:rPr>
                 <w:lang w:val="en-GB"/>
               </w:rPr>
-              <w:t>Context:ProfileManagementService</w:t>
-            </w:r>
-            <w:proofErr w:type="spellEnd"/>
-            <w:r>
-              <w:rPr>
-                <w:lang w:val="en-GB"/>
-              </w:rPr>
-              <w:t xml:space="preserve">:: </w:t>
+              <w:t>Context:</w:t>
+            </w:r>
+            <w:proofErr w:type="gramStart"/>
+            <w:r>
+              <w:rPr>
+                <w:lang w:val="en-GB"/>
+              </w:rPr>
+              <w:t>ProfileManagementService</w:t>
+            </w:r>
+            <w:proofErr w:type="spellEnd"/>
+            <w:r>
+              <w:rPr>
+                <w:lang w:val="en-GB"/>
+              </w:rPr>
+              <w:t>::</w:t>
+            </w:r>
+            <w:proofErr w:type="gramEnd"/>
+            <w:r>
+              <w:rPr>
+                <w:lang w:val="en-GB"/>
+              </w:rPr>
+              <w:t xml:space="preserve"> </w:t>
             </w:r>
             <w:proofErr w:type="spellStart"/>
             <w:r>
@@ -8365,9 +8625,14 @@
             </w:r>
             <w:proofErr w:type="spellEnd"/>
             <w:r>
-              <w:t xml:space="preserve"> = View::</w:t>
-            </w:r>
-            <w:proofErr w:type="spellStart"/>
+              <w:t xml:space="preserve"> = </w:t>
+            </w:r>
+            <w:proofErr w:type="gramStart"/>
+            <w:r>
+              <w:t>View::</w:t>
+            </w:r>
+            <w:proofErr w:type="spellStart"/>
+            <w:proofErr w:type="gramEnd"/>
             <w:r>
               <w:t>Profile</w:t>
             </w:r>
@@ -8521,7 +8786,14 @@
               <w:rPr>
                 <w:lang w:val="en-GB"/>
               </w:rPr>
-              <w:t>Context:ProfileManagementService</w:t>
+              <w:t>Context:</w:t>
+            </w:r>
+            <w:proofErr w:type="gramStart"/>
+            <w:r>
+              <w:rPr>
+                <w:lang w:val="en-GB"/>
+              </w:rPr>
+              <w:t>ProfileManagementService</w:t>
             </w:r>
             <w:proofErr w:type="spellEnd"/>
             <w:r>
@@ -8531,6 +8803,7 @@
               <w:t>::</w:t>
             </w:r>
             <w:proofErr w:type="spellStart"/>
+            <w:proofErr w:type="gramEnd"/>
             <w:r>
               <w:rPr>
                 <w:lang w:val="en-GB"/>
@@ -8639,9 +8912,17 @@
               <w:rPr>
                 <w:lang w:val="en-GB"/>
               </w:rPr>
-              <w:t xml:space="preserve"> = role::</w:t>
-            </w:r>
-            <w:proofErr w:type="spellStart"/>
+              <w:t xml:space="preserve"> = </w:t>
+            </w:r>
+            <w:proofErr w:type="gramStart"/>
+            <w:r>
+              <w:rPr>
+                <w:lang w:val="en-GB"/>
+              </w:rPr>
+              <w:t>role::</w:t>
+            </w:r>
+            <w:proofErr w:type="spellStart"/>
+            <w:proofErr w:type="gramEnd"/>
             <w:r>
               <w:rPr>
                 <w:lang w:val="en-GB"/>
@@ -8680,7 +8961,21 @@
               <w:rPr>
                 <w:lang w:val="en-GB"/>
               </w:rPr>
-              <w:t xml:space="preserve"> = View::Profile(</w:t>
+              <w:t xml:space="preserve"> = </w:t>
+            </w:r>
+            <w:proofErr w:type="gramStart"/>
+            <w:r>
+              <w:rPr>
+                <w:lang w:val="en-GB"/>
+              </w:rPr>
+              <w:t>View::</w:t>
+            </w:r>
+            <w:proofErr w:type="gramEnd"/>
+            <w:r>
+              <w:rPr>
+                <w:lang w:val="en-GB"/>
+              </w:rPr>
+              <w:t>Profile(</w:t>
             </w:r>
             <w:proofErr w:type="spellStart"/>
             <w:r>
@@ -8726,14 +9021,28 @@
               <w:rPr>
                 <w:lang w:val="en-GB"/>
               </w:rPr>
-              <w:t>Context:ProfileManagementService</w:t>
-            </w:r>
-            <w:proofErr w:type="spellEnd"/>
-            <w:r>
-              <w:rPr>
-                <w:lang w:val="en-GB"/>
-              </w:rPr>
-              <w:t xml:space="preserve">:: </w:t>
+              <w:t>Context:</w:t>
+            </w:r>
+            <w:proofErr w:type="gramStart"/>
+            <w:r>
+              <w:rPr>
+                <w:lang w:val="en-GB"/>
+              </w:rPr>
+              <w:t>ProfileManagementService</w:t>
+            </w:r>
+            <w:proofErr w:type="spellEnd"/>
+            <w:r>
+              <w:rPr>
+                <w:lang w:val="en-GB"/>
+              </w:rPr>
+              <w:t>::</w:t>
+            </w:r>
+            <w:proofErr w:type="gramEnd"/>
+            <w:r>
+              <w:rPr>
+                <w:lang w:val="en-GB"/>
+              </w:rPr>
+              <w:t xml:space="preserve"> </w:t>
             </w:r>
             <w:proofErr w:type="spellStart"/>
             <w:r>
@@ -8905,7 +9214,21 @@
               <w:rPr>
                 <w:lang w:val="en-GB"/>
               </w:rPr>
-              <w:t xml:space="preserve"> = View::Profile(</w:t>
+              <w:t xml:space="preserve"> = </w:t>
+            </w:r>
+            <w:proofErr w:type="gramStart"/>
+            <w:r>
+              <w:rPr>
+                <w:lang w:val="en-GB"/>
+              </w:rPr>
+              <w:t>View::</w:t>
+            </w:r>
+            <w:proofErr w:type="gramEnd"/>
+            <w:r>
+              <w:rPr>
+                <w:lang w:val="en-GB"/>
+              </w:rPr>
+              <w:t>Profile(</w:t>
             </w:r>
             <w:proofErr w:type="spellStart"/>
             <w:r>
@@ -9074,14 +9397,28 @@
               <w:rPr>
                 <w:lang w:val="en-GB"/>
               </w:rPr>
-              <w:t>Context:ProfileManagementService</w:t>
-            </w:r>
-            <w:proofErr w:type="spellEnd"/>
-            <w:r>
-              <w:rPr>
-                <w:lang w:val="en-GB"/>
-              </w:rPr>
-              <w:t xml:space="preserve">:: </w:t>
+              <w:t>Context:</w:t>
+            </w:r>
+            <w:proofErr w:type="gramStart"/>
+            <w:r>
+              <w:rPr>
+                <w:lang w:val="en-GB"/>
+              </w:rPr>
+              <w:t>ProfileManagementService</w:t>
+            </w:r>
+            <w:proofErr w:type="spellEnd"/>
+            <w:r>
+              <w:rPr>
+                <w:lang w:val="en-GB"/>
+              </w:rPr>
+              <w:t>::</w:t>
+            </w:r>
+            <w:proofErr w:type="gramEnd"/>
+            <w:r>
+              <w:rPr>
+                <w:lang w:val="en-GB"/>
+              </w:rPr>
+              <w:t xml:space="preserve"> </w:t>
             </w:r>
             <w:proofErr w:type="spellStart"/>
             <w:r>
@@ -9192,9 +9529,17 @@
               <w:rPr>
                 <w:lang w:val="en-GB"/>
               </w:rPr>
-              <w:t xml:space="preserve"> = role::</w:t>
-            </w:r>
-            <w:proofErr w:type="spellStart"/>
+              <w:t xml:space="preserve"> = </w:t>
+            </w:r>
+            <w:proofErr w:type="gramStart"/>
+            <w:r>
+              <w:rPr>
+                <w:lang w:val="en-GB"/>
+              </w:rPr>
+              <w:t>role::</w:t>
+            </w:r>
+            <w:proofErr w:type="spellStart"/>
+            <w:proofErr w:type="gramEnd"/>
             <w:r>
               <w:rPr>
                 <w:lang w:val="en-GB"/>
@@ -9233,7 +9578,21 @@
               <w:rPr>
                 <w:lang w:val="en-GB"/>
               </w:rPr>
-              <w:t xml:space="preserve"> = View::Profile(</w:t>
+              <w:t xml:space="preserve"> = </w:t>
+            </w:r>
+            <w:proofErr w:type="gramStart"/>
+            <w:r>
+              <w:rPr>
+                <w:lang w:val="en-GB"/>
+              </w:rPr>
+              <w:t>View::</w:t>
+            </w:r>
+            <w:proofErr w:type="gramEnd"/>
+            <w:r>
+              <w:rPr>
+                <w:lang w:val="en-GB"/>
+              </w:rPr>
+              <w:t>Profile(</w:t>
             </w:r>
             <w:proofErr w:type="spellStart"/>
             <w:r>
@@ -9279,14 +9638,28 @@
               <w:rPr>
                 <w:lang w:val="en-GB"/>
               </w:rPr>
-              <w:t>Context:ProfileManagementService</w:t>
-            </w:r>
-            <w:proofErr w:type="spellEnd"/>
-            <w:r>
-              <w:rPr>
-                <w:lang w:val="en-GB"/>
-              </w:rPr>
-              <w:t xml:space="preserve">:: </w:t>
+              <w:t>Context:</w:t>
+            </w:r>
+            <w:proofErr w:type="gramStart"/>
+            <w:r>
+              <w:rPr>
+                <w:lang w:val="en-GB"/>
+              </w:rPr>
+              <w:t>ProfileManagementService</w:t>
+            </w:r>
+            <w:proofErr w:type="spellEnd"/>
+            <w:r>
+              <w:rPr>
+                <w:lang w:val="en-GB"/>
+              </w:rPr>
+              <w:t>::</w:t>
+            </w:r>
+            <w:proofErr w:type="gramEnd"/>
+            <w:r>
+              <w:rPr>
+                <w:lang w:val="en-GB"/>
+              </w:rPr>
+              <w:t xml:space="preserve"> </w:t>
             </w:r>
             <w:proofErr w:type="spellStart"/>
             <w:r>
@@ -9458,7 +9831,21 @@
               <w:rPr>
                 <w:lang w:val="en-GB"/>
               </w:rPr>
-              <w:t xml:space="preserve"> = View::Profile(</w:t>
+              <w:t xml:space="preserve"> = </w:t>
+            </w:r>
+            <w:proofErr w:type="gramStart"/>
+            <w:r>
+              <w:rPr>
+                <w:lang w:val="en-GB"/>
+              </w:rPr>
+              <w:t>View::</w:t>
+            </w:r>
+            <w:proofErr w:type="gramEnd"/>
+            <w:r>
+              <w:rPr>
+                <w:lang w:val="en-GB"/>
+              </w:rPr>
+              <w:t>Profile(</w:t>
             </w:r>
             <w:proofErr w:type="spellStart"/>
             <w:r>
@@ -9591,14 +9978,28 @@
               <w:rPr>
                 <w:lang w:val="en-GB"/>
               </w:rPr>
-              <w:t>Context:ProfileManagementService</w:t>
-            </w:r>
-            <w:proofErr w:type="spellEnd"/>
-            <w:r>
-              <w:rPr>
-                <w:lang w:val="en-GB"/>
-              </w:rPr>
-              <w:t xml:space="preserve">:: </w:t>
+              <w:t>Context:</w:t>
+            </w:r>
+            <w:proofErr w:type="gramStart"/>
+            <w:r>
+              <w:rPr>
+                <w:lang w:val="en-GB"/>
+              </w:rPr>
+              <w:t>ProfileManagementService</w:t>
+            </w:r>
+            <w:proofErr w:type="spellEnd"/>
+            <w:r>
+              <w:rPr>
+                <w:lang w:val="en-GB"/>
+              </w:rPr>
+              <w:t>::</w:t>
+            </w:r>
+            <w:proofErr w:type="gramEnd"/>
+            <w:r>
+              <w:rPr>
+                <w:lang w:val="en-GB"/>
+              </w:rPr>
+              <w:t xml:space="preserve"> </w:t>
             </w:r>
             <w:proofErr w:type="spellStart"/>
             <w:r>
@@ -9695,9 +10096,17 @@
               <w:rPr>
                 <w:lang w:val="en-GB"/>
               </w:rPr>
-              <w:t xml:space="preserve"> = role::</w:t>
-            </w:r>
-            <w:proofErr w:type="spellStart"/>
+              <w:t xml:space="preserve"> = </w:t>
+            </w:r>
+            <w:proofErr w:type="gramStart"/>
+            <w:r>
+              <w:rPr>
+                <w:lang w:val="en-GB"/>
+              </w:rPr>
+              <w:t>role::</w:t>
+            </w:r>
+            <w:proofErr w:type="spellStart"/>
+            <w:proofErr w:type="gramEnd"/>
             <w:r>
               <w:rPr>
                 <w:lang w:val="en-GB"/>
@@ -9736,7 +10145,21 @@
               <w:rPr>
                 <w:lang w:val="en-GB"/>
               </w:rPr>
-              <w:t xml:space="preserve"> = View::Profile(</w:t>
+              <w:t xml:space="preserve"> = </w:t>
+            </w:r>
+            <w:proofErr w:type="gramStart"/>
+            <w:r>
+              <w:rPr>
+                <w:lang w:val="en-GB"/>
+              </w:rPr>
+              <w:t>View::</w:t>
+            </w:r>
+            <w:proofErr w:type="gramEnd"/>
+            <w:r>
+              <w:rPr>
+                <w:lang w:val="en-GB"/>
+              </w:rPr>
+              <w:t>Profile(</w:t>
             </w:r>
             <w:proofErr w:type="spellStart"/>
             <w:r>
@@ -9782,14 +10205,28 @@
               <w:rPr>
                 <w:lang w:val="en-GB"/>
               </w:rPr>
-              <w:t>Context:ProfileManagementService</w:t>
-            </w:r>
-            <w:proofErr w:type="spellEnd"/>
-            <w:r>
-              <w:rPr>
-                <w:lang w:val="en-GB"/>
-              </w:rPr>
-              <w:t xml:space="preserve">:: </w:t>
+              <w:t>Context:</w:t>
+            </w:r>
+            <w:proofErr w:type="gramStart"/>
+            <w:r>
+              <w:rPr>
+                <w:lang w:val="en-GB"/>
+              </w:rPr>
+              <w:t>ProfileManagementService</w:t>
+            </w:r>
+            <w:proofErr w:type="spellEnd"/>
+            <w:r>
+              <w:rPr>
+                <w:lang w:val="en-GB"/>
+              </w:rPr>
+              <w:t>::</w:t>
+            </w:r>
+            <w:proofErr w:type="gramEnd"/>
+            <w:r>
+              <w:rPr>
+                <w:lang w:val="en-GB"/>
+              </w:rPr>
+              <w:t xml:space="preserve"> </w:t>
             </w:r>
             <w:proofErr w:type="spellStart"/>
             <w:r>
@@ -9913,7 +10350,15 @@
             </w:r>
             <w:proofErr w:type="spellEnd"/>
             <w:r>
-              <w:t xml:space="preserve"> = View::Homepage</w:t>
+              <w:t xml:space="preserve"> = </w:t>
+            </w:r>
+            <w:proofErr w:type="gramStart"/>
+            <w:r>
+              <w:t>View::</w:t>
+            </w:r>
+            <w:proofErr w:type="gramEnd"/>
+            <w:r>
+              <w:t>Homepage</w:t>
             </w:r>
           </w:p>
         </w:tc>
@@ -10442,7 +10887,14 @@
               <w:rPr>
                 <w:lang w:val="en-GB"/>
               </w:rPr>
-              <w:t>Context:TaskCommonService</w:t>
+              <w:t>Context:</w:t>
+            </w:r>
+            <w:proofErr w:type="gramStart"/>
+            <w:r>
+              <w:rPr>
+                <w:lang w:val="en-GB"/>
+              </w:rPr>
+              <w:t>TaskCommonService</w:t>
             </w:r>
             <w:proofErr w:type="spellEnd"/>
             <w:r>
@@ -10452,6 +10904,7 @@
               <w:t>::</w:t>
             </w:r>
             <w:proofErr w:type="spellStart"/>
+            <w:proofErr w:type="gramEnd"/>
             <w:r>
               <w:rPr>
                 <w:lang w:val="en-GB"/>
@@ -10538,7 +10991,15 @@
             </w:r>
             <w:proofErr w:type="spellEnd"/>
             <w:r>
-              <w:t xml:space="preserve"> = View::Homepage </w:t>
+              <w:t xml:space="preserve"> = </w:t>
+            </w:r>
+            <w:proofErr w:type="gramStart"/>
+            <w:r>
+              <w:t>View::</w:t>
+            </w:r>
+            <w:proofErr w:type="gramEnd"/>
+            <w:r>
+              <w:t xml:space="preserve">Homepage </w:t>
             </w:r>
           </w:p>
         </w:tc>
@@ -10570,7 +11031,14 @@
               <w:rPr>
                 <w:lang w:val="en-GB"/>
               </w:rPr>
-              <w:t>Context:TaskCommonService</w:t>
+              <w:t>Context:</w:t>
+            </w:r>
+            <w:proofErr w:type="gramStart"/>
+            <w:r>
+              <w:rPr>
+                <w:lang w:val="en-GB"/>
+              </w:rPr>
+              <w:t>TaskCommonService</w:t>
             </w:r>
             <w:proofErr w:type="spellEnd"/>
             <w:r>
@@ -10580,6 +11048,7 @@
               <w:t>::</w:t>
             </w:r>
             <w:proofErr w:type="spellStart"/>
+            <w:proofErr w:type="gramEnd"/>
             <w:r>
               <w:rPr>
                 <w:lang w:val="en-GB"/>
@@ -10686,7 +11155,15 @@
             </w:r>
             <w:proofErr w:type="spellEnd"/>
             <w:r>
-              <w:t xml:space="preserve"> = View::Task(</w:t>
+              <w:t xml:space="preserve"> = </w:t>
+            </w:r>
+            <w:proofErr w:type="gramStart"/>
+            <w:r>
+              <w:t>View::</w:t>
+            </w:r>
+            <w:proofErr w:type="gramEnd"/>
+            <w:r>
+              <w:t>Task(</w:t>
             </w:r>
             <w:proofErr w:type="spellStart"/>
             <w:r>
@@ -10822,7 +11299,14 @@
               <w:rPr>
                 <w:lang w:val="en-GB"/>
               </w:rPr>
-              <w:t>Context:TaskCommonService</w:t>
+              <w:t>Context:</w:t>
+            </w:r>
+            <w:proofErr w:type="gramStart"/>
+            <w:r>
+              <w:rPr>
+                <w:lang w:val="en-GB"/>
+              </w:rPr>
+              <w:t>TaskCommonService</w:t>
             </w:r>
             <w:proofErr w:type="spellEnd"/>
             <w:r>
@@ -10832,6 +11316,7 @@
               <w:t>::</w:t>
             </w:r>
             <w:proofErr w:type="spellStart"/>
+            <w:proofErr w:type="gramEnd"/>
             <w:r>
               <w:rPr>
                 <w:lang w:val="en-GB"/>
@@ -10904,7 +11389,15 @@
             </w:r>
             <w:proofErr w:type="spellEnd"/>
             <w:r>
-              <w:t xml:space="preserve"> = View::Homepage</w:t>
+              <w:t xml:space="preserve"> = </w:t>
+            </w:r>
+            <w:proofErr w:type="gramStart"/>
+            <w:r>
+              <w:t>View::</w:t>
+            </w:r>
+            <w:proofErr w:type="gramEnd"/>
+            <w:r>
+              <w:t>Homepage</w:t>
             </w:r>
           </w:p>
         </w:tc>
@@ -10936,7 +11429,14 @@
               <w:rPr>
                 <w:lang w:val="en-GB"/>
               </w:rPr>
-              <w:t>Context:TaskCommonService</w:t>
+              <w:t>Context:</w:t>
+            </w:r>
+            <w:proofErr w:type="gramStart"/>
+            <w:r>
+              <w:rPr>
+                <w:lang w:val="en-GB"/>
+              </w:rPr>
+              <w:t>TaskCommonService</w:t>
             </w:r>
             <w:proofErr w:type="spellEnd"/>
             <w:r>
@@ -10946,6 +11446,7 @@
               <w:t>::</w:t>
             </w:r>
             <w:proofErr w:type="spellStart"/>
+            <w:proofErr w:type="gramEnd"/>
             <w:r>
               <w:rPr>
                 <w:lang w:val="en-GB"/>
@@ -11051,7 +11552,15 @@
             </w:r>
             <w:proofErr w:type="spellEnd"/>
             <w:r>
-              <w:t xml:space="preserve"> = View::Homepage</w:t>
+              <w:t xml:space="preserve"> = </w:t>
+            </w:r>
+            <w:proofErr w:type="gramStart"/>
+            <w:r>
+              <w:t>View::</w:t>
+            </w:r>
+            <w:proofErr w:type="gramEnd"/>
+            <w:r>
+              <w:t>Homepage</w:t>
             </w:r>
           </w:p>
         </w:tc>
@@ -11178,7 +11687,14 @@
               <w:rPr>
                 <w:lang w:val="en-GB"/>
               </w:rPr>
-              <w:t>Context:TaskCommonService</w:t>
+              <w:t>Context:</w:t>
+            </w:r>
+            <w:proofErr w:type="gramStart"/>
+            <w:r>
+              <w:rPr>
+                <w:lang w:val="en-GB"/>
+              </w:rPr>
+              <w:t>TaskCommonService</w:t>
             </w:r>
             <w:proofErr w:type="spellEnd"/>
             <w:r>
@@ -11188,6 +11704,7 @@
               <w:t>::</w:t>
             </w:r>
             <w:proofErr w:type="spellStart"/>
+            <w:proofErr w:type="gramEnd"/>
             <w:r>
               <w:rPr>
                 <w:lang w:val="en-GB"/>
@@ -11288,7 +11805,21 @@
               <w:rPr>
                 <w:lang w:val="en-GB"/>
               </w:rPr>
-              <w:t xml:space="preserve"> = View::Task(</w:t>
+              <w:t xml:space="preserve"> = </w:t>
+            </w:r>
+            <w:proofErr w:type="gramStart"/>
+            <w:r>
+              <w:rPr>
+                <w:lang w:val="en-GB"/>
+              </w:rPr>
+              <w:t>View::</w:t>
+            </w:r>
+            <w:proofErr w:type="gramEnd"/>
+            <w:r>
+              <w:rPr>
+                <w:lang w:val="en-GB"/>
+              </w:rPr>
+              <w:t>Task(</w:t>
             </w:r>
             <w:proofErr w:type="spellStart"/>
             <w:r>
@@ -11337,9 +11868,17 @@
               <w:rPr>
                 <w:lang w:val="en-GB"/>
               </w:rPr>
-              <w:t>).status &lt;&gt; status::</w:t>
-            </w:r>
-            <w:proofErr w:type="spellStart"/>
+              <w:t xml:space="preserve">).status &lt;&gt; </w:t>
+            </w:r>
+            <w:proofErr w:type="gramStart"/>
+            <w:r>
+              <w:rPr>
+                <w:lang w:val="en-GB"/>
+              </w:rPr>
+              <w:t>status::</w:t>
+            </w:r>
+            <w:proofErr w:type="spellStart"/>
+            <w:proofErr w:type="gramEnd"/>
             <w:r>
               <w:rPr>
                 <w:lang w:val="en-GB"/>
@@ -11351,9 +11890,17 @@
               <w:rPr>
                 <w:lang w:val="en-GB"/>
               </w:rPr>
-              <w:t xml:space="preserve"> or status::</w:t>
-            </w:r>
-            <w:proofErr w:type="spellStart"/>
+              <w:t xml:space="preserve"> or </w:t>
+            </w:r>
+            <w:proofErr w:type="gramStart"/>
+            <w:r>
+              <w:rPr>
+                <w:lang w:val="en-GB"/>
+              </w:rPr>
+              <w:t>status::</w:t>
+            </w:r>
+            <w:proofErr w:type="spellStart"/>
+            <w:proofErr w:type="gramEnd"/>
             <w:r>
               <w:rPr>
                 <w:lang w:val="en-GB"/>
@@ -11391,7 +11938,14 @@
               <w:rPr>
                 <w:lang w:val="en-GB"/>
               </w:rPr>
-              <w:t>Context:TaskCommonService</w:t>
+              <w:t>Context:</w:t>
+            </w:r>
+            <w:proofErr w:type="gramStart"/>
+            <w:r>
+              <w:rPr>
+                <w:lang w:val="en-GB"/>
+              </w:rPr>
+              <w:t>TaskCommonService</w:t>
             </w:r>
             <w:proofErr w:type="spellEnd"/>
             <w:r>
@@ -11401,6 +11955,7 @@
               <w:t>::</w:t>
             </w:r>
             <w:proofErr w:type="spellStart"/>
+            <w:proofErr w:type="gramEnd"/>
             <w:r>
               <w:rPr>
                 <w:lang w:val="en-GB"/>
@@ -11657,7 +12212,14 @@
               <w:rPr>
                 <w:lang w:val="en-GB"/>
               </w:rPr>
-              <w:t>Context:TaskCommonService</w:t>
+              <w:t>Context:</w:t>
+            </w:r>
+            <w:proofErr w:type="gramStart"/>
+            <w:r>
+              <w:rPr>
+                <w:lang w:val="en-GB"/>
+              </w:rPr>
+              <w:t>TaskCommonService</w:t>
             </w:r>
             <w:proofErr w:type="spellEnd"/>
             <w:r>
@@ -11667,6 +12229,7 @@
               <w:t>::</w:t>
             </w:r>
             <w:proofErr w:type="spellStart"/>
+            <w:proofErr w:type="gramEnd"/>
             <w:r>
               <w:rPr>
                 <w:lang w:val="en-GB"/>
@@ -11768,7 +12331,21 @@
               <w:rPr>
                 <w:lang w:val="en-GB"/>
               </w:rPr>
-              <w:t xml:space="preserve"> = View::Task(</w:t>
+              <w:t xml:space="preserve"> = </w:t>
+            </w:r>
+            <w:proofErr w:type="gramStart"/>
+            <w:r>
+              <w:rPr>
+                <w:lang w:val="en-GB"/>
+              </w:rPr>
+              <w:t>View::</w:t>
+            </w:r>
+            <w:proofErr w:type="gramEnd"/>
+            <w:r>
+              <w:rPr>
+                <w:lang w:val="en-GB"/>
+              </w:rPr>
+              <w:t>Task(</w:t>
             </w:r>
             <w:proofErr w:type="spellStart"/>
             <w:r>
@@ -11878,7 +12455,14 @@
               <w:rPr>
                 <w:lang w:val="en-GB"/>
               </w:rPr>
-              <w:t>Context:TaskCommonService</w:t>
+              <w:t>Context:</w:t>
+            </w:r>
+            <w:proofErr w:type="gramStart"/>
+            <w:r>
+              <w:rPr>
+                <w:lang w:val="en-GB"/>
+              </w:rPr>
+              <w:t>TaskCommonService</w:t>
             </w:r>
             <w:proofErr w:type="spellEnd"/>
             <w:r>
@@ -11888,6 +12472,7 @@
               <w:t>::</w:t>
             </w:r>
             <w:proofErr w:type="spellStart"/>
+            <w:proofErr w:type="gramEnd"/>
             <w:r>
               <w:rPr>
                 <w:lang w:val="en-GB"/>
@@ -11981,7 +12566,21 @@
               <w:rPr>
                 <w:lang w:val="en-GB"/>
               </w:rPr>
-              <w:t xml:space="preserve"> = View::Task(</w:t>
+              <w:t xml:space="preserve"> = </w:t>
+            </w:r>
+            <w:proofErr w:type="gramStart"/>
+            <w:r>
+              <w:rPr>
+                <w:lang w:val="en-GB"/>
+              </w:rPr>
+              <w:t>View::</w:t>
+            </w:r>
+            <w:proofErr w:type="gramEnd"/>
+            <w:r>
+              <w:rPr>
+                <w:lang w:val="en-GB"/>
+              </w:rPr>
+              <w:t>Task(</w:t>
             </w:r>
             <w:proofErr w:type="spellStart"/>
             <w:r>
@@ -12477,10 +13076,12 @@
               <w:t xml:space="preserve">: </w:t>
             </w:r>
             <w:proofErr w:type="spellStart"/>
+            <w:proofErr w:type="gramStart"/>
             <w:r>
               <w:t>LocalDate</w:t>
             </w:r>
             <w:proofErr w:type="spellEnd"/>
+            <w:proofErr w:type="gramEnd"/>
             <w:r>
               <w:t xml:space="preserve">, </w:t>
             </w:r>
@@ -12570,7 +13171,14 @@
               <w:rPr>
                 <w:lang w:val="en-GB"/>
               </w:rPr>
-              <w:t>Context:taskSupervisoreService</w:t>
+              <w:t>Context:</w:t>
+            </w:r>
+            <w:proofErr w:type="gramStart"/>
+            <w:r>
+              <w:rPr>
+                <w:lang w:val="en-GB"/>
+              </w:rPr>
+              <w:t>taskSupervisoreService</w:t>
             </w:r>
             <w:proofErr w:type="spellEnd"/>
             <w:r>
@@ -12580,6 +13188,7 @@
               <w:t>::</w:t>
             </w:r>
             <w:proofErr w:type="spellStart"/>
+            <w:proofErr w:type="gramEnd"/>
             <w:r>
               <w:rPr>
                 <w:lang w:val="en-GB"/>
@@ -12730,7 +13339,21 @@
               <w:rPr>
                 <w:lang w:val="en-GB"/>
               </w:rPr>
-              <w:t xml:space="preserve"> = role::Supervisore</w:t>
+              <w:t xml:space="preserve"> = </w:t>
+            </w:r>
+            <w:proofErr w:type="gramStart"/>
+            <w:r>
+              <w:rPr>
+                <w:lang w:val="en-GB"/>
+              </w:rPr>
+              <w:t>role::</w:t>
+            </w:r>
+            <w:proofErr w:type="gramEnd"/>
+            <w:r>
+              <w:rPr>
+                <w:lang w:val="en-GB"/>
+              </w:rPr>
+              <w:t>Supervisore</w:t>
             </w:r>
           </w:p>
           <w:p>
@@ -12778,9 +13401,14 @@
             </w:r>
             <w:proofErr w:type="spellEnd"/>
             <w:r>
-              <w:t xml:space="preserve"> = View::</w:t>
-            </w:r>
-            <w:proofErr w:type="spellStart"/>
+              <w:t xml:space="preserve"> = </w:t>
+            </w:r>
+            <w:proofErr w:type="gramStart"/>
+            <w:r>
+              <w:t>View::</w:t>
+            </w:r>
+            <w:proofErr w:type="spellStart"/>
+            <w:proofErr w:type="gramEnd"/>
             <w:r>
               <w:t>createTask</w:t>
             </w:r>
@@ -12815,7 +13443,14 @@
               <w:rPr>
                 <w:lang w:val="en-GB"/>
               </w:rPr>
-              <w:t>Context:taskSupervisoreService</w:t>
+              <w:t>Context:</w:t>
+            </w:r>
+            <w:proofErr w:type="gramStart"/>
+            <w:r>
+              <w:rPr>
+                <w:lang w:val="en-GB"/>
+              </w:rPr>
+              <w:t>taskSupervisoreService</w:t>
             </w:r>
             <w:proofErr w:type="spellEnd"/>
             <w:r>
@@ -12825,6 +13460,7 @@
               <w:t>::</w:t>
             </w:r>
             <w:proofErr w:type="spellStart"/>
+            <w:proofErr w:type="gramEnd"/>
             <w:r>
               <w:rPr>
                 <w:lang w:val="en-GB"/>
@@ -13038,9 +13674,17 @@
               <w:rPr>
                 <w:lang w:val="en-GB"/>
               </w:rPr>
-              <w:t>() -&gt; select(t | t.id = result.id).status = status::</w:t>
-            </w:r>
-            <w:proofErr w:type="spellStart"/>
+              <w:t xml:space="preserve">() -&gt; select(t | t.id = result.id).status = </w:t>
+            </w:r>
+            <w:proofErr w:type="gramStart"/>
+            <w:r>
+              <w:rPr>
+                <w:lang w:val="en-GB"/>
+              </w:rPr>
+              <w:t>status::</w:t>
+            </w:r>
+            <w:proofErr w:type="spellStart"/>
+            <w:proofErr w:type="gramEnd"/>
             <w:r>
               <w:rPr>
                 <w:lang w:val="en-GB"/>
@@ -13070,7 +13714,15 @@
             </w:r>
             <w:proofErr w:type="spellEnd"/>
             <w:r>
-              <w:t xml:space="preserve"> = View::Task(</w:t>
+              <w:t xml:space="preserve"> = </w:t>
+            </w:r>
+            <w:proofErr w:type="gramStart"/>
+            <w:r>
+              <w:t>View::</w:t>
+            </w:r>
+            <w:proofErr w:type="gramEnd"/>
+            <w:r>
+              <w:t>Task(</w:t>
             </w:r>
             <w:proofErr w:type="spellStart"/>
             <w:r>
@@ -13199,14 +13851,28 @@
               <w:rPr>
                 <w:lang w:val="en-GB"/>
               </w:rPr>
-              <w:t>Context:TaskSupervisoreService</w:t>
-            </w:r>
-            <w:proofErr w:type="spellEnd"/>
-            <w:r>
-              <w:rPr>
-                <w:lang w:val="en-GB"/>
-              </w:rPr>
-              <w:t xml:space="preserve">:: </w:t>
+              <w:t>Context:</w:t>
+            </w:r>
+            <w:proofErr w:type="gramStart"/>
+            <w:r>
+              <w:rPr>
+                <w:lang w:val="en-GB"/>
+              </w:rPr>
+              <w:t>TaskSupervisoreService</w:t>
+            </w:r>
+            <w:proofErr w:type="spellEnd"/>
+            <w:r>
+              <w:rPr>
+                <w:lang w:val="en-GB"/>
+              </w:rPr>
+              <w:t>::</w:t>
+            </w:r>
+            <w:proofErr w:type="gramEnd"/>
+            <w:r>
+              <w:rPr>
+                <w:lang w:val="en-GB"/>
+              </w:rPr>
+              <w:t xml:space="preserve"> </w:t>
             </w:r>
             <w:proofErr w:type="spellStart"/>
             <w:r>
@@ -13309,7 +13975,21 @@
               <w:rPr>
                 <w:lang w:val="en-GB"/>
               </w:rPr>
-              <w:t xml:space="preserve"> = View::Task(</w:t>
+              <w:t xml:space="preserve"> = </w:t>
+            </w:r>
+            <w:proofErr w:type="gramStart"/>
+            <w:r>
+              <w:rPr>
+                <w:lang w:val="en-GB"/>
+              </w:rPr>
+              <w:t>View::</w:t>
+            </w:r>
+            <w:proofErr w:type="gramEnd"/>
+            <w:r>
+              <w:rPr>
+                <w:lang w:val="en-GB"/>
+              </w:rPr>
+              <w:t>Task(</w:t>
             </w:r>
             <w:proofErr w:type="spellStart"/>
             <w:r>
@@ -13390,7 +14070,14 @@
               <w:rPr>
                 <w:lang w:val="en-GB"/>
               </w:rPr>
-              <w:t>Context:TaskSupervisoreService</w:t>
+              <w:t>Context:</w:t>
+            </w:r>
+            <w:proofErr w:type="gramStart"/>
+            <w:r>
+              <w:rPr>
+                <w:lang w:val="en-GB"/>
+              </w:rPr>
+              <w:t>TaskSupervisoreService</w:t>
             </w:r>
             <w:proofErr w:type="spellEnd"/>
             <w:r>
@@ -13400,6 +14087,7 @@
               <w:t>::</w:t>
             </w:r>
             <w:proofErr w:type="spellStart"/>
+            <w:proofErr w:type="gramEnd"/>
             <w:r>
               <w:rPr>
                 <w:lang w:val="en-GB"/>
@@ -13570,7 +14258,21 @@
               <w:rPr>
                 <w:lang w:val="en-GB"/>
               </w:rPr>
-              <w:t xml:space="preserve"> = View::Homepage</w:t>
+              <w:t xml:space="preserve"> = </w:t>
+            </w:r>
+            <w:proofErr w:type="gramStart"/>
+            <w:r>
+              <w:rPr>
+                <w:lang w:val="en-GB"/>
+              </w:rPr>
+              <w:t>View::</w:t>
+            </w:r>
+            <w:proofErr w:type="gramEnd"/>
+            <w:r>
+              <w:rPr>
+                <w:lang w:val="en-GB"/>
+              </w:rPr>
+              <w:t>Homepage</w:t>
             </w:r>
           </w:p>
         </w:tc>
@@ -13718,14 +14420,28 @@
               <w:rPr>
                 <w:lang w:val="en-GB"/>
               </w:rPr>
-              <w:t>Context:TaskSupervisoreService</w:t>
-            </w:r>
-            <w:proofErr w:type="spellEnd"/>
-            <w:r>
-              <w:rPr>
-                <w:lang w:val="en-GB"/>
-              </w:rPr>
-              <w:t xml:space="preserve">:: </w:t>
+              <w:t>Context:</w:t>
+            </w:r>
+            <w:proofErr w:type="gramStart"/>
+            <w:r>
+              <w:rPr>
+                <w:lang w:val="en-GB"/>
+              </w:rPr>
+              <w:t>TaskSupervisoreService</w:t>
+            </w:r>
+            <w:proofErr w:type="spellEnd"/>
+            <w:r>
+              <w:rPr>
+                <w:lang w:val="en-GB"/>
+              </w:rPr>
+              <w:t>::</w:t>
+            </w:r>
+            <w:proofErr w:type="gramEnd"/>
+            <w:r>
+              <w:rPr>
+                <w:lang w:val="en-GB"/>
+              </w:rPr>
+              <w:t xml:space="preserve"> </w:t>
             </w:r>
             <w:proofErr w:type="spellStart"/>
             <w:r>
@@ -13828,12 +14544,17 @@
               <w:t xml:space="preserve"> = </w:t>
             </w:r>
             <w:proofErr w:type="spellStart"/>
+            <w:proofErr w:type="gramStart"/>
             <w:r>
               <w:t>role</w:t>
             </w:r>
             <w:proofErr w:type="spellEnd"/>
             <w:r>
-              <w:t>::Supervisore</w:t>
+              <w:t>::</w:t>
+            </w:r>
+            <w:proofErr w:type="gramEnd"/>
+            <w:r>
+              <w:t>Supervisore</w:t>
             </w:r>
           </w:p>
           <w:p>
@@ -13846,7 +14567,15 @@
             </w:r>
             <w:proofErr w:type="spellEnd"/>
             <w:r>
-              <w:t xml:space="preserve"> = View::Task(</w:t>
+              <w:t xml:space="preserve"> = </w:t>
+            </w:r>
+            <w:proofErr w:type="gramStart"/>
+            <w:r>
+              <w:t>View::</w:t>
+            </w:r>
+            <w:proofErr w:type="gramEnd"/>
+            <w:r>
+              <w:t>Task(</w:t>
             </w:r>
             <w:proofErr w:type="spellStart"/>
             <w:r>
@@ -13886,14 +14615,28 @@
               <w:rPr>
                 <w:lang w:val="en-GB"/>
               </w:rPr>
-              <w:t>Context:TaskSupervisoreService</w:t>
-            </w:r>
-            <w:proofErr w:type="spellEnd"/>
-            <w:r>
-              <w:rPr>
-                <w:lang w:val="en-GB"/>
-              </w:rPr>
-              <w:t xml:space="preserve">:: </w:t>
+              <w:t>Context:</w:t>
+            </w:r>
+            <w:proofErr w:type="gramStart"/>
+            <w:r>
+              <w:rPr>
+                <w:lang w:val="en-GB"/>
+              </w:rPr>
+              <w:t>TaskSupervisoreService</w:t>
+            </w:r>
+            <w:proofErr w:type="spellEnd"/>
+            <w:r>
+              <w:rPr>
+                <w:lang w:val="en-GB"/>
+              </w:rPr>
+              <w:t>::</w:t>
+            </w:r>
+            <w:proofErr w:type="gramEnd"/>
+            <w:r>
+              <w:rPr>
+                <w:lang w:val="en-GB"/>
+              </w:rPr>
+              <w:t xml:space="preserve"> </w:t>
             </w:r>
             <w:proofErr w:type="spellStart"/>
             <w:r>
@@ -14181,7 +14924,21 @@
               <w:rPr>
                 <w:u w:val="single"/>
               </w:rPr>
-              <w:t xml:space="preserve"> = View::Task(</w:t>
+              <w:t xml:space="preserve"> = </w:t>
+            </w:r>
+            <w:proofErr w:type="gramStart"/>
+            <w:r>
+              <w:rPr>
+                <w:u w:val="single"/>
+              </w:rPr>
+              <w:t>View::</w:t>
+            </w:r>
+            <w:proofErr w:type="gramEnd"/>
+            <w:r>
+              <w:rPr>
+                <w:u w:val="single"/>
+              </w:rPr>
+              <w:t>Task(</w:t>
             </w:r>
             <w:proofErr w:type="spellStart"/>
             <w:r>
@@ -14607,13 +15364,18 @@
           <w:p>
             <w:proofErr w:type="spellStart"/>
             <w:r>
-              <w:t>Context:TaskDipendenteService</w:t>
+              <w:t>Context:</w:t>
+            </w:r>
+            <w:proofErr w:type="gramStart"/>
+            <w:r>
+              <w:t>TaskDipendenteService</w:t>
             </w:r>
             <w:proofErr w:type="spellEnd"/>
             <w:r>
               <w:t>::</w:t>
             </w:r>
             <w:proofErr w:type="spellStart"/>
+            <w:proofErr w:type="gramEnd"/>
             <w:r>
               <w:t>inizializzaTask</w:t>
             </w:r>
@@ -14690,12 +15452,17 @@
               <w:t xml:space="preserve"> = </w:t>
             </w:r>
             <w:proofErr w:type="spellStart"/>
+            <w:proofErr w:type="gramStart"/>
             <w:r>
               <w:t>role</w:t>
             </w:r>
             <w:proofErr w:type="spellEnd"/>
             <w:r>
-              <w:t>::Dipendente and</w:t>
+              <w:t>::</w:t>
+            </w:r>
+            <w:proofErr w:type="gramEnd"/>
+            <w:r>
+              <w:t>Dipendente and</w:t>
             </w:r>
           </w:p>
           <w:p>
@@ -14799,9 +15566,17 @@
               <w:rPr>
                 <w:lang w:val="en-GB"/>
               </w:rPr>
-              <w:t>).status = status::</w:t>
-            </w:r>
-            <w:proofErr w:type="spellStart"/>
+              <w:t xml:space="preserve">).status = </w:t>
+            </w:r>
+            <w:proofErr w:type="gramStart"/>
+            <w:r>
+              <w:rPr>
+                <w:lang w:val="en-GB"/>
+              </w:rPr>
+              <w:t>status::</w:t>
+            </w:r>
+            <w:proofErr w:type="spellStart"/>
+            <w:proofErr w:type="gramEnd"/>
             <w:r>
               <w:rPr>
                 <w:lang w:val="en-GB"/>
@@ -14826,7 +15601,15 @@
             </w:r>
             <w:proofErr w:type="spellEnd"/>
             <w:r>
-              <w:t xml:space="preserve"> = View::Task(</w:t>
+              <w:t xml:space="preserve"> = </w:t>
+            </w:r>
+            <w:proofErr w:type="gramStart"/>
+            <w:r>
+              <w:t>View::</w:t>
+            </w:r>
+            <w:proofErr w:type="gramEnd"/>
+            <w:r>
+              <w:t>Task(</w:t>
             </w:r>
             <w:proofErr w:type="spellStart"/>
             <w:r>
@@ -14858,13 +15641,18 @@
           <w:p>
             <w:proofErr w:type="spellStart"/>
             <w:r>
-              <w:t>Context:TaskDipendenteService</w:t>
+              <w:t>Context:</w:t>
+            </w:r>
+            <w:proofErr w:type="gramStart"/>
+            <w:r>
+              <w:t>TaskDipendenteService</w:t>
             </w:r>
             <w:proofErr w:type="spellEnd"/>
             <w:r>
               <w:t>::</w:t>
             </w:r>
             <w:proofErr w:type="spellStart"/>
+            <w:proofErr w:type="gramEnd"/>
             <w:r>
               <w:t>inizializzaTask</w:t>
             </w:r>
@@ -14976,9 +15764,17 @@
               <w:rPr>
                 <w:lang w:val="en-GB"/>
               </w:rPr>
-              <w:t>).status = status::</w:t>
-            </w:r>
-            <w:proofErr w:type="spellStart"/>
+              <w:t xml:space="preserve">).status = </w:t>
+            </w:r>
+            <w:proofErr w:type="gramStart"/>
+            <w:r>
+              <w:rPr>
+                <w:lang w:val="en-GB"/>
+              </w:rPr>
+              <w:t>status::</w:t>
+            </w:r>
+            <w:proofErr w:type="spellStart"/>
+            <w:proofErr w:type="gramEnd"/>
             <w:r>
               <w:rPr>
                 <w:lang w:val="en-GB"/>
@@ -15111,7 +15907,14 @@
               <w:rPr>
                 <w:lang w:val="en-GB"/>
               </w:rPr>
-              <w:t>Context:TaskDipendenteService</w:t>
+              <w:t>Context:</w:t>
+            </w:r>
+            <w:proofErr w:type="gramStart"/>
+            <w:r>
+              <w:rPr>
+                <w:lang w:val="en-GB"/>
+              </w:rPr>
+              <w:t>TaskDipendenteService</w:t>
             </w:r>
             <w:proofErr w:type="spellEnd"/>
             <w:r>
@@ -15121,6 +15924,7 @@
               <w:t>::</w:t>
             </w:r>
             <w:proofErr w:type="spellStart"/>
+            <w:proofErr w:type="gramEnd"/>
             <w:r>
               <w:rPr>
                 <w:lang w:val="en-GB"/>
@@ -15207,12 +16011,17 @@
               <w:t xml:space="preserve"> = </w:t>
             </w:r>
             <w:proofErr w:type="spellStart"/>
+            <w:proofErr w:type="gramStart"/>
             <w:r>
               <w:t>role</w:t>
             </w:r>
             <w:proofErr w:type="spellEnd"/>
             <w:r>
-              <w:t>::Dipendente and</w:t>
+              <w:t>::</w:t>
+            </w:r>
+            <w:proofErr w:type="gramEnd"/>
+            <w:r>
+              <w:t>Dipendente and</w:t>
             </w:r>
           </w:p>
           <w:p>
@@ -15317,9 +16126,17 @@
               <w:rPr>
                 <w:lang w:val="en-GB"/>
               </w:rPr>
-              <w:t>).status = status::</w:t>
-            </w:r>
-            <w:proofErr w:type="spellStart"/>
+              <w:t xml:space="preserve">).status = </w:t>
+            </w:r>
+            <w:proofErr w:type="gramStart"/>
+            <w:r>
+              <w:rPr>
+                <w:lang w:val="en-GB"/>
+              </w:rPr>
+              <w:t>status::</w:t>
+            </w:r>
+            <w:proofErr w:type="spellStart"/>
+            <w:proofErr w:type="gramEnd"/>
             <w:r>
               <w:rPr>
                 <w:lang w:val="en-GB"/>
@@ -15344,7 +16161,15 @@
             </w:r>
             <w:proofErr w:type="spellEnd"/>
             <w:r>
-              <w:t xml:space="preserve"> = View::Task(</w:t>
+              <w:t xml:space="preserve"> = </w:t>
+            </w:r>
+            <w:proofErr w:type="gramStart"/>
+            <w:r>
+              <w:t>View::</w:t>
+            </w:r>
+            <w:proofErr w:type="gramEnd"/>
+            <w:r>
+              <w:t>Task(</w:t>
             </w:r>
             <w:proofErr w:type="spellStart"/>
             <w:r>
@@ -15385,7 +16210,14 @@
               <w:rPr>
                 <w:lang w:val="en-GB"/>
               </w:rPr>
-              <w:t>Context:TaskDipendenteService</w:t>
+              <w:t>Context:</w:t>
+            </w:r>
+            <w:proofErr w:type="gramStart"/>
+            <w:r>
+              <w:rPr>
+                <w:lang w:val="en-GB"/>
+              </w:rPr>
+              <w:t>TaskDipendenteService</w:t>
             </w:r>
             <w:proofErr w:type="spellEnd"/>
             <w:r>
@@ -15395,6 +16227,7 @@
               <w:t>::</w:t>
             </w:r>
             <w:proofErr w:type="spellStart"/>
+            <w:proofErr w:type="gramEnd"/>
             <w:r>
               <w:rPr>
                 <w:lang w:val="en-GB"/>
@@ -15516,9 +16349,17 @@
               <w:rPr>
                 <w:lang w:val="en-GB"/>
               </w:rPr>
-              <w:t>).status = status::</w:t>
-            </w:r>
-            <w:proofErr w:type="spellStart"/>
+              <w:t xml:space="preserve">).status = </w:t>
+            </w:r>
+            <w:proofErr w:type="gramStart"/>
+            <w:r>
+              <w:rPr>
+                <w:lang w:val="en-GB"/>
+              </w:rPr>
+              <w:t>status::</w:t>
+            </w:r>
+            <w:proofErr w:type="spellStart"/>
+            <w:proofErr w:type="gramEnd"/>
             <w:r>
               <w:rPr>
                 <w:lang w:val="en-GB"/>
@@ -16053,6 +16894,7 @@
                 <w:lang w:val="en-GB"/>
               </w:rPr>
             </w:pPr>
+            <w:proofErr w:type="gramStart"/>
             <w:r>
               <w:rPr>
                 <w:lang w:val="en-GB"/>
@@ -16060,6 +16902,7 @@
               <w:t>Context::</w:t>
             </w:r>
             <w:proofErr w:type="spellStart"/>
+            <w:proofErr w:type="gramEnd"/>
             <w:r>
               <w:rPr>
                 <w:lang w:val="en-GB"/>
@@ -16152,6 +16995,7 @@
               </w:rPr>
             </w:pPr>
             <w:proofErr w:type="spellStart"/>
+            <w:proofErr w:type="gramStart"/>
             <w:r>
               <w:rPr>
                 <w:lang w:val="en-GB"/>
@@ -16166,6 +17010,7 @@
               <w:t>::</w:t>
             </w:r>
             <w:proofErr w:type="spellStart"/>
+            <w:proofErr w:type="gramEnd"/>
             <w:r>
               <w:rPr>
                 <w:lang w:val="en-GB"/>
@@ -16388,6 +17233,7 @@
                 <w:lang w:val="en-GB"/>
               </w:rPr>
             </w:pPr>
+            <w:proofErr w:type="gramStart"/>
             <w:r>
               <w:rPr>
                 <w:lang w:val="en-GB"/>
@@ -16395,6 +17241,7 @@
               <w:t>Context::</w:t>
             </w:r>
             <w:proofErr w:type="spellStart"/>
+            <w:proofErr w:type="gramEnd"/>
             <w:r>
               <w:rPr>
                 <w:lang w:val="en-GB"/>
@@ -16975,6 +17822,7 @@
               <w:t xml:space="preserve">Context </w:t>
             </w:r>
             <w:proofErr w:type="spellStart"/>
+            <w:proofErr w:type="gramStart"/>
             <w:r>
               <w:rPr>
                 <w:lang w:val="en-GB"/>
@@ -16989,6 +17837,7 @@
               <w:t>::</w:t>
             </w:r>
             <w:proofErr w:type="spellStart"/>
+            <w:proofErr w:type="gramEnd"/>
             <w:r>
               <w:rPr>
                 <w:lang w:val="en-GB"/>
@@ -17223,6 +18072,7 @@
               <w:t xml:space="preserve">Context </w:t>
             </w:r>
             <w:proofErr w:type="spellStart"/>
+            <w:proofErr w:type="gramStart"/>
             <w:r>
               <w:rPr>
                 <w:lang w:val="en-GB"/>
@@ -17237,6 +18087,7 @@
               <w:t>::</w:t>
             </w:r>
             <w:proofErr w:type="spellStart"/>
+            <w:proofErr w:type="gramEnd"/>
             <w:r>
               <w:rPr>
                 <w:lang w:val="en-GB"/>
@@ -17476,6 +18327,7 @@
               <w:t xml:space="preserve">Context </w:t>
             </w:r>
             <w:proofErr w:type="spellStart"/>
+            <w:proofErr w:type="gramStart"/>
             <w:r>
               <w:rPr>
                 <w:lang w:val="en-GB"/>
@@ -17490,6 +18342,7 @@
               <w:t>::</w:t>
             </w:r>
             <w:proofErr w:type="spellStart"/>
+            <w:proofErr w:type="gramEnd"/>
             <w:r>
               <w:rPr>
                 <w:lang w:val="en-GB"/>
@@ -17698,353 +18551,315 @@
           <w:p>
             <w:pPr>
               <w:spacing w:after="160" w:line="259" w:lineRule="auto"/>
-              <w:rPr>
-                <w:lang w:val="en-GB"/>
-              </w:rPr>
-            </w:pPr>
-            <w:r>
-              <w:rPr>
-                <w:lang w:val="en-GB"/>
-              </w:rPr>
+            </w:pPr>
+            <w:r>
               <w:t xml:space="preserve">+ </w:t>
             </w:r>
             <w:proofErr w:type="spellStart"/>
             <w:r>
-              <w:rPr>
-                <w:lang w:val="en-GB"/>
-              </w:rPr>
               <w:t>create</w:t>
             </w:r>
             <w:r>
-              <w:rPr>
-                <w:lang w:val="en-GB"/>
-              </w:rPr>
               <w:t>Utente</w:t>
             </w:r>
             <w:proofErr w:type="spellEnd"/>
             <w:r>
-              <w:rPr>
-                <w:lang w:val="en-GB"/>
-              </w:rPr>
               <w:t>(</w:t>
             </w:r>
             <w:proofErr w:type="spellStart"/>
             <w:r>
-              <w:rPr>
-                <w:lang w:val="en-GB"/>
-              </w:rPr>
               <w:t>utente:Utente</w:t>
             </w:r>
             <w:proofErr w:type="spellEnd"/>
             <w:r>
-              <w:rPr>
-                <w:lang w:val="en-GB"/>
-              </w:rPr>
               <w:t xml:space="preserve">, </w:t>
             </w:r>
             <w:proofErr w:type="spellStart"/>
             <w:r>
-              <w:rPr>
-                <w:lang w:val="en-GB"/>
-              </w:rPr>
               <w:t>password:String</w:t>
             </w:r>
             <w:proofErr w:type="spellEnd"/>
             <w:r>
-              <w:rPr>
-                <w:lang w:val="en-GB"/>
-              </w:rPr>
-              <w:t xml:space="preserve">) : void </w:t>
+              <w:t xml:space="preserve">) : </w:t>
+            </w:r>
+            <w:proofErr w:type="spellStart"/>
+            <w:r>
+              <w:t>void</w:t>
+            </w:r>
+            <w:proofErr w:type="spellEnd"/>
+            <w:r>
+              <w:t xml:space="preserve"> </w:t>
             </w:r>
           </w:p>
           <w:p>
             <w:pPr>
               <w:spacing w:after="160" w:line="259" w:lineRule="auto"/>
-              <w:rPr>
-                <w:lang w:val="en-GB"/>
-              </w:rPr>
-            </w:pPr>
-            <w:r>
-              <w:rPr>
-                <w:lang w:val="en-GB"/>
-              </w:rPr>
+            </w:pPr>
+            <w:r>
               <w:t xml:space="preserve">+ </w:t>
             </w:r>
             <w:proofErr w:type="spellStart"/>
             <w:r>
-              <w:rPr>
-                <w:lang w:val="en-GB"/>
-              </w:rPr>
-              <w:t>cr</w:t>
-            </w:r>
-            <w:r>
-              <w:rPr>
-                <w:lang w:val="en-GB"/>
-              </w:rPr>
-              <w:t>eateDipendente</w:t>
-            </w:r>
-            <w:proofErr w:type="spellEnd"/>
-            <w:r>
-              <w:rPr>
-                <w:lang w:val="en-GB"/>
-              </w:rPr>
+              <w:t>createDipendente</w:t>
+            </w:r>
+            <w:proofErr w:type="spellEnd"/>
+            <w:r>
               <w:t>(</w:t>
             </w:r>
             <w:proofErr w:type="spellStart"/>
             <w:r>
-              <w:rPr>
-                <w:lang w:val="en-GB"/>
-              </w:rPr>
               <w:t>dipendente:Dipendente</w:t>
             </w:r>
             <w:proofErr w:type="spellEnd"/>
             <w:r>
-              <w:rPr>
-                <w:lang w:val="en-GB"/>
-              </w:rPr>
               <w:t xml:space="preserve">, </w:t>
             </w:r>
             <w:proofErr w:type="spellStart"/>
             <w:r>
-              <w:rPr>
-                <w:lang w:val="en-GB"/>
-              </w:rPr>
               <w:t>password:String</w:t>
             </w:r>
             <w:proofErr w:type="spellEnd"/>
             <w:r>
-              <w:rPr>
-                <w:lang w:val="en-GB"/>
-              </w:rPr>
-              <w:t xml:space="preserve">) : void </w:t>
+              <w:t xml:space="preserve">) : </w:t>
+            </w:r>
+            <w:proofErr w:type="spellStart"/>
+            <w:r>
+              <w:t>void</w:t>
+            </w:r>
+            <w:proofErr w:type="spellEnd"/>
+            <w:r>
+              <w:t xml:space="preserve"> </w:t>
             </w:r>
           </w:p>
           <w:p>
             <w:pPr>
               <w:spacing w:after="160" w:line="259" w:lineRule="auto"/>
-              <w:rPr>
-                <w:lang w:val="en-GB"/>
-              </w:rPr>
-            </w:pPr>
-            <w:r>
-              <w:rPr>
-                <w:lang w:val="en-GB"/>
-              </w:rPr>
+            </w:pPr>
+            <w:r>
               <w:t xml:space="preserve">+ </w:t>
             </w:r>
             <w:proofErr w:type="spellStart"/>
             <w:r>
-              <w:rPr>
-                <w:lang w:val="en-GB"/>
-              </w:rPr>
               <w:t>createSupervisore</w:t>
             </w:r>
             <w:proofErr w:type="spellEnd"/>
             <w:r>
-              <w:rPr>
-                <w:lang w:val="en-GB"/>
-              </w:rPr>
               <w:t>(</w:t>
             </w:r>
             <w:proofErr w:type="spellStart"/>
             <w:r>
-              <w:rPr>
-                <w:lang w:val="en-GB"/>
-              </w:rPr>
               <w:t>supervisore:Supervisore</w:t>
             </w:r>
             <w:proofErr w:type="spellEnd"/>
             <w:r>
-              <w:rPr>
-                <w:lang w:val="en-GB"/>
-              </w:rPr>
               <w:t xml:space="preserve">, </w:t>
             </w:r>
             <w:proofErr w:type="spellStart"/>
             <w:r>
-              <w:rPr>
-                <w:lang w:val="en-GB"/>
-              </w:rPr>
               <w:t>password:String</w:t>
             </w:r>
             <w:proofErr w:type="spellEnd"/>
             <w:r>
+              <w:t xml:space="preserve">) : </w:t>
+            </w:r>
+            <w:proofErr w:type="spellStart"/>
+            <w:r>
+              <w:t>void</w:t>
+            </w:r>
+            <w:proofErr w:type="spellEnd"/>
+          </w:p>
+          <w:p>
+            <w:pPr>
+              <w:spacing w:after="160" w:line="259" w:lineRule="auto"/>
+            </w:pPr>
+            <w:r>
+              <w:t xml:space="preserve">+ </w:t>
+            </w:r>
+            <w:proofErr w:type="spellStart"/>
+            <w:r>
+              <w:t>findB</w:t>
+            </w:r>
+            <w:r>
+              <w:t>yMatricola</w:t>
+            </w:r>
+            <w:proofErr w:type="spellEnd"/>
+            <w:r>
+              <w:t>(</w:t>
+            </w:r>
+            <w:proofErr w:type="spellStart"/>
+            <w:r>
+              <w:t>matricola</w:t>
+            </w:r>
+            <w:r>
+              <w:t>:String</w:t>
+            </w:r>
+            <w:proofErr w:type="spellEnd"/>
+            <w:r>
+              <w:t>) : Utente</w:t>
+            </w:r>
+          </w:p>
+          <w:p>
+            <w:pPr>
+              <w:spacing w:after="160" w:line="259" w:lineRule="auto"/>
+            </w:pPr>
+            <w:r>
+              <w:t xml:space="preserve">+ </w:t>
+            </w:r>
+            <w:proofErr w:type="spellStart"/>
+            <w:r>
+              <w:t>getAllDipendentiInfo</w:t>
+            </w:r>
+            <w:proofErr w:type="spellEnd"/>
+            <w:r>
+              <w:t>(</w:t>
+            </w:r>
+            <w:proofErr w:type="spellStart"/>
+            <w:r>
+              <w:t>matricola:String</w:t>
+            </w:r>
+            <w:proofErr w:type="spellEnd"/>
+            <w:r>
+              <w:t xml:space="preserve">) : </w:t>
+            </w:r>
+            <w:proofErr w:type="spellStart"/>
+            <w:r>
+              <w:t>Informazioni:List</w:t>
+            </w:r>
+            <w:proofErr w:type="spellEnd"/>
+          </w:p>
+          <w:p>
+            <w:pPr>
+              <w:spacing w:after="160" w:line="259" w:lineRule="auto"/>
+            </w:pPr>
+            <w:r>
+              <w:t xml:space="preserve">+ </w:t>
+            </w:r>
+            <w:proofErr w:type="spellStart"/>
+            <w:r>
+              <w:t>getSupervisoreInfo</w:t>
+            </w:r>
+            <w:proofErr w:type="spellEnd"/>
+            <w:r>
+              <w:t>(</w:t>
+            </w:r>
+            <w:proofErr w:type="spellStart"/>
+            <w:r>
+              <w:t>matricola:String</w:t>
+            </w:r>
+            <w:proofErr w:type="spellEnd"/>
+            <w:r>
+              <w:t>) : Informazioni</w:t>
+            </w:r>
+          </w:p>
+          <w:p>
+            <w:pPr>
+              <w:spacing w:after="160" w:line="259" w:lineRule="auto"/>
+            </w:pPr>
+            <w:r>
+              <w:t xml:space="preserve">+ </w:t>
+            </w:r>
+            <w:proofErr w:type="spellStart"/>
+            <w:r>
+              <w:t>updateRuolo</w:t>
+            </w:r>
+            <w:proofErr w:type="spellEnd"/>
+            <w:r>
+              <w:t>(</w:t>
+            </w:r>
+            <w:proofErr w:type="spellStart"/>
+            <w:r>
+              <w:t>matricola:String</w:t>
+            </w:r>
+            <w:proofErr w:type="spellEnd"/>
+            <w:r>
+              <w:t xml:space="preserve">, </w:t>
+            </w:r>
+            <w:proofErr w:type="spellStart"/>
+            <w:r>
+              <w:t>nuovoRuolo:enum</w:t>
+            </w:r>
+            <w:proofErr w:type="spellEnd"/>
+            <w:r>
+              <w:t xml:space="preserve">, </w:t>
+            </w:r>
+            <w:proofErr w:type="spellStart"/>
+            <w:r>
+              <w:t>matricolaNuovoSup:String</w:t>
+            </w:r>
+            <w:proofErr w:type="spellEnd"/>
+            <w:r>
+              <w:t>) :</w:t>
+            </w:r>
+            <w:proofErr w:type="spellStart"/>
+            <w:r>
+              <w:t>void</w:t>
+            </w:r>
+            <w:proofErr w:type="spellEnd"/>
+            <w:r>
+              <w:t xml:space="preserve"> </w:t>
+            </w:r>
+          </w:p>
+          <w:p>
+            <w:pPr>
+              <w:spacing w:after="160" w:line="259" w:lineRule="auto"/>
+              <w:rPr>
+                <w:lang w:val="en-GB"/>
+              </w:rPr>
+            </w:pPr>
+            <w:r>
+              <w:rPr>
+                <w:lang w:val="en-GB"/>
+              </w:rPr>
+              <w:t xml:space="preserve">+ </w:t>
+            </w:r>
+            <w:proofErr w:type="spellStart"/>
+            <w:r>
+              <w:rPr>
+                <w:lang w:val="en-GB"/>
+              </w:rPr>
+              <w:t>update</w:t>
+            </w:r>
+            <w:r>
+              <w:rPr>
+                <w:lang w:val="en-GB"/>
+              </w:rPr>
+              <w:t>Supervisore</w:t>
+            </w:r>
+            <w:proofErr w:type="spellEnd"/>
+            <w:r>
+              <w:rPr>
+                <w:lang w:val="en-GB"/>
+              </w:rPr>
+              <w:t>(</w:t>
+            </w:r>
+            <w:proofErr w:type="spellStart"/>
+            <w:r>
+              <w:rPr>
+                <w:lang w:val="en-GB"/>
+              </w:rPr>
+              <w:t>matricola:String</w:t>
+            </w:r>
+            <w:proofErr w:type="spellEnd"/>
+            <w:r>
+              <w:rPr>
+                <w:lang w:val="en-GB"/>
+              </w:rPr>
+              <w:t xml:space="preserve">, </w:t>
+            </w:r>
+            <w:proofErr w:type="spellStart"/>
+            <w:r>
+              <w:rPr>
+                <w:lang w:val="en-GB"/>
+              </w:rPr>
+              <w:t>matricolaSup:String</w:t>
+            </w:r>
+            <w:proofErr w:type="spellEnd"/>
+            <w:r>
               <w:rPr>
                 <w:lang w:val="en-GB"/>
               </w:rPr>
               <w:t>) : void</w:t>
             </w:r>
-          </w:p>
-          <w:p>
-            <w:pPr>
-              <w:spacing w:after="160" w:line="259" w:lineRule="auto"/>
-            </w:pPr>
-            <w:r>
-              <w:t xml:space="preserve">+ </w:t>
-            </w:r>
-            <w:proofErr w:type="spellStart"/>
-            <w:r>
-              <w:t>findB</w:t>
-            </w:r>
-            <w:r>
-              <w:t>yMatricola</w:t>
-            </w:r>
-            <w:proofErr w:type="spellEnd"/>
-            <w:r>
-              <w:t>(</w:t>
-            </w:r>
-            <w:proofErr w:type="spellStart"/>
-            <w:r>
-              <w:t>matricola</w:t>
-            </w:r>
-            <w:r>
-              <w:t>:String</w:t>
-            </w:r>
-            <w:proofErr w:type="spellEnd"/>
-            <w:r>
-              <w:t>) : Utente</w:t>
-            </w:r>
-          </w:p>
-          <w:p>
-            <w:pPr>
-              <w:spacing w:after="160" w:line="259" w:lineRule="auto"/>
-            </w:pPr>
-            <w:r>
-              <w:t xml:space="preserve">+ </w:t>
-            </w:r>
-            <w:proofErr w:type="spellStart"/>
-            <w:r>
-              <w:t>getAllDipendentiInfo</w:t>
-            </w:r>
-            <w:proofErr w:type="spellEnd"/>
-            <w:r>
-              <w:t>(</w:t>
-            </w:r>
-            <w:proofErr w:type="spellStart"/>
-            <w:r>
-              <w:t>matricola:String</w:t>
-            </w:r>
-            <w:proofErr w:type="spellEnd"/>
-            <w:r>
-              <w:t xml:space="preserve">) : </w:t>
-            </w:r>
-            <w:proofErr w:type="spellStart"/>
-            <w:r>
-              <w:t>Informazioni:List</w:t>
-            </w:r>
-            <w:proofErr w:type="spellEnd"/>
-          </w:p>
-          <w:p>
-            <w:pPr>
-              <w:spacing w:after="160" w:line="259" w:lineRule="auto"/>
-            </w:pPr>
-            <w:r>
-              <w:t xml:space="preserve">+ </w:t>
-            </w:r>
-            <w:proofErr w:type="spellStart"/>
-            <w:r>
-              <w:t>getSupervisoreInfo</w:t>
-            </w:r>
-            <w:proofErr w:type="spellEnd"/>
-            <w:r>
-              <w:t>(</w:t>
-            </w:r>
-            <w:proofErr w:type="spellStart"/>
-            <w:r>
-              <w:t>matricola:String</w:t>
-            </w:r>
-            <w:proofErr w:type="spellEnd"/>
-            <w:r>
-              <w:t>) : Informazioni</w:t>
-            </w:r>
-          </w:p>
-          <w:p>
-            <w:pPr>
-              <w:spacing w:after="160" w:line="259" w:lineRule="auto"/>
-            </w:pPr>
-            <w:r>
-              <w:t xml:space="preserve">+ </w:t>
-            </w:r>
-            <w:proofErr w:type="spellStart"/>
-            <w:r>
-              <w:t>updateRuolo</w:t>
-            </w:r>
-            <w:proofErr w:type="spellEnd"/>
-            <w:r>
-              <w:t>(</w:t>
-            </w:r>
-            <w:proofErr w:type="spellStart"/>
-            <w:r>
-              <w:t>matricola:String</w:t>
-            </w:r>
-            <w:proofErr w:type="spellEnd"/>
-            <w:r>
-              <w:t xml:space="preserve">, </w:t>
-            </w:r>
-            <w:proofErr w:type="spellStart"/>
-            <w:r>
-              <w:t>nuovoRuolo:enum</w:t>
-            </w:r>
-            <w:proofErr w:type="spellEnd"/>
-            <w:r>
-              <w:t xml:space="preserve">, </w:t>
-            </w:r>
-            <w:proofErr w:type="spellStart"/>
-            <w:r>
-              <w:t>matricolaNuovoSup:String</w:t>
-            </w:r>
-            <w:proofErr w:type="spellEnd"/>
-            <w:r>
-              <w:t>) :</w:t>
-            </w:r>
-            <w:proofErr w:type="spellStart"/>
-            <w:r>
-              <w:t>void</w:t>
-            </w:r>
-            <w:proofErr w:type="spellEnd"/>
-            <w:r>
-              <w:t xml:space="preserve"> </w:t>
-            </w:r>
-          </w:p>
-          <w:p>
-            <w:pPr>
-              <w:spacing w:after="160" w:line="259" w:lineRule="auto"/>
-            </w:pPr>
-            <w:r>
-              <w:t xml:space="preserve">+ </w:t>
-            </w:r>
-            <w:proofErr w:type="spellStart"/>
-            <w:r>
-              <w:t>update</w:t>
-            </w:r>
-            <w:r>
-              <w:t>Supervisore</w:t>
-            </w:r>
-            <w:proofErr w:type="spellEnd"/>
-            <w:r>
-              <w:t>(</w:t>
-            </w:r>
-            <w:proofErr w:type="spellStart"/>
-            <w:r>
-              <w:t>matricola:String</w:t>
-            </w:r>
-            <w:proofErr w:type="spellEnd"/>
-            <w:r>
-              <w:t xml:space="preserve">, </w:t>
-            </w:r>
-            <w:proofErr w:type="spellStart"/>
-            <w:r>
-              <w:t>matricolaSup:String</w:t>
-            </w:r>
-            <w:proofErr w:type="spellEnd"/>
-            <w:r>
-              <w:t xml:space="preserve">) : </w:t>
-            </w:r>
-            <w:proofErr w:type="spellStart"/>
-            <w:r>
-              <w:t>void</w:t>
-            </w:r>
-            <w:proofErr w:type="spellEnd"/>
           </w:p>
           <w:p>
             <w:pPr>
@@ -18314,6 +19129,7 @@
               <w:t xml:space="preserve"> </w:t>
             </w:r>
             <w:proofErr w:type="spellStart"/>
+            <w:proofErr w:type="gramStart"/>
             <w:r>
               <w:t>UtenteDAO</w:t>
             </w:r>
@@ -18322,6 +19138,7 @@
               <w:t>::</w:t>
             </w:r>
             <w:proofErr w:type="spellStart"/>
+            <w:proofErr w:type="gramEnd"/>
             <w:r>
               <w:t>create</w:t>
             </w:r>
@@ -18349,9 +19166,6 @@
               </w:rPr>
             </w:pPr>
             <w:r>
-              <w:rPr>
-                <w:lang w:val="en-GB"/>
-              </w:rPr>
               <w:t xml:space="preserve"> </w:t>
             </w:r>
             <w:proofErr w:type="spellStart"/>
@@ -18402,6 +19216,7 @@
               <w:t xml:space="preserve"> </w:t>
             </w:r>
             <w:proofErr w:type="spellStart"/>
+            <w:proofErr w:type="gramStart"/>
             <w:r>
               <w:t>UtenteDAO</w:t>
             </w:r>
@@ -18410,6 +19225,7 @@
               <w:t>::</w:t>
             </w:r>
             <w:proofErr w:type="spellStart"/>
+            <w:proofErr w:type="gramEnd"/>
             <w:r>
               <w:t>create</w:t>
             </w:r>
@@ -18619,6 +19435,7 @@
               <w:t xml:space="preserve"> </w:t>
             </w:r>
             <w:proofErr w:type="spellStart"/>
+            <w:proofErr w:type="gramStart"/>
             <w:r>
               <w:t>UtenteDAO</w:t>
             </w:r>
@@ -18626,6 +19443,7 @@
             <w:r>
               <w:t>::</w:t>
             </w:r>
+            <w:proofErr w:type="gramEnd"/>
             <w:r>
               <w:t xml:space="preserve"> </w:t>
             </w:r>
@@ -18703,12 +19521,17 @@
               <w:t xml:space="preserve"> </w:t>
             </w:r>
             <w:proofErr w:type="spellStart"/>
+            <w:proofErr w:type="gramStart"/>
             <w:r>
               <w:t>UtenteDAO</w:t>
             </w:r>
             <w:proofErr w:type="spellEnd"/>
             <w:r>
-              <w:t xml:space="preserve">:: </w:t>
+              <w:t>::</w:t>
+            </w:r>
+            <w:proofErr w:type="gramEnd"/>
+            <w:r>
+              <w:t xml:space="preserve"> </w:t>
             </w:r>
             <w:proofErr w:type="spellStart"/>
             <w:r>
@@ -18879,38 +19702,75 @@
             <w:tcW w:w="8647" w:type="dxa"/>
           </w:tcPr>
           <w:p>
-            <w:proofErr w:type="spellStart"/>
-            <w:r>
-              <w:t>Context</w:t>
-            </w:r>
-            <w:proofErr w:type="spellEnd"/>
-            <w:r>
-              <w:t xml:space="preserve"> </w:t>
-            </w:r>
-            <w:proofErr w:type="spellStart"/>
-            <w:r>
+            <w:pPr>
+              <w:rPr>
+                <w:lang w:val="en-GB"/>
+              </w:rPr>
+            </w:pPr>
+            <w:r>
+              <w:rPr>
+                <w:lang w:val="en-GB"/>
+              </w:rPr>
+              <w:t xml:space="preserve">Context </w:t>
+            </w:r>
+            <w:proofErr w:type="spellStart"/>
+            <w:proofErr w:type="gramStart"/>
+            <w:r>
+              <w:rPr>
+                <w:lang w:val="en-GB"/>
+              </w:rPr>
               <w:t>UtenteDAO</w:t>
             </w:r>
             <w:proofErr w:type="spellEnd"/>
             <w:r>
+              <w:rPr>
+                <w:lang w:val="en-GB"/>
+              </w:rPr>
               <w:t>::</w:t>
             </w:r>
-            <w:r>
-              <w:t xml:space="preserve"> </w:t>
-            </w:r>
-            <w:r>
-              <w:t>::</w:t>
-            </w:r>
-            <w:proofErr w:type="spellStart"/>
-            <w:r>
+            <w:proofErr w:type="gramEnd"/>
+            <w:r>
+              <w:rPr>
+                <w:lang w:val="en-GB"/>
+              </w:rPr>
+              <w:t xml:space="preserve"> ::</w:t>
+            </w:r>
+            <w:proofErr w:type="spellStart"/>
+            <w:r>
+              <w:rPr>
+                <w:lang w:val="en-GB"/>
+              </w:rPr>
               <w:t>createSupervisore</w:t>
             </w:r>
             <w:proofErr w:type="spellEnd"/>
             <w:r>
-              <w:t>(supervisore: Supervisore, password: String)</w:t>
-            </w:r>
-          </w:p>
-          <w:p/>
+              <w:rPr>
+                <w:lang w:val="en-GB"/>
+              </w:rPr>
+              <w:t>(</w:t>
+            </w:r>
+            <w:proofErr w:type="spellStart"/>
+            <w:r>
+              <w:rPr>
+                <w:lang w:val="en-GB"/>
+              </w:rPr>
+              <w:t>supervisore</w:t>
+            </w:r>
+            <w:proofErr w:type="spellEnd"/>
+            <w:r>
+              <w:rPr>
+                <w:lang w:val="en-GB"/>
+              </w:rPr>
+              <w:t>: Supervisore, password: String)</w:t>
+            </w:r>
+          </w:p>
+          <w:p>
+            <w:pPr>
+              <w:rPr>
+                <w:lang w:val="en-GB"/>
+              </w:rPr>
+            </w:pPr>
+          </w:p>
           <w:p>
             <w:pPr>
               <w:rPr>
@@ -18962,12 +19822,17 @@
               <w:t xml:space="preserve"> </w:t>
             </w:r>
             <w:proofErr w:type="spellStart"/>
+            <w:proofErr w:type="gramStart"/>
             <w:r>
               <w:t>UtenteDAO</w:t>
             </w:r>
             <w:proofErr w:type="spellEnd"/>
             <w:r>
-              <w:t>:: ::</w:t>
+              <w:t>::</w:t>
+            </w:r>
+            <w:proofErr w:type="gramEnd"/>
+            <w:r>
+              <w:t xml:space="preserve"> ::</w:t>
             </w:r>
             <w:proofErr w:type="spellStart"/>
             <w:r>
@@ -19171,6 +20036,7 @@
               <w:t xml:space="preserve"> </w:t>
             </w:r>
             <w:proofErr w:type="spellStart"/>
+            <w:proofErr w:type="gramStart"/>
             <w:r>
               <w:t>UtenteDAO</w:t>
             </w:r>
@@ -19179,6 +20045,7 @@
               <w:t>::</w:t>
             </w:r>
             <w:proofErr w:type="spellStart"/>
+            <w:proofErr w:type="gramEnd"/>
             <w:r>
               <w:t>findByMatricola</w:t>
             </w:r>
@@ -19256,6 +20123,7 @@
               <w:t xml:space="preserve"> </w:t>
             </w:r>
             <w:proofErr w:type="spellStart"/>
+            <w:proofErr w:type="gramStart"/>
             <w:r>
               <w:t>UtenteDAO</w:t>
             </w:r>
@@ -19264,6 +20132,7 @@
               <w:t>::</w:t>
             </w:r>
             <w:proofErr w:type="spellStart"/>
+            <w:proofErr w:type="gramEnd"/>
             <w:r>
               <w:t>findByMatricola</w:t>
             </w:r>
@@ -19478,6 +20347,7 @@
               <w:t xml:space="preserve"> </w:t>
             </w:r>
             <w:proofErr w:type="spellStart"/>
+            <w:proofErr w:type="gramStart"/>
             <w:r>
               <w:t>UtenteDAO</w:t>
             </w:r>
@@ -19486,6 +20356,7 @@
               <w:t>::</w:t>
             </w:r>
             <w:proofErr w:type="spellStart"/>
+            <w:proofErr w:type="gramEnd"/>
             <w:r>
               <w:t>getAllDipendentiInfo</w:t>
             </w:r>
@@ -19551,6 +20422,7 @@
               <w:t xml:space="preserve"> </w:t>
             </w:r>
             <w:proofErr w:type="spellStart"/>
+            <w:proofErr w:type="gramStart"/>
             <w:r>
               <w:t>UtenteDAO</w:t>
             </w:r>
@@ -19559,6 +20431,7 @@
               <w:t>::</w:t>
             </w:r>
             <w:proofErr w:type="spellStart"/>
+            <w:proofErr w:type="gramEnd"/>
             <w:r>
               <w:t>getAllDipendentiInfo</w:t>
             </w:r>
@@ -19768,6 +20641,7 @@
               <w:t xml:space="preserve"> </w:t>
             </w:r>
             <w:proofErr w:type="spellStart"/>
+            <w:proofErr w:type="gramStart"/>
             <w:r>
               <w:t>UtenteDAO</w:t>
             </w:r>
@@ -19775,6 +20649,7 @@
             <w:r>
               <w:t>::</w:t>
             </w:r>
+            <w:proofErr w:type="gramEnd"/>
             <w:r>
               <w:t xml:space="preserve"> </w:t>
             </w:r>
@@ -19830,6 +20705,7 @@
               <w:t xml:space="preserve">Context </w:t>
             </w:r>
             <w:proofErr w:type="spellStart"/>
+            <w:proofErr w:type="gramStart"/>
             <w:r>
               <w:rPr>
                 <w:lang w:val="en-GB"/>
@@ -19841,7 +20717,14 @@
               <w:rPr>
                 <w:lang w:val="en-GB"/>
               </w:rPr>
-              <w:t xml:space="preserve">:: </w:t>
+              <w:t>::</w:t>
+            </w:r>
+            <w:proofErr w:type="gramEnd"/>
+            <w:r>
+              <w:rPr>
+                <w:lang w:val="en-GB"/>
+              </w:rPr>
+              <w:t xml:space="preserve"> </w:t>
             </w:r>
             <w:proofErr w:type="spellStart"/>
             <w:r>
@@ -20051,6 +20934,7 @@
               <w:t xml:space="preserve"> </w:t>
             </w:r>
             <w:proofErr w:type="spellStart"/>
+            <w:proofErr w:type="gramStart"/>
             <w:r>
               <w:t>UtenteDAO</w:t>
             </w:r>
@@ -20059,6 +20943,7 @@
               <w:t>::</w:t>
             </w:r>
             <w:proofErr w:type="spellStart"/>
+            <w:proofErr w:type="gramEnd"/>
             <w:r>
               <w:t>updateRuolo</w:t>
             </w:r>
@@ -20072,7 +20957,15 @@
             </w:r>
             <w:proofErr w:type="spellEnd"/>
             <w:r>
-              <w:t xml:space="preserve">: Tipi::ruolo, </w:t>
+              <w:t xml:space="preserve">: </w:t>
+            </w:r>
+            <w:proofErr w:type="gramStart"/>
+            <w:r>
+              <w:t>Tipi::</w:t>
+            </w:r>
+            <w:proofErr w:type="gramEnd"/>
+            <w:r>
+              <w:t xml:space="preserve">ruolo, </w:t>
             </w:r>
             <w:proofErr w:type="spellStart"/>
             <w:r>
@@ -20116,7 +21009,15 @@
             </w:r>
             <w:proofErr w:type="spellEnd"/>
             <w:r>
-              <w:t xml:space="preserve"> = Tipi::ruolo::DIPENDENTE) </w:t>
+              <w:t xml:space="preserve"> = </w:t>
+            </w:r>
+            <w:proofErr w:type="gramStart"/>
+            <w:r>
+              <w:t>Tipi::ruolo::</w:t>
+            </w:r>
+            <w:proofErr w:type="gramEnd"/>
+            <w:r>
+              <w:t xml:space="preserve">DIPENDENTE) </w:t>
             </w:r>
             <w:proofErr w:type="spellStart"/>
             <w:r>
@@ -20189,6 +21090,7 @@
               <w:t xml:space="preserve"> </w:t>
             </w:r>
             <w:proofErr w:type="spellStart"/>
+            <w:proofErr w:type="gramStart"/>
             <w:r>
               <w:t>UtenteDAO</w:t>
             </w:r>
@@ -20197,6 +21099,7 @@
               <w:t>::</w:t>
             </w:r>
             <w:proofErr w:type="spellStart"/>
+            <w:proofErr w:type="gramEnd"/>
             <w:r>
               <w:t>updateRuolo</w:t>
             </w:r>
@@ -20210,7 +21113,15 @@
             </w:r>
             <w:proofErr w:type="spellEnd"/>
             <w:r>
-              <w:t xml:space="preserve">: Tipi::ruolo, </w:t>
+              <w:t xml:space="preserve">: </w:t>
+            </w:r>
+            <w:proofErr w:type="gramStart"/>
+            <w:r>
+              <w:t>Tipi::</w:t>
+            </w:r>
+            <w:proofErr w:type="gramEnd"/>
+            <w:r>
+              <w:t xml:space="preserve">ruolo, </w:t>
             </w:r>
             <w:proofErr w:type="spellStart"/>
             <w:r>
@@ -20388,6 +21299,7 @@
               <w:t xml:space="preserve"> </w:t>
             </w:r>
             <w:proofErr w:type="spellStart"/>
+            <w:proofErr w:type="gramStart"/>
             <w:r>
               <w:t>Utente</w:t>
             </w:r>
@@ -20399,6 +21311,7 @@
               <w:t>::</w:t>
             </w:r>
             <w:proofErr w:type="spellStart"/>
+            <w:proofErr w:type="gramEnd"/>
             <w:r>
               <w:t>updateSupervisore</w:t>
             </w:r>
@@ -20483,6 +21396,7 @@
               <w:t xml:space="preserve"> </w:t>
             </w:r>
             <w:proofErr w:type="spellStart"/>
+            <w:proofErr w:type="gramStart"/>
             <w:r>
               <w:t>UtenteDAO</w:t>
             </w:r>
@@ -20491,6 +21405,7 @@
               <w:t>::</w:t>
             </w:r>
             <w:proofErr w:type="spellStart"/>
+            <w:proofErr w:type="gramEnd"/>
             <w:r>
               <w:t>updateSupervisore</w:t>
             </w:r>
@@ -20700,6 +21615,7 @@
               <w:t xml:space="preserve">context </w:t>
             </w:r>
             <w:proofErr w:type="spellStart"/>
+            <w:proofErr w:type="gramStart"/>
             <w:r>
               <w:rPr>
                 <w:lang w:val="en-GB"/>
@@ -20714,6 +21630,7 @@
               <w:t>::</w:t>
             </w:r>
             <w:proofErr w:type="spellStart"/>
+            <w:proofErr w:type="gramEnd"/>
             <w:r>
               <w:rPr>
                 <w:lang w:val="en-GB"/>
@@ -20888,6 +21805,7 @@
               <w:t xml:space="preserve">context </w:t>
             </w:r>
             <w:proofErr w:type="spellStart"/>
+            <w:proofErr w:type="gramStart"/>
             <w:r>
               <w:rPr>
                 <w:lang w:val="en-GB"/>
@@ -20902,6 +21820,7 @@
               <w:t>::</w:t>
             </w:r>
             <w:proofErr w:type="spellStart"/>
+            <w:proofErr w:type="gramEnd"/>
             <w:r>
               <w:rPr>
                 <w:lang w:val="en-GB"/>
@@ -21016,13 +21935,7 @@
               <w:rPr>
                 <w:lang w:val="en-GB"/>
               </w:rPr>
-              <w:t>u</w:t>
-            </w:r>
-            <w:r>
-              <w:rPr>
-                <w:lang w:val="en-GB"/>
-              </w:rPr>
-              <w:t>.hashPassword</w:t>
+              <w:t>u.hashPassword</w:t>
             </w:r>
             <w:proofErr w:type="spellEnd"/>
             <w:r>
@@ -21162,12 +22075,17 @@
               <w:t xml:space="preserve"> </w:t>
             </w:r>
             <w:proofErr w:type="spellStart"/>
+            <w:proofErr w:type="gramStart"/>
             <w:r>
               <w:t>UtenteDAO</w:t>
             </w:r>
             <w:proofErr w:type="spellEnd"/>
             <w:r>
-              <w:t>:: delete(</w:t>
+              <w:t>::</w:t>
+            </w:r>
+            <w:proofErr w:type="gramEnd"/>
+            <w:r>
+              <w:t xml:space="preserve"> delete(</w:t>
             </w:r>
             <w:proofErr w:type="spellStart"/>
             <w:r>
@@ -21226,12 +22144,17 @@
               <w:t xml:space="preserve"> </w:t>
             </w:r>
             <w:proofErr w:type="spellStart"/>
+            <w:proofErr w:type="gramStart"/>
             <w:r>
               <w:t>UtenteDAO</w:t>
             </w:r>
             <w:proofErr w:type="spellEnd"/>
             <w:r>
-              <w:t>:: delete(</w:t>
+              <w:t>::</w:t>
+            </w:r>
+            <w:proofErr w:type="gramEnd"/>
+            <w:r>
+              <w:t xml:space="preserve"> delete(</w:t>
             </w:r>
             <w:proofErr w:type="spellStart"/>
             <w:r>
@@ -21737,7 +22660,15 @@
           </w:tcPr>
           <w:p>
             <w:r>
-              <w:t>Persistente una task all’interno del database</w:t>
+              <w:t xml:space="preserve">Persistente </w:t>
+            </w:r>
+            <w:proofErr w:type="gramStart"/>
+            <w:r>
+              <w:t>una task</w:t>
+            </w:r>
+            <w:proofErr w:type="gramEnd"/>
+            <w:r>
+              <w:t xml:space="preserve"> all’interno del database</w:t>
             </w:r>
           </w:p>
         </w:tc>
@@ -21770,6 +22701,7 @@
               <w:t xml:space="preserve">Context </w:t>
             </w:r>
             <w:proofErr w:type="spellStart"/>
+            <w:proofErr w:type="gramStart"/>
             <w:r>
               <w:rPr>
                 <w:lang w:val="en-GB"/>
@@ -21781,7 +22713,14 @@
               <w:rPr>
                 <w:lang w:val="en-GB"/>
               </w:rPr>
-              <w:t>::create(t</w:t>
+              <w:t>::</w:t>
+            </w:r>
+            <w:proofErr w:type="gramEnd"/>
+            <w:r>
+              <w:rPr>
+                <w:lang w:val="en-GB"/>
+              </w:rPr>
+              <w:t>create(t</w:t>
             </w:r>
             <w:r>
               <w:rPr>
@@ -21802,45 +22741,11 @@
                 <w:lang w:val="en-GB"/>
               </w:rPr>
             </w:pPr>
-            <w:proofErr w:type="spellStart"/>
-            <w:r>
-              <w:rPr>
-                <w:lang w:val="en-GB"/>
-              </w:rPr>
-              <w:t>Task.allInstances</w:t>
-            </w:r>
-            <w:proofErr w:type="spellEnd"/>
-            <w:r>
-              <w:rPr>
-                <w:lang w:val="en-GB"/>
-              </w:rPr>
-              <w:t>()-&gt;</w:t>
-            </w:r>
-            <w:proofErr w:type="spellStart"/>
-            <w:r>
-              <w:rPr>
-                <w:lang w:val="en-GB"/>
-              </w:rPr>
-              <w:t>forAll</w:t>
-            </w:r>
-            <w:proofErr w:type="spellEnd"/>
-            <w:r>
-              <w:rPr>
-                <w:lang w:val="en-GB"/>
-              </w:rPr>
-              <w:t>(x | x.id &lt;&gt; t</w:t>
-            </w:r>
-            <w:r>
-              <w:rPr>
-                <w:lang w:val="en-GB"/>
-              </w:rPr>
-              <w:t>ask</w:t>
-            </w:r>
-            <w:r>
-              <w:rPr>
-                <w:lang w:val="en-GB"/>
-              </w:rPr>
-              <w:t>.id)</w:t>
+            <w:r>
+              <w:rPr>
+                <w:lang w:val="en-GB"/>
+              </w:rPr>
+              <w:t>task &lt;&gt; null</w:t>
             </w:r>
             <w:r>
               <w:rPr>
@@ -21879,6 +22784,7 @@
               <w:t xml:space="preserve">Context </w:t>
             </w:r>
             <w:proofErr w:type="spellStart"/>
+            <w:proofErr w:type="gramStart"/>
             <w:r>
               <w:rPr>
                 <w:lang w:val="en-GB"/>
@@ -21890,7 +22796,14 @@
               <w:rPr>
                 <w:lang w:val="en-GB"/>
               </w:rPr>
-              <w:t>::create(task: Task)</w:t>
+              <w:t>::</w:t>
+            </w:r>
+            <w:proofErr w:type="gramEnd"/>
+            <w:r>
+              <w:rPr>
+                <w:lang w:val="en-GB"/>
+              </w:rPr>
+              <w:t>create(task: Task)</w:t>
             </w:r>
           </w:p>
           <w:p>
@@ -22051,6 +22964,7 @@
               <w:t xml:space="preserve">Context </w:t>
             </w:r>
             <w:proofErr w:type="spellStart"/>
+            <w:proofErr w:type="gramStart"/>
             <w:r>
               <w:rPr>
                 <w:lang w:val="en-GB"/>
@@ -22065,6 +22979,7 @@
               <w:t>::</w:t>
             </w:r>
             <w:proofErr w:type="spellStart"/>
+            <w:proofErr w:type="gramEnd"/>
             <w:r>
               <w:rPr>
                 <w:lang w:val="en-GB"/>
@@ -22098,7 +23013,13 @@
               <w:rPr>
                 <w:lang w:val="en-GB"/>
               </w:rPr>
-              <w:t>Id &lt;&gt; null</w:t>
+              <w:t xml:space="preserve">Id </w:t>
+            </w:r>
+            <w:r>
+              <w:rPr>
+                <w:lang w:val="en-GB"/>
+              </w:rPr>
+              <w:t>&gt; 0</w:t>
             </w:r>
           </w:p>
         </w:tc>
@@ -22131,6 +23052,7 @@
               <w:t xml:space="preserve">Context </w:t>
             </w:r>
             <w:proofErr w:type="spellStart"/>
+            <w:proofErr w:type="gramStart"/>
             <w:r>
               <w:rPr>
                 <w:lang w:val="en-GB"/>
@@ -22145,6 +23067,7 @@
               <w:t>::</w:t>
             </w:r>
             <w:proofErr w:type="spellStart"/>
+            <w:proofErr w:type="gramEnd"/>
             <w:r>
               <w:rPr>
                 <w:lang w:val="en-GB"/>
@@ -22338,6 +23261,7 @@
               <w:t xml:space="preserve"> </w:t>
             </w:r>
             <w:proofErr w:type="spellStart"/>
+            <w:proofErr w:type="gramStart"/>
             <w:r>
               <w:t>TaskDAO</w:t>
             </w:r>
@@ -22346,6 +23270,7 @@
               <w:t>::</w:t>
             </w:r>
             <w:proofErr w:type="spellStart"/>
+            <w:proofErr w:type="gramEnd"/>
             <w:r>
               <w:t>findByUtente</w:t>
             </w:r>
@@ -22402,6 +23327,7 @@
               <w:t xml:space="preserve">Context </w:t>
             </w:r>
             <w:proofErr w:type="spellStart"/>
+            <w:proofErr w:type="gramStart"/>
             <w:r>
               <w:rPr>
                 <w:lang w:val="en-GB"/>
@@ -22416,6 +23342,7 @@
               <w:t>::</w:t>
             </w:r>
             <w:proofErr w:type="spellStart"/>
+            <w:proofErr w:type="gramEnd"/>
             <w:r>
               <w:rPr>
                 <w:lang w:val="en-GB"/>
@@ -22716,6 +23643,7 @@
               <w:t xml:space="preserve">context </w:t>
             </w:r>
             <w:proofErr w:type="spellStart"/>
+            <w:proofErr w:type="gramStart"/>
             <w:r>
               <w:rPr>
                 <w:lang w:val="en-GB"/>
@@ -22730,6 +23658,7 @@
               <w:t>::</w:t>
             </w:r>
             <w:proofErr w:type="spellStart"/>
+            <w:proofErr w:type="gramEnd"/>
             <w:r>
               <w:rPr>
                 <w:lang w:val="en-GB"/>
@@ -22748,13 +23677,7 @@
               <w:rPr>
                 <w:lang w:val="en-GB"/>
               </w:rPr>
-              <w:t>id</w:t>
-            </w:r>
-            <w:r>
-              <w:rPr>
-                <w:lang w:val="en-GB"/>
-              </w:rPr>
-              <w:t>:long</w:t>
+              <w:t>id:long</w:t>
             </w:r>
             <w:proofErr w:type="spellEnd"/>
             <w:r>
@@ -22768,13 +23691,7 @@
               <w:rPr>
                 <w:lang w:val="en-GB"/>
               </w:rPr>
-              <w:t>nuovoStato:</w:t>
-            </w:r>
-            <w:r>
-              <w:rPr>
-                <w:lang w:val="en-GB"/>
-              </w:rPr>
-              <w:t>enum</w:t>
+              <w:t>nuovoStato:enum</w:t>
             </w:r>
             <w:proofErr w:type="spellEnd"/>
             <w:r>
@@ -22805,6 +23722,9 @@
               <w:t>null</w:t>
             </w:r>
             <w:proofErr w:type="spellEnd"/>
+            <w:r>
+              <w:t xml:space="preserve"> and id &lt;= 0</w:t>
+            </w:r>
           </w:p>
         </w:tc>
       </w:tr>
@@ -22844,6 +23764,7 @@
               <w:t xml:space="preserve">context </w:t>
             </w:r>
             <w:proofErr w:type="spellStart"/>
+            <w:proofErr w:type="gramStart"/>
             <w:r>
               <w:rPr>
                 <w:lang w:val="en-GB"/>
@@ -22858,6 +23779,7 @@
               <w:t>::</w:t>
             </w:r>
             <w:proofErr w:type="spellStart"/>
+            <w:proofErr w:type="gramEnd"/>
             <w:r>
               <w:rPr>
                 <w:lang w:val="en-GB"/>
@@ -22925,13 +23847,7 @@
               <w:rPr>
                 <w:lang w:val="en-GB"/>
               </w:rPr>
-              <w:t>()-&gt;</w:t>
-            </w:r>
-            <w:r>
-              <w:rPr>
-                <w:lang w:val="en-GB"/>
-              </w:rPr>
-              <w:t xml:space="preserve">exists(t | t.id = id and </w:t>
+              <w:t xml:space="preserve">()-&gt;exists(t | t.id = id and </w:t>
             </w:r>
             <w:proofErr w:type="spellStart"/>
             <w:r>
@@ -23095,6 +24011,7 @@
               <w:t xml:space="preserve"> </w:t>
             </w:r>
             <w:proofErr w:type="spellStart"/>
+            <w:proofErr w:type="gramStart"/>
             <w:r>
               <w:rPr>
                 <w:lang w:val="en-GB"/>
@@ -23106,7 +24023,14 @@
               <w:rPr>
                 <w:lang w:val="en-GB"/>
               </w:rPr>
-              <w:t>::update(t</w:t>
+              <w:t>::</w:t>
+            </w:r>
+            <w:proofErr w:type="gramEnd"/>
+            <w:r>
+              <w:rPr>
+                <w:lang w:val="en-GB"/>
+              </w:rPr>
+              <w:t>update(t</w:t>
             </w:r>
             <w:r>
               <w:rPr>
@@ -23185,6 +24109,7 @@
               <w:t xml:space="preserve">Context  </w:t>
             </w:r>
             <w:proofErr w:type="spellStart"/>
+            <w:proofErr w:type="gramStart"/>
             <w:r>
               <w:rPr>
                 <w:lang w:val="en-GB"/>
@@ -23196,7 +24121,14 @@
               <w:rPr>
                 <w:lang w:val="en-GB"/>
               </w:rPr>
-              <w:t>::update(task: Task)</w:t>
+              <w:t>::</w:t>
+            </w:r>
+            <w:proofErr w:type="gramEnd"/>
+            <w:r>
+              <w:rPr>
+                <w:lang w:val="en-GB"/>
+              </w:rPr>
+              <w:t>update(task: Task)</w:t>
             </w:r>
           </w:p>
           <w:p>
@@ -23355,6 +24287,7 @@
               <w:t xml:space="preserve"> </w:t>
             </w:r>
             <w:proofErr w:type="spellStart"/>
+            <w:proofErr w:type="gramStart"/>
             <w:r>
               <w:rPr>
                 <w:lang w:val="en-GB"/>
@@ -23366,7 +24299,14 @@
               <w:rPr>
                 <w:lang w:val="en-GB"/>
               </w:rPr>
-              <w:t>::delete(t</w:t>
+              <w:t>::</w:t>
+            </w:r>
+            <w:proofErr w:type="gramEnd"/>
+            <w:r>
+              <w:rPr>
+                <w:lang w:val="en-GB"/>
+              </w:rPr>
+              <w:t>delete(t</w:t>
             </w:r>
             <w:r>
               <w:rPr>
@@ -23436,6 +24376,7 @@
               <w:t xml:space="preserve"> </w:t>
             </w:r>
             <w:proofErr w:type="spellStart"/>
+            <w:proofErr w:type="gramStart"/>
             <w:r>
               <w:rPr>
                 <w:lang w:val="en-GB"/>
@@ -23447,7 +24388,14 @@
               <w:rPr>
                 <w:lang w:val="en-GB"/>
               </w:rPr>
-              <w:t>::delete(task: Task)</w:t>
+              <w:t>::</w:t>
+            </w:r>
+            <w:proofErr w:type="gramEnd"/>
+            <w:r>
+              <w:rPr>
+                <w:lang w:val="en-GB"/>
+              </w:rPr>
+              <w:t>delete(task: Task)</w:t>
             </w:r>
           </w:p>
           <w:p>
@@ -23832,12 +24780,17 @@
               <w:t xml:space="preserve"> </w:t>
             </w:r>
             <w:proofErr w:type="spellStart"/>
+            <w:proofErr w:type="gramStart"/>
             <w:r>
               <w:t>NotificaDAO</w:t>
             </w:r>
             <w:proofErr w:type="spellEnd"/>
             <w:r>
-              <w:t>::create(n</w:t>
+              <w:t>::</w:t>
+            </w:r>
+            <w:proofErr w:type="gramEnd"/>
+            <w:r>
+              <w:t>create(n</w:t>
             </w:r>
             <w:r>
               <w:t>otifica</w:t>
@@ -23886,12 +24839,17 @@
               <w:t xml:space="preserve"> </w:t>
             </w:r>
             <w:proofErr w:type="spellStart"/>
+            <w:proofErr w:type="gramStart"/>
             <w:r>
               <w:t>NotificaDAO</w:t>
             </w:r>
             <w:proofErr w:type="spellEnd"/>
             <w:r>
-              <w:t>::create(notifica: Notifica)</w:t>
+              <w:t>::</w:t>
+            </w:r>
+            <w:proofErr w:type="gramEnd"/>
+            <w:r>
+              <w:t>create(notifica: Notifica)</w:t>
             </w:r>
           </w:p>
           <w:p>
@@ -24020,6 +24978,7 @@
               <w:t xml:space="preserve"> </w:t>
             </w:r>
             <w:proofErr w:type="spellStart"/>
+            <w:proofErr w:type="gramStart"/>
             <w:r>
               <w:t>NotificaDAO</w:t>
             </w:r>
@@ -24028,6 +24987,7 @@
               <w:t>::</w:t>
             </w:r>
             <w:proofErr w:type="spellStart"/>
+            <w:proofErr w:type="gramEnd"/>
             <w:r>
               <w:t>findByUtente</w:t>
             </w:r>
@@ -24079,6 +25039,7 @@
               <w:t xml:space="preserve"> </w:t>
             </w:r>
             <w:proofErr w:type="spellStart"/>
+            <w:proofErr w:type="gramStart"/>
             <w:r>
               <w:t>NotificaDAO</w:t>
             </w:r>
@@ -24087,6 +25048,7 @@
               <w:t>::</w:t>
             </w:r>
             <w:proofErr w:type="spellStart"/>
+            <w:proofErr w:type="gramEnd"/>
             <w:r>
               <w:t>findByUtente</w:t>
             </w:r>
@@ -26816,6 +27778,7 @@
   <w:style w:type="character" w:default="1" w:styleId="Carpredefinitoparagrafo">
     <w:name w:val="Default Paragraph Font"/>
     <w:uiPriority w:val="1"/>
+    <w:semiHidden/>
     <w:unhideWhenUsed/>
   </w:style>
   <w:style w:type="table" w:default="1" w:styleId="Tabellanormale">

</xml_diff>

<commit_message>
Mod: modificati documenti in corrispondenza delle modifiche effettuate durante lo sviluppo del progetto
</commit_message>
<xml_diff>
--- a/Workspace/ODD/ODD_EWMS.docx
+++ b/Workspace/ODD/ODD_EWMS.docx
@@ -189,7 +189,7 @@
           <w:sz w:val="36"/>
           <w:lang w:val="en-GB"/>
         </w:rPr>
-        <w:t>1</w:t>
+        <w:t>2</w:t>
       </w:r>
       <w:r>
         <w:rPr>
@@ -316,7 +316,13 @@
         <w:rPr>
           <w:sz w:val="32"/>
         </w:rPr>
-        <w:t>22</w:t>
+        <w:t>2</w:t>
+      </w:r>
+      <w:r>
+        <w:rPr>
+          <w:sz w:val="32"/>
+        </w:rPr>
+        <w:t>4</w:t>
       </w:r>
       <w:r>
         <w:rPr>
@@ -1480,10 +1486,17 @@
           <w:p>
             <w:pPr>
               <w:pStyle w:val="Contenutotabella"/>
+              <w:jc w:val="center"/>
               <w:rPr>
                 <w:sz w:val="20"/>
               </w:rPr>
             </w:pPr>
+            <w:r>
+              <w:rPr>
+                <w:sz w:val="20"/>
+              </w:rPr>
+              <w:t>24/01/2026</w:t>
+            </w:r>
           </w:p>
         </w:tc>
         <w:tc>
@@ -1498,10 +1511,17 @@
           <w:p>
             <w:pPr>
               <w:pStyle w:val="Contenutotabella"/>
+              <w:jc w:val="center"/>
               <w:rPr>
                 <w:sz w:val="20"/>
               </w:rPr>
             </w:pPr>
+            <w:r>
+              <w:rPr>
+                <w:sz w:val="20"/>
+              </w:rPr>
+              <w:t>1.2</w:t>
+            </w:r>
           </w:p>
         </w:tc>
         <w:tc>
@@ -1520,6 +1540,20 @@
                 <w:sz w:val="20"/>
               </w:rPr>
             </w:pPr>
+            <w:r>
+              <w:rPr>
+                <w:sz w:val="20"/>
+              </w:rPr>
+              <w:t xml:space="preserve">Aggiunti nuovi metodi per </w:t>
+            </w:r>
+            <w:proofErr w:type="spellStart"/>
+            <w:r>
+              <w:rPr>
+                <w:sz w:val="20"/>
+              </w:rPr>
+              <w:t>UtenteDAO</w:t>
+            </w:r>
+            <w:proofErr w:type="spellEnd"/>
           </w:p>
         </w:tc>
         <w:tc>
@@ -1539,6 +1573,12 @@
                 <w:sz w:val="20"/>
               </w:rPr>
             </w:pPr>
+            <w:r>
+              <w:rPr>
+                <w:sz w:val="20"/>
+              </w:rPr>
+              <w:t>Giovanni Robustelli</w:t>
+            </w:r>
           </w:p>
         </w:tc>
       </w:tr>
@@ -1938,7 +1978,7 @@
       <w:r>
         <w:fldChar w:fldCharType="separate"/>
       </w:r>
-      <w:hyperlink w:anchor="_Toc217035658" w:history="1">
+      <w:hyperlink w:anchor="_Toc220175340" w:history="1">
         <w:r>
           <w:rPr>
             <w:rStyle w:val="Collegamentoipertestuale"/>
@@ -1982,7 +2022,7 @@
             <w:noProof/>
             <w:webHidden/>
           </w:rPr>
-          <w:instrText xml:space="preserve"> PAGEREF _Toc217035658 \h </w:instrText>
+          <w:instrText xml:space="preserve"> PAGEREF _Toc220175340 \h </w:instrText>
         </w:r>
         <w:r>
           <w:rPr>
@@ -2027,7 +2067,7 @@
           <w14:ligatures w14:val="standardContextual"/>
         </w:rPr>
       </w:pPr>
-      <w:hyperlink w:anchor="_Toc217035659" w:history="1">
+      <w:hyperlink w:anchor="_Toc220175341" w:history="1">
         <w:r>
           <w:rPr>
             <w:rStyle w:val="Collegamentoipertestuale"/>
@@ -2071,7 +2111,7 @@
             <w:noProof/>
             <w:webHidden/>
           </w:rPr>
-          <w:instrText xml:space="preserve"> PAGEREF _Toc217035659 \h </w:instrText>
+          <w:instrText xml:space="preserve"> PAGEREF _Toc220175341 \h </w:instrText>
         </w:r>
         <w:r>
           <w:rPr>
@@ -2116,7 +2156,7 @@
           <w14:ligatures w14:val="standardContextual"/>
         </w:rPr>
       </w:pPr>
-      <w:hyperlink w:anchor="_Toc217035660" w:history="1">
+      <w:hyperlink w:anchor="_Toc220175342" w:history="1">
         <w:r>
           <w:rPr>
             <w:rStyle w:val="Collegamentoipertestuale"/>
@@ -2160,7 +2200,7 @@
             <w:noProof/>
             <w:webHidden/>
           </w:rPr>
-          <w:instrText xml:space="preserve"> PAGEREF _Toc217035660 \h </w:instrText>
+          <w:instrText xml:space="preserve"> PAGEREF _Toc220175342 \h </w:instrText>
         </w:r>
         <w:r>
           <w:rPr>
@@ -2205,7 +2245,7 @@
           <w14:ligatures w14:val="standardContextual"/>
         </w:rPr>
       </w:pPr>
-      <w:hyperlink w:anchor="_Toc217035661" w:history="1">
+      <w:hyperlink w:anchor="_Toc220175343" w:history="1">
         <w:r>
           <w:rPr>
             <w:rStyle w:val="Collegamentoipertestuale"/>
@@ -2249,7 +2289,7 @@
             <w:noProof/>
             <w:webHidden/>
           </w:rPr>
-          <w:instrText xml:space="preserve"> PAGEREF _Toc217035661 \h </w:instrText>
+          <w:instrText xml:space="preserve"> PAGEREF _Toc220175343 \h </w:instrText>
         </w:r>
         <w:r>
           <w:rPr>
@@ -2291,7 +2331,7 @@
           <w14:ligatures w14:val="standardContextual"/>
         </w:rPr>
       </w:pPr>
-      <w:hyperlink w:anchor="_Toc217035662" w:history="1">
+      <w:hyperlink w:anchor="_Toc220175344" w:history="1">
         <w:r>
           <w:rPr>
             <w:rStyle w:val="Collegamentoipertestuale"/>
@@ -2318,7 +2358,7 @@
             <w:noProof/>
             <w:webHidden/>
           </w:rPr>
-          <w:instrText xml:space="preserve"> PAGEREF _Toc217035662 \h </w:instrText>
+          <w:instrText xml:space="preserve"> PAGEREF _Toc220175344 \h </w:instrText>
         </w:r>
         <w:r>
           <w:rPr>
@@ -2360,7 +2400,7 @@
           <w14:ligatures w14:val="standardContextual"/>
         </w:rPr>
       </w:pPr>
-      <w:hyperlink w:anchor="_Toc217035663" w:history="1">
+      <w:hyperlink w:anchor="_Toc220175345" w:history="1">
         <w:r>
           <w:rPr>
             <w:rStyle w:val="Collegamentoipertestuale"/>
@@ -2387,7 +2427,7 @@
             <w:noProof/>
             <w:webHidden/>
           </w:rPr>
-          <w:instrText xml:space="preserve"> PAGEREF _Toc217035663 \h </w:instrText>
+          <w:instrText xml:space="preserve"> PAGEREF _Toc220175345 \h </w:instrText>
         </w:r>
         <w:r>
           <w:rPr>
@@ -2432,7 +2472,7 @@
           <w14:ligatures w14:val="standardContextual"/>
         </w:rPr>
       </w:pPr>
-      <w:hyperlink w:anchor="_Toc217035664" w:history="1">
+      <w:hyperlink w:anchor="_Toc220175346" w:history="1">
         <w:r>
           <w:rPr>
             <w:rStyle w:val="Collegamentoipertestuale"/>
@@ -2476,7 +2516,7 @@
             <w:noProof/>
             <w:webHidden/>
           </w:rPr>
-          <w:instrText xml:space="preserve"> PAGEREF _Toc217035664 \h </w:instrText>
+          <w:instrText xml:space="preserve"> PAGEREF _Toc220175346 \h </w:instrText>
         </w:r>
         <w:r>
           <w:rPr>
@@ -2521,7 +2561,7 @@
           <w14:ligatures w14:val="standardContextual"/>
         </w:rPr>
       </w:pPr>
-      <w:hyperlink w:anchor="_Toc217035665" w:history="1">
+      <w:hyperlink w:anchor="_Toc220175347" w:history="1">
         <w:r>
           <w:rPr>
             <w:rStyle w:val="Collegamentoipertestuale"/>
@@ -2565,7 +2605,7 @@
             <w:noProof/>
             <w:webHidden/>
           </w:rPr>
-          <w:instrText xml:space="preserve"> PAGEREF _Toc217035665 \h </w:instrText>
+          <w:instrText xml:space="preserve"> PAGEREF _Toc220175347 \h </w:instrText>
         </w:r>
         <w:r>
           <w:rPr>
@@ -2610,7 +2650,7 @@
           <w14:ligatures w14:val="standardContextual"/>
         </w:rPr>
       </w:pPr>
-      <w:hyperlink w:anchor="_Toc217035666" w:history="1">
+      <w:hyperlink w:anchor="_Toc220175348" w:history="1">
         <w:r>
           <w:rPr>
             <w:rStyle w:val="Collegamentoipertestuale"/>
@@ -2654,7 +2694,7 @@
             <w:noProof/>
             <w:webHidden/>
           </w:rPr>
-          <w:instrText xml:space="preserve"> PAGEREF _Toc217035666 \h </w:instrText>
+          <w:instrText xml:space="preserve"> PAGEREF _Toc220175348 \h </w:instrText>
         </w:r>
         <w:r>
           <w:rPr>
@@ -2699,7 +2739,7 @@
           <w14:ligatures w14:val="standardContextual"/>
         </w:rPr>
       </w:pPr>
-      <w:hyperlink w:anchor="_Toc217035667" w:history="1">
+      <w:hyperlink w:anchor="_Toc220175349" w:history="1">
         <w:r>
           <w:rPr>
             <w:rStyle w:val="Collegamentoipertestuale"/>
@@ -2745,7 +2785,7 @@
             <w:noProof/>
             <w:webHidden/>
           </w:rPr>
-          <w:instrText xml:space="preserve"> PAGEREF _Toc217035667 \h </w:instrText>
+          <w:instrText xml:space="preserve"> PAGEREF _Toc220175349 \h </w:instrText>
         </w:r>
         <w:r>
           <w:rPr>
@@ -2790,7 +2830,7 @@
           <w14:ligatures w14:val="standardContextual"/>
         </w:rPr>
       </w:pPr>
-      <w:hyperlink w:anchor="_Toc217035668" w:history="1">
+      <w:hyperlink w:anchor="_Toc220175350" w:history="1">
         <w:r>
           <w:rPr>
             <w:rStyle w:val="Collegamentoipertestuale"/>
@@ -2836,7 +2876,7 @@
             <w:noProof/>
             <w:webHidden/>
           </w:rPr>
-          <w:instrText xml:space="preserve"> PAGEREF _Toc217035668 \h </w:instrText>
+          <w:instrText xml:space="preserve"> PAGEREF _Toc220175350 \h </w:instrText>
         </w:r>
         <w:r>
           <w:rPr>
@@ -2881,7 +2921,7 @@
           <w14:ligatures w14:val="standardContextual"/>
         </w:rPr>
       </w:pPr>
-      <w:hyperlink w:anchor="_Toc217035669" w:history="1">
+      <w:hyperlink w:anchor="_Toc220175351" w:history="1">
         <w:r>
           <w:rPr>
             <w:rStyle w:val="Collegamentoipertestuale"/>
@@ -2927,7 +2967,7 @@
             <w:noProof/>
             <w:webHidden/>
           </w:rPr>
-          <w:instrText xml:space="preserve"> PAGEREF _Toc217035669 \h </w:instrText>
+          <w:instrText xml:space="preserve"> PAGEREF _Toc220175351 \h </w:instrText>
         </w:r>
         <w:r>
           <w:rPr>
@@ -3003,7 +3043,7 @@
         </w:numPr>
         <w:ind w:left="0"/>
       </w:pPr>
-      <w:bookmarkStart w:id="0" w:name="_Toc217035658"/>
+      <w:bookmarkStart w:id="0" w:name="_Toc220175340"/>
       <w:r>
         <w:lastRenderedPageBreak/>
         <w:t>Introduzione</w:t>
@@ -3045,7 +3085,7 @@
         </w:numPr>
         <w:ind w:left="0"/>
       </w:pPr>
-      <w:bookmarkStart w:id="1" w:name="_Toc217035659"/>
+      <w:bookmarkStart w:id="1" w:name="_Toc220175341"/>
       <w:r>
         <w:t>Object design trade-</w:t>
       </w:r>
@@ -3081,15 +3121,7 @@
     </w:p>
     <w:p>
       <w:r>
-        <w:t xml:space="preserve">È nel nostro interesse utilizzare un modello </w:t>
-      </w:r>
-      <w:proofErr w:type="spellStart"/>
-      <w:r>
-        <w:t>ad</w:t>
-      </w:r>
-      <w:proofErr w:type="spellEnd"/>
-      <w:r>
-        <w:t xml:space="preserve"> oggetti semplice e composto da poche classi centrali suddivise in maniera non eccessiva, riducendo il rischio di over-design e accelerando il processo di sviluppo.</w:t>
+        <w:t>È nel nostro interesse utilizzare un modello ad oggetti semplice e composto da poche classi centrali suddivise in maniera non eccessiva, riducendo il rischio di over-design e accelerando il processo di sviluppo.</w:t>
       </w:r>
     </w:p>
     <w:p>
@@ -3222,7 +3254,7 @@
         </w:numPr>
         <w:ind w:left="0"/>
       </w:pPr>
-      <w:bookmarkStart w:id="2" w:name="_Toc217035660"/>
+      <w:bookmarkStart w:id="2" w:name="_Toc220175342"/>
       <w:r>
         <w:t xml:space="preserve">Interface </w:t>
       </w:r>
@@ -3510,7 +3542,7 @@
         <w:lastRenderedPageBreak/>
         <w:t xml:space="preserve"> </w:t>
       </w:r>
-      <w:bookmarkStart w:id="3" w:name="_Toc217035661"/>
+      <w:bookmarkStart w:id="3" w:name="_Toc220175343"/>
       <w:r>
         <w:t>Pacchetti</w:t>
       </w:r>
@@ -3641,7 +3673,7 @@
         <w:pStyle w:val="Titolo2"/>
         <w:ind w:left="-426"/>
       </w:pPr>
-      <w:bookmarkStart w:id="4" w:name="_Toc217035662"/>
+      <w:bookmarkStart w:id="4" w:name="_Toc220175344"/>
       <w:r>
         <w:t>2.1 Decomposizione dei sottosistemi in package</w:t>
       </w:r>
@@ -4157,7 +4189,7 @@
         <w:pStyle w:val="Titolo2"/>
         <w:ind w:left="-567"/>
       </w:pPr>
-      <w:bookmarkStart w:id="5" w:name="_Toc217035663"/>
+      <w:bookmarkStart w:id="5" w:name="_Toc220175345"/>
       <w:r>
         <w:t>2.</w:t>
       </w:r>
@@ -4343,7 +4375,7 @@
         </w:numPr>
         <w:ind w:left="0"/>
       </w:pPr>
-      <w:bookmarkStart w:id="6" w:name="_Toc217035664"/>
+      <w:bookmarkStart w:id="6" w:name="_Toc220175346"/>
       <w:r>
         <w:lastRenderedPageBreak/>
         <w:t xml:space="preserve">Class </w:t>
@@ -4385,7 +4417,7 @@
         </w:numPr>
         <w:ind w:left="0"/>
       </w:pPr>
-      <w:bookmarkStart w:id="7" w:name="_Toc217035665"/>
+      <w:bookmarkStart w:id="7" w:name="_Toc220175347"/>
       <w:proofErr w:type="spellStart"/>
       <w:r>
         <w:t>AccessManagement</w:t>
@@ -5581,7 +5613,7 @@
         </w:numPr>
         <w:ind w:left="0"/>
       </w:pPr>
-      <w:bookmarkStart w:id="8" w:name="_Toc217035666"/>
+      <w:bookmarkStart w:id="8" w:name="_Toc220175348"/>
       <w:proofErr w:type="spellStart"/>
       <w:r>
         <w:t>AccountManagement</w:t>
@@ -10390,7 +10422,7 @@
           <w:lang w:val="en-GB"/>
         </w:rPr>
       </w:pPr>
-      <w:bookmarkStart w:id="9" w:name="_Toc217035667"/>
+      <w:bookmarkStart w:id="9" w:name="_Toc220175349"/>
       <w:proofErr w:type="spellStart"/>
       <w:r>
         <w:rPr>
@@ -16494,7 +16526,7 @@
           <w:lang w:val="en-GB"/>
         </w:rPr>
       </w:pPr>
-      <w:bookmarkStart w:id="10" w:name="_Toc217035668"/>
+      <w:bookmarkStart w:id="10" w:name="_Toc220175350"/>
       <w:proofErr w:type="spellStart"/>
       <w:r>
         <w:rPr>
@@ -17401,7 +17433,7 @@
           <w:lang w:val="en-GB"/>
         </w:rPr>
       </w:pPr>
-      <w:bookmarkStart w:id="11" w:name="_Toc217035669"/>
+      <w:bookmarkStart w:id="11" w:name="_Toc220175351"/>
       <w:proofErr w:type="spellStart"/>
       <w:r>
         <w:rPr>
@@ -18707,6 +18739,35 @@
             </w:r>
             <w:proofErr w:type="spellStart"/>
             <w:r>
+              <w:t>findByEmail</w:t>
+            </w:r>
+            <w:proofErr w:type="spellEnd"/>
+            <w:r>
+              <w:t>(</w:t>
+            </w:r>
+            <w:proofErr w:type="spellStart"/>
+            <w:proofErr w:type="gramStart"/>
+            <w:r>
+              <w:t>email</w:t>
+            </w:r>
+            <w:proofErr w:type="gramEnd"/>
+            <w:r>
+              <w:t>:String</w:t>
+            </w:r>
+            <w:proofErr w:type="spellEnd"/>
+            <w:r>
+              <w:t>) : Utente</w:t>
+            </w:r>
+          </w:p>
+          <w:p>
+            <w:pPr>
+              <w:spacing w:after="160" w:line="259" w:lineRule="auto"/>
+            </w:pPr>
+            <w:r>
+              <w:t xml:space="preserve">+ </w:t>
+            </w:r>
+            <w:proofErr w:type="spellStart"/>
+            <w:r>
               <w:t>getAllDipendentiInfo</w:t>
             </w:r>
             <w:proofErr w:type="spellEnd"/>
@@ -19073,6 +19134,7 @@
               <w:spacing w:after="160" w:line="259" w:lineRule="auto"/>
             </w:pPr>
             <w:r>
+              <w:lastRenderedPageBreak/>
               <w:t>Descrizione</w:t>
             </w:r>
           </w:p>
@@ -19107,7 +19169,6 @@
               <w:spacing w:after="160" w:line="259" w:lineRule="auto"/>
             </w:pPr>
             <w:r>
-              <w:lastRenderedPageBreak/>
               <w:t>Pre-condizione</w:t>
             </w:r>
           </w:p>
@@ -19152,6 +19213,14 @@
             <w:proofErr w:type="spellStart"/>
             <w:r>
               <w:t>utente:Utente</w:t>
+            </w:r>
+            <w:proofErr w:type="spellEnd"/>
+            <w:r>
+              <w:t xml:space="preserve">, </w:t>
+            </w:r>
+            <w:proofErr w:type="spellStart"/>
+            <w:r>
+              <w:t>password:String</w:t>
             </w:r>
             <w:proofErr w:type="spellEnd"/>
             <w:r>
@@ -20239,13 +20308,18 @@
         </w:tc>
       </w:tr>
       <w:tr>
+        <w:trPr>
+          <w:trHeight w:val="468"/>
+        </w:trPr>
         <w:tc>
           <w:tcPr>
             <w:tcW w:w="1696" w:type="dxa"/>
           </w:tcPr>
           <w:p>
             <w:pPr>
-              <w:spacing w:after="160" w:line="259" w:lineRule="auto"/>
+              <w:rPr>
+                <w:lang w:val="en-GB"/>
+              </w:rPr>
             </w:pPr>
             <w:r>
               <w:t>Firma metodo</w:t>
@@ -20258,43 +20332,50 @@
           </w:tcPr>
           <w:p>
             <w:pPr>
-              <w:spacing w:after="160" w:line="259" w:lineRule="auto"/>
+              <w:rPr>
+                <w:lang w:val="en-GB"/>
+              </w:rPr>
             </w:pPr>
             <w:r>
               <w:t xml:space="preserve">+ </w:t>
             </w:r>
             <w:proofErr w:type="spellStart"/>
             <w:r>
-              <w:t>getAllDipendentiInfo</w:t>
+              <w:t>findByEmail</w:t>
             </w:r>
             <w:proofErr w:type="spellEnd"/>
             <w:r>
               <w:t>(</w:t>
             </w:r>
             <w:proofErr w:type="spellStart"/>
-            <w:r>
-              <w:t>matricola:String</w:t>
-            </w:r>
-            <w:proofErr w:type="spellEnd"/>
-            <w:r>
-              <w:t xml:space="preserve">) : </w:t>
-            </w:r>
-            <w:proofErr w:type="spellStart"/>
-            <w:r>
-              <w:t>Informazioni:List</w:t>
-            </w:r>
-            <w:proofErr w:type="spellEnd"/>
+            <w:proofErr w:type="gramStart"/>
+            <w:r>
+              <w:t>email</w:t>
+            </w:r>
+            <w:proofErr w:type="gramEnd"/>
+            <w:r>
+              <w:t>:String</w:t>
+            </w:r>
+            <w:proofErr w:type="spellEnd"/>
+            <w:r>
+              <w:t>) : Utente</w:t>
+            </w:r>
           </w:p>
         </w:tc>
       </w:tr>
       <w:tr>
+        <w:trPr>
+          <w:trHeight w:val="468"/>
+        </w:trPr>
         <w:tc>
           <w:tcPr>
             <w:tcW w:w="1696" w:type="dxa"/>
           </w:tcPr>
           <w:p>
             <w:pPr>
-              <w:spacing w:after="160" w:line="259" w:lineRule="auto"/>
+              <w:rPr>
+                <w:lang w:val="en-GB"/>
+              </w:rPr>
             </w:pPr>
             <w:r>
               <w:t>Descrizione</w:t>
@@ -20306,23 +20387,36 @@
             <w:tcW w:w="8647" w:type="dxa"/>
           </w:tcPr>
           <w:p>
-            <w:pPr>
-              <w:spacing w:after="160" w:line="259" w:lineRule="auto"/>
-            </w:pPr>
-            <w:r>
-              <w:t>Recupera le informazioni di base (matricola, nome, cognome) di tutti i dipendenti di un supervisore la cui matricola è passata come parametro</w:t>
+            <w:r>
+              <w:t>Recupera dal database un U</w:t>
+            </w:r>
+            <w:r>
+              <w:t xml:space="preserve">tente con </w:t>
+            </w:r>
+            <w:proofErr w:type="gramStart"/>
+            <w:r>
+              <w:t>email</w:t>
+            </w:r>
+            <w:proofErr w:type="gramEnd"/>
+            <w:r>
+              <w:t xml:space="preserve"> corrispondente al parametro passato</w:t>
             </w:r>
           </w:p>
         </w:tc>
       </w:tr>
       <w:tr>
+        <w:trPr>
+          <w:trHeight w:val="468"/>
+        </w:trPr>
         <w:tc>
           <w:tcPr>
             <w:tcW w:w="1696" w:type="dxa"/>
           </w:tcPr>
           <w:p>
             <w:pPr>
-              <w:spacing w:after="160" w:line="259" w:lineRule="auto"/>
+              <w:rPr>
+                <w:lang w:val="en-GB"/>
+              </w:rPr>
             </w:pPr>
             <w:r>
               <w:lastRenderedPageBreak/>
@@ -20336,8 +20430,281 @@
           </w:tcPr>
           <w:p>
             <w:pPr>
+              <w:rPr>
+                <w:lang w:val="en-GB"/>
+              </w:rPr>
+            </w:pPr>
+            <w:r>
+              <w:rPr>
+                <w:lang w:val="en-GB"/>
+              </w:rPr>
+              <w:t xml:space="preserve">Context </w:t>
+            </w:r>
+            <w:proofErr w:type="spellStart"/>
+            <w:proofErr w:type="gramStart"/>
+            <w:r>
+              <w:rPr>
+                <w:lang w:val="en-GB"/>
+              </w:rPr>
+              <w:t>UtenteDAO</w:t>
+            </w:r>
+            <w:proofErr w:type="spellEnd"/>
+            <w:r>
+              <w:rPr>
+                <w:lang w:val="en-GB"/>
+              </w:rPr>
+              <w:t>::</w:t>
+            </w:r>
+            <w:proofErr w:type="spellStart"/>
+            <w:proofErr w:type="gramEnd"/>
+            <w:r>
+              <w:rPr>
+                <w:lang w:val="en-GB"/>
+              </w:rPr>
+              <w:t>findByEmail</w:t>
+            </w:r>
+            <w:proofErr w:type="spellEnd"/>
+            <w:r>
+              <w:rPr>
+                <w:lang w:val="en-GB"/>
+              </w:rPr>
+              <w:t>(email: String)</w:t>
+            </w:r>
+          </w:p>
+          <w:p>
+            <w:pPr>
+              <w:rPr>
+                <w:lang w:val="en-GB"/>
+              </w:rPr>
+            </w:pPr>
+            <w:proofErr w:type="gramStart"/>
+            <w:r>
+              <w:t>email</w:t>
+            </w:r>
+            <w:proofErr w:type="gramEnd"/>
+            <w:r>
+              <w:t xml:space="preserve"> &lt;&gt; </w:t>
+            </w:r>
+            <w:proofErr w:type="spellStart"/>
+            <w:r>
+              <w:t>null</w:t>
+            </w:r>
+            <w:proofErr w:type="spellEnd"/>
+          </w:p>
+        </w:tc>
+      </w:tr>
+      <w:tr>
+        <w:trPr>
+          <w:trHeight w:val="468"/>
+        </w:trPr>
+        <w:tc>
+          <w:tcPr>
+            <w:tcW w:w="1696" w:type="dxa"/>
+          </w:tcPr>
+          <w:p>
+            <w:pPr>
+              <w:rPr>
+                <w:lang w:val="en-GB"/>
+              </w:rPr>
+            </w:pPr>
+            <w:r>
+              <w:t>Post-condizione</w:t>
+            </w:r>
+          </w:p>
+        </w:tc>
+        <w:tc>
+          <w:tcPr>
+            <w:tcW w:w="8647" w:type="dxa"/>
+          </w:tcPr>
+          <w:p>
+            <w:pPr>
+              <w:rPr>
+                <w:lang w:val="en-GB"/>
+              </w:rPr>
+            </w:pPr>
+            <w:r>
+              <w:rPr>
+                <w:lang w:val="en-GB"/>
+              </w:rPr>
+              <w:t xml:space="preserve">Context </w:t>
+            </w:r>
+            <w:proofErr w:type="spellStart"/>
+            <w:proofErr w:type="gramStart"/>
+            <w:r>
+              <w:rPr>
+                <w:lang w:val="en-GB"/>
+              </w:rPr>
+              <w:t>UtenteDAO</w:t>
+            </w:r>
+            <w:proofErr w:type="spellEnd"/>
+            <w:r>
+              <w:rPr>
+                <w:lang w:val="en-GB"/>
+              </w:rPr>
+              <w:t>::</w:t>
+            </w:r>
+            <w:proofErr w:type="spellStart"/>
+            <w:proofErr w:type="gramEnd"/>
+            <w:r>
+              <w:rPr>
+                <w:lang w:val="en-GB"/>
+              </w:rPr>
+              <w:t>findByEmail</w:t>
+            </w:r>
+            <w:proofErr w:type="spellEnd"/>
+            <w:r>
+              <w:rPr>
+                <w:lang w:val="en-GB"/>
+              </w:rPr>
+              <w:t>(email: String)</w:t>
+            </w:r>
+          </w:p>
+          <w:p>
+            <w:pPr>
+              <w:rPr>
+                <w:lang w:val="en-GB"/>
+              </w:rPr>
+            </w:pPr>
+            <w:r>
+              <w:rPr>
+                <w:lang w:val="en-GB"/>
+              </w:rPr>
+              <w:t xml:space="preserve">Result = null OR </w:t>
+            </w:r>
+            <w:proofErr w:type="spellStart"/>
+            <w:r>
+              <w:rPr>
+                <w:lang w:val="en-GB"/>
+              </w:rPr>
+              <w:t>result.email</w:t>
+            </w:r>
+            <w:proofErr w:type="spellEnd"/>
+            <w:r>
+              <w:rPr>
+                <w:lang w:val="en-GB"/>
+              </w:rPr>
+              <w:t xml:space="preserve"> = email </w:t>
+            </w:r>
+          </w:p>
+        </w:tc>
+      </w:tr>
+      <w:tr>
+        <w:trPr>
+          <w:trHeight w:val="468"/>
+        </w:trPr>
+        <w:tc>
+          <w:tcPr>
+            <w:tcW w:w="10343" w:type="dxa"/>
+            <w:gridSpan w:val="2"/>
+          </w:tcPr>
+          <w:p>
+            <w:pPr>
+              <w:rPr>
+                <w:lang w:val="en-GB"/>
+              </w:rPr>
+            </w:pPr>
+          </w:p>
+        </w:tc>
+      </w:tr>
+      <w:tr>
+        <w:tc>
+          <w:tcPr>
+            <w:tcW w:w="1696" w:type="dxa"/>
+          </w:tcPr>
+          <w:p>
+            <w:pPr>
               <w:spacing w:after="160" w:line="259" w:lineRule="auto"/>
             </w:pPr>
+            <w:r>
+              <w:t>Firma metodo</w:t>
+            </w:r>
+          </w:p>
+        </w:tc>
+        <w:tc>
+          <w:tcPr>
+            <w:tcW w:w="8647" w:type="dxa"/>
+          </w:tcPr>
+          <w:p>
+            <w:pPr>
+              <w:spacing w:after="160" w:line="259" w:lineRule="auto"/>
+            </w:pPr>
+            <w:r>
+              <w:t xml:space="preserve">+ </w:t>
+            </w:r>
+            <w:proofErr w:type="spellStart"/>
+            <w:r>
+              <w:t>getAllDipendentiInfo</w:t>
+            </w:r>
+            <w:proofErr w:type="spellEnd"/>
+            <w:r>
+              <w:t>(</w:t>
+            </w:r>
+            <w:proofErr w:type="spellStart"/>
+            <w:r>
+              <w:t>matricola:String</w:t>
+            </w:r>
+            <w:proofErr w:type="spellEnd"/>
+            <w:r>
+              <w:t xml:space="preserve">) : </w:t>
+            </w:r>
+            <w:proofErr w:type="spellStart"/>
+            <w:r>
+              <w:t>Informazioni:List</w:t>
+            </w:r>
+            <w:proofErr w:type="spellEnd"/>
+          </w:p>
+        </w:tc>
+      </w:tr>
+      <w:tr>
+        <w:tc>
+          <w:tcPr>
+            <w:tcW w:w="1696" w:type="dxa"/>
+          </w:tcPr>
+          <w:p>
+            <w:pPr>
+              <w:spacing w:after="160" w:line="259" w:lineRule="auto"/>
+            </w:pPr>
+            <w:r>
+              <w:t>Descrizione</w:t>
+            </w:r>
+          </w:p>
+        </w:tc>
+        <w:tc>
+          <w:tcPr>
+            <w:tcW w:w="8647" w:type="dxa"/>
+          </w:tcPr>
+          <w:p>
+            <w:pPr>
+              <w:spacing w:after="160" w:line="259" w:lineRule="auto"/>
+            </w:pPr>
+            <w:r>
+              <w:t>Recupera le informazioni di base (matricola, nome, cognome) di tutti i dipendenti di un supervisore la cui matricola è passata come parametro</w:t>
+            </w:r>
+          </w:p>
+        </w:tc>
+      </w:tr>
+      <w:tr>
+        <w:tc>
+          <w:tcPr>
+            <w:tcW w:w="1696" w:type="dxa"/>
+          </w:tcPr>
+          <w:p>
+            <w:pPr>
+              <w:spacing w:after="160" w:line="259" w:lineRule="auto"/>
+            </w:pPr>
+            <w:r>
+              <w:t>Pre-condizione</w:t>
+            </w:r>
+          </w:p>
+        </w:tc>
+        <w:tc>
+          <w:tcPr>
+            <w:tcW w:w="8647" w:type="dxa"/>
+          </w:tcPr>
+          <w:p>
+            <w:pPr>
+              <w:spacing w:after="160" w:line="259" w:lineRule="auto"/>
+            </w:pPr>
             <w:proofErr w:type="spellStart"/>
             <w:r>
               <w:t>Context</w:t>
@@ -20378,10 +20745,7 @@
               <w:spacing w:after="160" w:line="259" w:lineRule="auto"/>
             </w:pPr>
             <w:r>
-              <w:t>m</w:t>
-            </w:r>
-            <w:r>
-              <w:t xml:space="preserve">atricola &lt;&gt; </w:t>
+              <w:t xml:space="preserve">matricola &lt;&gt; </w:t>
             </w:r>
             <w:proofErr w:type="spellStart"/>
             <w:r>
@@ -20893,10 +21257,7 @@
               <w:t>Permette di aggiornare il r</w:t>
             </w:r>
             <w:r>
-              <w:t xml:space="preserve">uolo </w:t>
-            </w:r>
-            <w:r>
-              <w:t>di un utente, sia come colonna della tabella che poi come presenza nelle tabelle dipendente e supervisore</w:t>
+              <w:t>uolo di un utente, sia come colonna della tabella che poi come presenza nelle tabelle dipendente e supervisore</w:t>
             </w:r>
           </w:p>
         </w:tc>
@@ -21202,6 +21563,7 @@
           </w:tcPr>
           <w:p>
             <w:r>
+              <w:lastRenderedPageBreak/>
               <w:t>Firma metodo</w:t>
             </w:r>
           </w:p>
@@ -21480,7 +21842,6 @@
           </w:tcPr>
           <w:p>
             <w:r>
-              <w:lastRenderedPageBreak/>
               <w:t>Firma metodo</w:t>
             </w:r>
           </w:p>
@@ -22412,6 +22773,7 @@
               <w:rPr>
                 <w:lang w:val="en-GB"/>
               </w:rPr>
+              <w:lastRenderedPageBreak/>
               <w:t xml:space="preserve">+ </w:t>
             </w:r>
             <w:proofErr w:type="spellStart"/>
@@ -22573,6 +22935,7 @@
               <w:spacing w:after="160" w:line="259" w:lineRule="auto"/>
             </w:pPr>
             <w:r>
+              <w:lastRenderedPageBreak/>
               <w:t>Invariante</w:t>
             </w:r>
           </w:p>
@@ -22610,7 +22973,6 @@
           </w:tcPr>
           <w:p>
             <w:r>
-              <w:lastRenderedPageBreak/>
               <w:t>Firma metodo</w:t>
             </w:r>
           </w:p>
@@ -23911,6 +24273,7 @@
           </w:tcPr>
           <w:p>
             <w:r>
+              <w:lastRenderedPageBreak/>
               <w:t>Firma metodo</w:t>
             </w:r>
           </w:p>
@@ -24192,7 +24555,6 @@
           </w:tcPr>
           <w:p>
             <w:r>
-              <w:lastRenderedPageBreak/>
               <w:t>Firma metodo</w:t>
             </w:r>
           </w:p>
@@ -24477,21 +24839,277 @@
           </w:p>
         </w:tc>
       </w:tr>
+      <w:tr>
+        <w:tc>
+          <w:tcPr>
+            <w:tcW w:w="9776" w:type="dxa"/>
+            <w:gridSpan w:val="2"/>
+          </w:tcPr>
+          <w:p>
+            <w:pPr>
+              <w:rPr>
+                <w:lang w:val="en-GB"/>
+              </w:rPr>
+            </w:pPr>
+          </w:p>
+        </w:tc>
+      </w:tr>
+      <w:tr>
+        <w:tc>
+          <w:tcPr>
+            <w:tcW w:w="2122" w:type="dxa"/>
+          </w:tcPr>
+          <w:p>
+            <w:r>
+              <w:t>Firma metodo</w:t>
+            </w:r>
+          </w:p>
+        </w:tc>
+        <w:tc>
+          <w:tcPr>
+            <w:tcW w:w="7654" w:type="dxa"/>
+          </w:tcPr>
+          <w:p>
+            <w:pPr>
+              <w:rPr>
+                <w:lang w:val="en-GB"/>
+              </w:rPr>
+            </w:pPr>
+            <w:r>
+              <w:rPr>
+                <w:lang w:val="en-GB"/>
+              </w:rPr>
+              <w:t xml:space="preserve">+ </w:t>
+            </w:r>
+            <w:proofErr w:type="spellStart"/>
+            <w:r>
+              <w:t>recuperaPassword</w:t>
+            </w:r>
+            <w:proofErr w:type="spellEnd"/>
+            <w:r>
+              <w:t>(email: String) : String</w:t>
+            </w:r>
+          </w:p>
+        </w:tc>
+      </w:tr>
+      <w:tr>
+        <w:tc>
+          <w:tcPr>
+            <w:tcW w:w="2122" w:type="dxa"/>
+          </w:tcPr>
+          <w:p>
+            <w:r>
+              <w:t>Descrizione</w:t>
+            </w:r>
+          </w:p>
+        </w:tc>
+        <w:tc>
+          <w:tcPr>
+            <w:tcW w:w="7654" w:type="dxa"/>
+          </w:tcPr>
+          <w:p>
+            <w:r>
+              <w:t>Cerca la password all’interno d</w:t>
+            </w:r>
+            <w:r>
+              <w:t xml:space="preserve">el database </w:t>
+            </w:r>
+            <w:proofErr w:type="gramStart"/>
+            <w:r>
+              <w:t>dell’email</w:t>
+            </w:r>
+            <w:proofErr w:type="gramEnd"/>
+            <w:r>
+              <w:t xml:space="preserve"> corrispondente</w:t>
+            </w:r>
+          </w:p>
+        </w:tc>
+      </w:tr>
+      <w:tr>
+        <w:tc>
+          <w:tcPr>
+            <w:tcW w:w="2122" w:type="dxa"/>
+          </w:tcPr>
+          <w:p>
+            <w:r>
+              <w:t>Pre-condizione</w:t>
+            </w:r>
+          </w:p>
+        </w:tc>
+        <w:tc>
+          <w:tcPr>
+            <w:tcW w:w="7654" w:type="dxa"/>
+          </w:tcPr>
+          <w:p>
+            <w:pPr>
+              <w:rPr>
+                <w:lang w:val="en-GB"/>
+              </w:rPr>
+            </w:pPr>
+            <w:r>
+              <w:rPr>
+                <w:lang w:val="en-GB"/>
+              </w:rPr>
+              <w:t xml:space="preserve">context </w:t>
+            </w:r>
+            <w:proofErr w:type="spellStart"/>
+            <w:proofErr w:type="gramStart"/>
+            <w:r>
+              <w:rPr>
+                <w:lang w:val="en-GB"/>
+              </w:rPr>
+              <w:t>UtenteDAO</w:t>
+            </w:r>
+            <w:proofErr w:type="spellEnd"/>
+            <w:r>
+              <w:rPr>
+                <w:lang w:val="en-GB"/>
+              </w:rPr>
+              <w:t>::</w:t>
+            </w:r>
+            <w:proofErr w:type="spellStart"/>
+            <w:proofErr w:type="gramEnd"/>
+            <w:r>
+              <w:rPr>
+                <w:lang w:val="en-GB"/>
+              </w:rPr>
+              <w:t>recuperaPassword</w:t>
+            </w:r>
+            <w:proofErr w:type="spellEnd"/>
+            <w:r>
+              <w:rPr>
+                <w:lang w:val="en-GB"/>
+              </w:rPr>
+              <w:t>(email: String)</w:t>
+            </w:r>
+          </w:p>
+          <w:p>
+            <w:pPr>
+              <w:rPr>
+                <w:lang w:val="en-GB"/>
+              </w:rPr>
+            </w:pPr>
+          </w:p>
+          <w:p>
+            <w:pPr>
+              <w:rPr>
+                <w:lang w:val="en-GB"/>
+              </w:rPr>
+            </w:pPr>
+            <w:proofErr w:type="gramStart"/>
+            <w:r>
+              <w:t>email</w:t>
+            </w:r>
+            <w:proofErr w:type="gramEnd"/>
+            <w:r>
+              <w:t xml:space="preserve"> &lt;&gt; </w:t>
+            </w:r>
+            <w:proofErr w:type="spellStart"/>
+            <w:r>
+              <w:t>null</w:t>
+            </w:r>
+            <w:proofErr w:type="spellEnd"/>
+          </w:p>
+        </w:tc>
+      </w:tr>
+      <w:tr>
+        <w:tc>
+          <w:tcPr>
+            <w:tcW w:w="2122" w:type="dxa"/>
+          </w:tcPr>
+          <w:p>
+            <w:r>
+              <w:t>Post-condizione</w:t>
+            </w:r>
+          </w:p>
+        </w:tc>
+        <w:tc>
+          <w:tcPr>
+            <w:tcW w:w="7654" w:type="dxa"/>
+          </w:tcPr>
+          <w:p>
+            <w:pPr>
+              <w:rPr>
+                <w:lang w:val="en-GB"/>
+              </w:rPr>
+            </w:pPr>
+            <w:r>
+              <w:rPr>
+                <w:lang w:val="en-GB"/>
+              </w:rPr>
+              <w:t xml:space="preserve">context </w:t>
+            </w:r>
+            <w:proofErr w:type="spellStart"/>
+            <w:proofErr w:type="gramStart"/>
+            <w:r>
+              <w:rPr>
+                <w:lang w:val="en-GB"/>
+              </w:rPr>
+              <w:t>UtenteDAO</w:t>
+            </w:r>
+            <w:proofErr w:type="spellEnd"/>
+            <w:r>
+              <w:rPr>
+                <w:lang w:val="en-GB"/>
+              </w:rPr>
+              <w:t>::</w:t>
+            </w:r>
+            <w:proofErr w:type="spellStart"/>
+            <w:proofErr w:type="gramEnd"/>
+            <w:r>
+              <w:rPr>
+                <w:lang w:val="en-GB"/>
+              </w:rPr>
+              <w:t>recuperaPassword</w:t>
+            </w:r>
+            <w:proofErr w:type="spellEnd"/>
+            <w:r>
+              <w:rPr>
+                <w:lang w:val="en-GB"/>
+              </w:rPr>
+              <w:t>(email: String)</w:t>
+            </w:r>
+          </w:p>
+          <w:p>
+            <w:pPr>
+              <w:rPr>
+                <w:lang w:val="en-GB"/>
+              </w:rPr>
+            </w:pPr>
+          </w:p>
+          <w:p>
+            <w:pPr>
+              <w:rPr>
+                <w:lang w:val="en-GB"/>
+              </w:rPr>
+            </w:pPr>
+            <w:r>
+              <w:rPr>
+                <w:lang w:val="en-GB"/>
+              </w:rPr>
+              <w:t xml:space="preserve">utenteTarget = Utente.allInstances()-&gt;any(u | u.email = email) </w:t>
+            </w:r>
+          </w:p>
+          <w:p>
+            <w:proofErr w:type="spellStart"/>
+            <w:r>
+              <w:t>result</w:t>
+            </w:r>
+            <w:proofErr w:type="spellEnd"/>
+            <w:r>
+              <w:t xml:space="preserve"> = </w:t>
+            </w:r>
+            <w:proofErr w:type="spellStart"/>
+            <w:r>
+              <w:t>utenteTarget.hashPassword</w:t>
+            </w:r>
+            <w:proofErr w:type="spellEnd"/>
+          </w:p>
+        </w:tc>
+      </w:tr>
     </w:tbl>
-    <w:p>
-      <w:pPr>
-        <w:rPr>
-          <w:lang w:val="en-GB"/>
-        </w:rPr>
-      </w:pPr>
-    </w:p>
-    <w:p>
-      <w:pPr>
-        <w:rPr>
-          <w:lang w:val="en-GB"/>
-        </w:rPr>
-      </w:pPr>
-    </w:p>
+    <w:p/>
+    <w:p/>
     <w:p>
       <w:pPr>
         <w:pStyle w:val="Titolo4"/>
@@ -24740,6 +25358,7 @@
           </w:tcPr>
           <w:p>
             <w:r>
+              <w:lastRenderedPageBreak/>
               <w:t>Descrizione</w:t>
             </w:r>
           </w:p>
@@ -25489,7 +26108,7 @@
               <w:b w:val="0"/>
               <w:sz w:val="20"/>
             </w:rPr>
-            <w:t>1</w:t>
+            <w:t>2</w:t>
           </w:r>
         </w:p>
       </w:tc>
@@ -25563,7 +26182,19 @@
             <w:rPr>
               <w:sz w:val="20"/>
             </w:rPr>
-            <w:t>22/01/2026</w:t>
+            <w:t>2</w:t>
+          </w:r>
+          <w:r>
+            <w:rPr>
+              <w:sz w:val="20"/>
+            </w:rPr>
+            <w:t>4</w:t>
+          </w:r>
+          <w:r>
+            <w:rPr>
+              <w:sz w:val="20"/>
+            </w:rPr>
+            <w:t>/01/2026</w:t>
           </w:r>
         </w:p>
       </w:tc>

</xml_diff>

<commit_message>
Mod: modificate alcune precondizioni metodi utente
Add: Aggiunto testplan per unit testing, iniziata stesura formale (non consegnabile)
</commit_message>
<xml_diff>
--- a/Workspace/ODD/ODD_EWMS.docx
+++ b/Workspace/ODD/ODD_EWMS.docx
@@ -18332,253 +18332,6 @@
       </w:r>
       <w:proofErr w:type="spellEnd"/>
     </w:p>
-    <w:p>
-      <w:pPr>
-        <w:rPr>
-          <w:lang w:val="en-GB"/>
-        </w:rPr>
-      </w:pPr>
-    </w:p>
-    <w:p>
-      <w:r>
-        <w:t>Per chiarezza del documento all’interno delle precondizioni per i metodi:</w:t>
-      </w:r>
-    </w:p>
-    <w:p>
-      <w:pPr>
-        <w:numPr>
-          <w:ilvl w:val="0"/>
-          <w:numId w:val="11"/>
-        </w:numPr>
-      </w:pPr>
-      <w:proofErr w:type="spellStart"/>
-      <w:r>
-        <w:t>createUtente</w:t>
-      </w:r>
-      <w:proofErr w:type="spellEnd"/>
-    </w:p>
-    <w:p>
-      <w:pPr>
-        <w:numPr>
-          <w:ilvl w:val="0"/>
-          <w:numId w:val="11"/>
-        </w:numPr>
-      </w:pPr>
-      <w:proofErr w:type="spellStart"/>
-      <w:r>
-        <w:t>createDipendente</w:t>
-      </w:r>
-      <w:proofErr w:type="spellEnd"/>
-      <w:r>
-        <w:t xml:space="preserve"> </w:t>
-      </w:r>
-    </w:p>
-    <w:p>
-      <w:pPr>
-        <w:numPr>
-          <w:ilvl w:val="0"/>
-          <w:numId w:val="11"/>
-        </w:numPr>
-      </w:pPr>
-      <w:proofErr w:type="spellStart"/>
-      <w:r>
-        <w:t>createSupervisore</w:t>
-      </w:r>
-      <w:proofErr w:type="spellEnd"/>
-    </w:p>
-    <w:p>
-      <w:pPr>
-        <w:numPr>
-          <w:ilvl w:val="0"/>
-          <w:numId w:val="11"/>
-        </w:numPr>
-      </w:pPr>
-      <w:proofErr w:type="spellStart"/>
-      <w:r>
-        <w:t>insertUtenteGenerico</w:t>
-      </w:r>
-      <w:proofErr w:type="spellEnd"/>
-    </w:p>
-    <w:p>
-      <w:r>
-        <w:t xml:space="preserve">Vale anche la seguente precondizione: </w:t>
-      </w:r>
-    </w:p>
-    <w:p>
-      <w:proofErr w:type="spellStart"/>
-      <w:r>
-        <w:t>utente:Utente</w:t>
-      </w:r>
-      <w:proofErr w:type="spellEnd"/>
-    </w:p>
-    <w:p>
-      <w:proofErr w:type="spellStart"/>
-      <w:r>
-        <w:t>utente.email</w:t>
-      </w:r>
-      <w:proofErr w:type="spellEnd"/>
-      <w:r>
-        <w:t xml:space="preserve"> &lt;&gt; </w:t>
-      </w:r>
-      <w:proofErr w:type="spellStart"/>
-      <w:r>
-        <w:t>null</w:t>
-      </w:r>
-      <w:proofErr w:type="spellEnd"/>
-      <w:r>
-        <w:t xml:space="preserve"> and </w:t>
-      </w:r>
-      <w:proofErr w:type="spellStart"/>
-      <w:r>
-        <w:t>utente.email.size</w:t>
-      </w:r>
-      <w:proofErr w:type="spellEnd"/>
-      <w:r>
-        <w:t xml:space="preserve">() &gt; 0 and </w:t>
-      </w:r>
-      <w:proofErr w:type="spellStart"/>
-      <w:r>
-        <w:t>utente.nome</w:t>
-      </w:r>
-      <w:proofErr w:type="spellEnd"/>
-      <w:r>
-        <w:t xml:space="preserve"> &lt;&gt; </w:t>
-      </w:r>
-      <w:proofErr w:type="spellStart"/>
-      <w:r>
-        <w:t>null</w:t>
-      </w:r>
-      <w:proofErr w:type="spellEnd"/>
-      <w:r>
-        <w:t xml:space="preserve"> and </w:t>
-      </w:r>
-      <w:proofErr w:type="spellStart"/>
-      <w:r>
-        <w:t>utente.nome.size</w:t>
-      </w:r>
-      <w:proofErr w:type="spellEnd"/>
-      <w:r>
-        <w:t xml:space="preserve">() &gt; 0 and </w:t>
-      </w:r>
-      <w:proofErr w:type="spellStart"/>
-      <w:r>
-        <w:t>utente.cognome</w:t>
-      </w:r>
-      <w:proofErr w:type="spellEnd"/>
-      <w:r>
-        <w:t xml:space="preserve"> &lt;&gt; </w:t>
-      </w:r>
-      <w:proofErr w:type="spellStart"/>
-      <w:r>
-        <w:t>null</w:t>
-      </w:r>
-      <w:proofErr w:type="spellEnd"/>
-      <w:r>
-        <w:t xml:space="preserve"> and </w:t>
-      </w:r>
-      <w:proofErr w:type="spellStart"/>
-      <w:r>
-        <w:t>utente.cognome.size</w:t>
-      </w:r>
-      <w:proofErr w:type="spellEnd"/>
-      <w:r>
-        <w:t xml:space="preserve">() &gt; 0 and </w:t>
-      </w:r>
-      <w:proofErr w:type="spellStart"/>
-      <w:r>
-        <w:t>utente.ruolo</w:t>
-      </w:r>
-      <w:proofErr w:type="spellEnd"/>
-      <w:r>
-        <w:t xml:space="preserve"> &lt;&gt; </w:t>
-      </w:r>
-      <w:proofErr w:type="spellStart"/>
-      <w:r>
-        <w:t>null</w:t>
-      </w:r>
-      <w:proofErr w:type="spellEnd"/>
-      <w:r>
-        <w:t xml:space="preserve"> and </w:t>
-      </w:r>
-      <w:proofErr w:type="spellStart"/>
-      <w:r>
-        <w:t>utente.dataNasc</w:t>
-      </w:r>
-      <w:proofErr w:type="spellEnd"/>
-      <w:r>
-        <w:t xml:space="preserve"> &lt;&gt; </w:t>
-      </w:r>
-      <w:proofErr w:type="spellStart"/>
-      <w:r>
-        <w:t>null</w:t>
-      </w:r>
-      <w:proofErr w:type="spellEnd"/>
-    </w:p>
-    <w:p/>
-    <w:p>
-      <w:pPr>
-        <w:rPr>
-          <w:i/>
-          <w:iCs/>
-        </w:rPr>
-      </w:pPr>
-      <w:r>
-        <w:t>I metodi “</w:t>
-      </w:r>
-      <w:proofErr w:type="spellStart"/>
-      <w:r>
-        <w:t>createDipendente</w:t>
-      </w:r>
-      <w:proofErr w:type="spellEnd"/>
-      <w:r>
-        <w:t>” e “</w:t>
-      </w:r>
-      <w:proofErr w:type="spellStart"/>
-      <w:r>
-        <w:t>createSupervisore</w:t>
-      </w:r>
-      <w:proofErr w:type="spellEnd"/>
-      <w:r>
-        <w:t>” condividono queste precondizioni anche se hanno come parametro “</w:t>
-      </w:r>
-      <w:r>
-        <w:rPr>
-          <w:i/>
-          <w:iCs/>
-        </w:rPr>
-        <w:t>Dipendente</w:t>
-      </w:r>
-      <w:r>
-        <w:t>” e “</w:t>
-      </w:r>
-      <w:r>
-        <w:rPr>
-          <w:i/>
-          <w:iCs/>
-        </w:rPr>
-        <w:t>Supervisore</w:t>
-      </w:r>
-      <w:r>
-        <w:t>”</w:t>
-      </w:r>
-      <w:r>
-        <w:t xml:space="preserve"> </w:t>
-      </w:r>
-      <w:r>
-        <w:t xml:space="preserve">poiché questi ultimi </w:t>
-      </w:r>
-      <w:r>
-        <w:t xml:space="preserve">sono </w:t>
-      </w:r>
-      <w:r>
-        <w:t>sottoclassi di Utente</w:t>
-      </w:r>
-      <w:r>
-        <w:t>.</w:t>
-      </w:r>
-    </w:p>
-    <w:p/>
-    <w:p/>
     <w:p/>
     <w:tbl>
       <w:tblPr>
@@ -18933,7 +18686,6 @@
               <w:spacing w:after="160" w:line="259" w:lineRule="auto"/>
             </w:pPr>
             <w:r>
-              <w:lastRenderedPageBreak/>
               <w:t>Post-condizione</w:t>
             </w:r>
           </w:p>
@@ -19604,8 +19356,16 @@
           <w:p>
             <w:pPr>
               <w:spacing w:after="160" w:line="259" w:lineRule="auto"/>
-            </w:pPr>
-            <w:r>
+              <w:rPr>
+                <w:b/>
+                <w:bCs/>
+              </w:rPr>
+            </w:pPr>
+            <w:r>
+              <w:rPr>
+                <w:b/>
+                <w:bCs/>
+              </w:rPr>
               <w:t>Nome classe</w:t>
             </w:r>
           </w:p>
@@ -19637,8 +19397,16 @@
           <w:p>
             <w:pPr>
               <w:spacing w:after="160" w:line="259" w:lineRule="auto"/>
-            </w:pPr>
-            <w:r>
+              <w:rPr>
+                <w:b/>
+                <w:bCs/>
+              </w:rPr>
+            </w:pPr>
+            <w:r>
+              <w:rPr>
+                <w:b/>
+                <w:bCs/>
+              </w:rPr>
               <w:t>Descrizione</w:t>
             </w:r>
           </w:p>
@@ -19665,8 +19433,16 @@
           <w:p>
             <w:pPr>
               <w:spacing w:after="160" w:line="259" w:lineRule="auto"/>
-            </w:pPr>
-            <w:r>
+              <w:rPr>
+                <w:b/>
+                <w:bCs/>
+              </w:rPr>
+            </w:pPr>
+            <w:r>
+              <w:rPr>
+                <w:b/>
+                <w:bCs/>
+              </w:rPr>
               <w:t>Metodi</w:t>
             </w:r>
           </w:p>
@@ -20022,7 +19798,6 @@
               <w:rPr>
                 <w:lang w:val="en-GB"/>
               </w:rPr>
-              <w:lastRenderedPageBreak/>
               <w:t xml:space="preserve">- </w:t>
             </w:r>
             <w:proofErr w:type="spellStart"/>
@@ -20435,9 +20210,16 @@
           <w:p>
             <w:pPr>
               <w:spacing w:after="160" w:line="259" w:lineRule="auto"/>
-            </w:pPr>
-            <w:r>
-              <w:lastRenderedPageBreak/>
+              <w:rPr>
+                <w:b/>
+                <w:bCs/>
+              </w:rPr>
+            </w:pPr>
+            <w:r>
+              <w:rPr>
+                <w:b/>
+                <w:bCs/>
+              </w:rPr>
               <w:t>Invariante</w:t>
             </w:r>
           </w:p>
@@ -20480,8 +20262,16 @@
           <w:p>
             <w:pPr>
               <w:spacing w:after="160" w:line="259" w:lineRule="auto"/>
-            </w:pPr>
-            <w:r>
+              <w:rPr>
+                <w:b/>
+                <w:bCs/>
+              </w:rPr>
+            </w:pPr>
+            <w:r>
+              <w:rPr>
+                <w:b/>
+                <w:bCs/>
+              </w:rPr>
               <w:t>Firma metodo</w:t>
             </w:r>
           </w:p>
@@ -20559,8 +20349,16 @@
           <w:p>
             <w:pPr>
               <w:spacing w:after="160" w:line="259" w:lineRule="auto"/>
-            </w:pPr>
-            <w:r>
+              <w:rPr>
+                <w:b/>
+                <w:bCs/>
+              </w:rPr>
+            </w:pPr>
+            <w:r>
+              <w:rPr>
+                <w:b/>
+                <w:bCs/>
+              </w:rPr>
               <w:t>Descrizione</w:t>
             </w:r>
           </w:p>
@@ -20599,8 +20397,16 @@
           <w:p>
             <w:pPr>
               <w:spacing w:after="160" w:line="259" w:lineRule="auto"/>
-            </w:pPr>
-            <w:r>
+              <w:rPr>
+                <w:b/>
+                <w:bCs/>
+              </w:rPr>
+            </w:pPr>
+            <w:r>
+              <w:rPr>
+                <w:b/>
+                <w:bCs/>
+              </w:rPr>
               <w:t>Pre-condizione</w:t>
             </w:r>
           </w:p>
@@ -20622,6 +20428,7 @@
               <w:t xml:space="preserve"> </w:t>
             </w:r>
             <w:proofErr w:type="spellStart"/>
+            <w:proofErr w:type="gramStart"/>
             <w:r>
               <w:t>UtenteDAO</w:t>
             </w:r>
@@ -20630,6 +20437,7 @@
               <w:t>::</w:t>
             </w:r>
             <w:proofErr w:type="spellStart"/>
+            <w:proofErr w:type="gramEnd"/>
             <w:r>
               <w:t>create</w:t>
             </w:r>
@@ -20681,7 +20489,15 @@
             </w:r>
             <w:proofErr w:type="spellEnd"/>
             <w:r>
-              <w:t xml:space="preserve"> = Tipi::ruolo::G</w:t>
+              <w:t xml:space="preserve"> = </w:t>
+            </w:r>
+            <w:proofErr w:type="gramStart"/>
+            <w:r>
+              <w:t>Tipi::ruolo::</w:t>
+            </w:r>
+            <w:proofErr w:type="gramEnd"/>
+            <w:r>
+              <w:t>G</w:t>
             </w:r>
             <w:r>
               <w:t xml:space="preserve">ESTORE and </w:t>
@@ -20705,8 +20521,16 @@
           <w:p>
             <w:pPr>
               <w:spacing w:after="160" w:line="259" w:lineRule="auto"/>
-            </w:pPr>
-            <w:r>
+              <w:rPr>
+                <w:b/>
+                <w:bCs/>
+              </w:rPr>
+            </w:pPr>
+            <w:r>
+              <w:rPr>
+                <w:b/>
+                <w:bCs/>
+              </w:rPr>
               <w:t>Post-condizione</w:t>
             </w:r>
           </w:p>
@@ -20728,6 +20552,7 @@
               <w:t xml:space="preserve"> </w:t>
             </w:r>
             <w:proofErr w:type="spellStart"/>
+            <w:proofErr w:type="gramStart"/>
             <w:r>
               <w:t>UtenteDAO</w:t>
             </w:r>
@@ -20736,6 +20561,7 @@
               <w:t>::</w:t>
             </w:r>
             <w:proofErr w:type="spellStart"/>
+            <w:proofErr w:type="gramEnd"/>
             <w:r>
               <w:t>create</w:t>
             </w:r>
@@ -20999,7 +20825,15 @@
             </w:r>
             <w:proofErr w:type="spellEnd"/>
             <w:r>
-              <w:t xml:space="preserve"> =Tipi::ruolo::DIPENDENTE</w:t>
+              <w:t xml:space="preserve"> =</w:t>
+            </w:r>
+            <w:proofErr w:type="gramStart"/>
+            <w:r>
+              <w:t>Tipi::ruolo::</w:t>
+            </w:r>
+            <w:proofErr w:type="gramEnd"/>
+            <w:r>
+              <w:t>DIPENDENTE</w:t>
             </w:r>
             <w:r>
               <w:t xml:space="preserve"> </w:t>
@@ -21031,6 +20865,17 @@
               <w:t>null</w:t>
             </w:r>
             <w:proofErr w:type="spellEnd"/>
+            <w:r>
+              <w:t xml:space="preserve"> and </w:t>
+            </w:r>
+            <w:proofErr w:type="spellStart"/>
+            <w:r>
+              <w:t>dipendente.supervisoreInfo.matricola</w:t>
+            </w:r>
+            <w:proofErr w:type="spellEnd"/>
+            <w:r>
+              <w:t xml:space="preserve"> &gt; 0</w:t>
+            </w:r>
           </w:p>
           <w:p/>
         </w:tc>
@@ -21340,7 +21185,6 @@
           </w:p>
           <w:p>
             <w:r>
-              <w:lastRenderedPageBreak/>
               <w:t xml:space="preserve">supervisore &lt;&gt; </w:t>
             </w:r>
             <w:proofErr w:type="spellStart"/>
@@ -21383,7 +21227,6 @@
           </w:tcPr>
           <w:p>
             <w:r>
-              <w:lastRenderedPageBreak/>
               <w:t>Post-condizione</w:t>
             </w:r>
           </w:p>
@@ -21607,6 +21450,14 @@
             <w:r>
               <w:t>)</w:t>
             </w:r>
+            <w:r>
+              <w:t xml:space="preserve"> : </w:t>
+            </w:r>
+            <w:proofErr w:type="spellStart"/>
+            <w:r>
+              <w:t>void</w:t>
+            </w:r>
+            <w:proofErr w:type="spellEnd"/>
           </w:p>
         </w:tc>
       </w:tr>
@@ -21653,7 +21504,11 @@
               <w:t>createSupervisore</w:t>
             </w:r>
             <w:proofErr w:type="spellEnd"/>
-          </w:p>
+            <w:r>
+              <w:t>.</w:t>
+            </w:r>
+          </w:p>
+          <w:p/>
         </w:tc>
       </w:tr>
       <w:tr>
@@ -21675,14 +21530,234 @@
             <w:tcW w:w="8647" w:type="dxa"/>
           </w:tcPr>
           <w:p>
-            <w:r>
-              <w:t xml:space="preserve">//Stesse di </w:t>
-            </w:r>
-            <w:proofErr w:type="spellStart"/>
-            <w:r>
-              <w:t>createUtente</w:t>
-            </w:r>
-            <w:proofErr w:type="spellEnd"/>
+            <w:pPr>
+              <w:rPr>
+                <w:lang w:val="en-GB"/>
+              </w:rPr>
+            </w:pPr>
+            <w:r>
+              <w:rPr>
+                <w:lang w:val="en-GB"/>
+              </w:rPr>
+              <w:t xml:space="preserve">Context </w:t>
+            </w:r>
+            <w:proofErr w:type="spellStart"/>
+            <w:proofErr w:type="gramStart"/>
+            <w:r>
+              <w:rPr>
+                <w:lang w:val="en-GB"/>
+              </w:rPr>
+              <w:t>UtenteDAO</w:t>
+            </w:r>
+            <w:proofErr w:type="spellEnd"/>
+            <w:r>
+              <w:rPr>
+                <w:lang w:val="en-GB"/>
+              </w:rPr>
+              <w:t>::</w:t>
+            </w:r>
+            <w:proofErr w:type="gramEnd"/>
+            <w:r>
+              <w:rPr>
+                <w:lang w:val="en-GB"/>
+              </w:rPr>
+              <w:t xml:space="preserve"> </w:t>
+            </w:r>
+            <w:proofErr w:type="spellStart"/>
+            <w:r>
+              <w:rPr>
+                <w:lang w:val="en-GB"/>
+              </w:rPr>
+              <w:t>insertUtenteGenerico</w:t>
+            </w:r>
+            <w:proofErr w:type="spellEnd"/>
+            <w:r>
+              <w:rPr>
+                <w:lang w:val="en-GB"/>
+              </w:rPr>
+              <w:t>(</w:t>
+            </w:r>
+            <w:proofErr w:type="spellStart"/>
+            <w:r>
+              <w:rPr>
+                <w:lang w:val="en-GB"/>
+              </w:rPr>
+              <w:t>connection:Connection</w:t>
+            </w:r>
+            <w:proofErr w:type="spellEnd"/>
+            <w:r>
+              <w:rPr>
+                <w:lang w:val="en-GB"/>
+              </w:rPr>
+              <w:t xml:space="preserve">, </w:t>
+            </w:r>
+            <w:proofErr w:type="spellStart"/>
+            <w:r>
+              <w:rPr>
+                <w:lang w:val="en-GB"/>
+              </w:rPr>
+              <w:t>utente:Utente</w:t>
+            </w:r>
+            <w:proofErr w:type="spellEnd"/>
+            <w:r>
+              <w:rPr>
+                <w:lang w:val="en-GB"/>
+              </w:rPr>
+              <w:t xml:space="preserve">, </w:t>
+            </w:r>
+            <w:proofErr w:type="spellStart"/>
+            <w:r>
+              <w:rPr>
+                <w:lang w:val="en-GB"/>
+              </w:rPr>
+              <w:t>password:String</w:t>
+            </w:r>
+            <w:proofErr w:type="spellEnd"/>
+            <w:r>
+              <w:rPr>
+                <w:lang w:val="en-GB"/>
+              </w:rPr>
+              <w:t>)</w:t>
+            </w:r>
+          </w:p>
+          <w:p>
+            <w:pPr>
+              <w:rPr>
+                <w:lang w:val="en-GB"/>
+              </w:rPr>
+            </w:pPr>
+            <w:r>
+              <w:rPr>
+                <w:lang w:val="en-GB"/>
+              </w:rPr>
+              <w:br/>
+              <w:t>connection &lt;&gt; null a</w:t>
+            </w:r>
+            <w:r>
+              <w:rPr>
+                <w:lang w:val="en-GB"/>
+              </w:rPr>
+              <w:t xml:space="preserve">nd </w:t>
+            </w:r>
+            <w:proofErr w:type="spellStart"/>
+            <w:r>
+              <w:rPr>
+                <w:lang w:val="en-GB"/>
+              </w:rPr>
+              <w:t>utente.email</w:t>
+            </w:r>
+            <w:proofErr w:type="spellEnd"/>
+            <w:r>
+              <w:rPr>
+                <w:lang w:val="en-GB"/>
+              </w:rPr>
+              <w:t xml:space="preserve"> &lt;&gt; null and </w:t>
+            </w:r>
+            <w:proofErr w:type="spellStart"/>
+            <w:r>
+              <w:rPr>
+                <w:lang w:val="en-GB"/>
+              </w:rPr>
+              <w:t>utente.email.size</w:t>
+            </w:r>
+            <w:proofErr w:type="spellEnd"/>
+            <w:r>
+              <w:rPr>
+                <w:lang w:val="en-GB"/>
+              </w:rPr>
+              <w:t xml:space="preserve">() &gt; 0 and </w:t>
+            </w:r>
+            <w:proofErr w:type="spellStart"/>
+            <w:r>
+              <w:rPr>
+                <w:lang w:val="en-GB"/>
+              </w:rPr>
+              <w:t>utente.nome</w:t>
+            </w:r>
+            <w:proofErr w:type="spellEnd"/>
+            <w:r>
+              <w:rPr>
+                <w:lang w:val="en-GB"/>
+              </w:rPr>
+              <w:t xml:space="preserve"> &lt;&gt; null and </w:t>
+            </w:r>
+            <w:proofErr w:type="spellStart"/>
+            <w:r>
+              <w:rPr>
+                <w:lang w:val="en-GB"/>
+              </w:rPr>
+              <w:t>utente.nome.size</w:t>
+            </w:r>
+            <w:proofErr w:type="spellEnd"/>
+            <w:r>
+              <w:rPr>
+                <w:lang w:val="en-GB"/>
+              </w:rPr>
+              <w:t xml:space="preserve">() &gt; 0 and </w:t>
+            </w:r>
+            <w:proofErr w:type="spellStart"/>
+            <w:r>
+              <w:rPr>
+                <w:lang w:val="en-GB"/>
+              </w:rPr>
+              <w:t>utente.cognome</w:t>
+            </w:r>
+            <w:proofErr w:type="spellEnd"/>
+            <w:r>
+              <w:rPr>
+                <w:lang w:val="en-GB"/>
+              </w:rPr>
+              <w:t xml:space="preserve"> &lt;&gt; null and </w:t>
+            </w:r>
+            <w:proofErr w:type="spellStart"/>
+            <w:r>
+              <w:rPr>
+                <w:lang w:val="en-GB"/>
+              </w:rPr>
+              <w:t>utente.cognome.size</w:t>
+            </w:r>
+            <w:proofErr w:type="spellEnd"/>
+            <w:r>
+              <w:rPr>
+                <w:lang w:val="en-GB"/>
+              </w:rPr>
+              <w:t xml:space="preserve">() &gt; 0 and </w:t>
+            </w:r>
+            <w:proofErr w:type="spellStart"/>
+            <w:r>
+              <w:rPr>
+                <w:lang w:val="en-GB"/>
+              </w:rPr>
+              <w:t>utente.ruolo</w:t>
+            </w:r>
+            <w:proofErr w:type="spellEnd"/>
+            <w:r>
+              <w:rPr>
+                <w:lang w:val="en-GB"/>
+              </w:rPr>
+              <w:t xml:space="preserve"> &lt;&gt; null and </w:t>
+            </w:r>
+            <w:proofErr w:type="spellStart"/>
+            <w:r>
+              <w:rPr>
+                <w:lang w:val="en-GB"/>
+              </w:rPr>
+              <w:t>utente.dataNasc</w:t>
+            </w:r>
+            <w:proofErr w:type="spellEnd"/>
+            <w:r>
+              <w:rPr>
+                <w:lang w:val="en-GB"/>
+              </w:rPr>
+              <w:t xml:space="preserve"> &lt;&gt; null</w:t>
+            </w:r>
+          </w:p>
+          <w:p>
+            <w:pPr>
+              <w:rPr>
+                <w:lang w:val="en-GB"/>
+              </w:rPr>
+            </w:pPr>
           </w:p>
         </w:tc>
       </w:tr>
@@ -21836,6 +21911,7 @@
               <w:spacing w:after="160" w:line="259" w:lineRule="auto"/>
             </w:pPr>
             <w:r>
+              <w:lastRenderedPageBreak/>
               <w:t>Descrizione</w:t>
             </w:r>
           </w:p>
@@ -21998,6 +22074,155 @@
             </w:r>
           </w:p>
           <w:p>
+            <w:proofErr w:type="spellStart"/>
+            <w:r>
+              <w:t>targetUtente</w:t>
+            </w:r>
+            <w:proofErr w:type="spellEnd"/>
+            <w:r>
+              <w:t xml:space="preserve"> = </w:t>
+            </w:r>
+            <w:proofErr w:type="spellStart"/>
+            <w:r>
+              <w:t>Utente.allIstances</w:t>
+            </w:r>
+            <w:proofErr w:type="spellEnd"/>
+            <w:r>
+              <w:t>()-&gt;</w:t>
+            </w:r>
+            <w:proofErr w:type="spellStart"/>
+            <w:r>
+              <w:t>select</w:t>
+            </w:r>
+            <w:proofErr w:type="spellEnd"/>
+            <w:r>
+              <w:t xml:space="preserve">(u | </w:t>
+            </w:r>
+            <w:proofErr w:type="spellStart"/>
+            <w:r>
+              <w:t>u.</w:t>
+            </w:r>
+            <w:r>
+              <w:t>matricola</w:t>
+            </w:r>
+            <w:proofErr w:type="spellEnd"/>
+            <w:r>
+              <w:t xml:space="preserve"> =</w:t>
+            </w:r>
+            <w:r>
+              <w:t xml:space="preserve"> ma</w:t>
+            </w:r>
+            <w:r>
+              <w:t>tricola</w:t>
+            </w:r>
+            <w:r>
+              <w:t>)</w:t>
+            </w:r>
+          </w:p>
+          <w:p/>
+          <w:p>
+            <w:pPr>
+              <w:rPr>
+                <w:lang w:val="en-GB"/>
+              </w:rPr>
+            </w:pPr>
+            <w:r>
+              <w:rPr>
+                <w:lang w:val="en-GB"/>
+              </w:rPr>
+              <w:t xml:space="preserve">if </w:t>
+            </w:r>
+            <w:proofErr w:type="spellStart"/>
+            <w:r>
+              <w:rPr>
+                <w:lang w:val="en-GB"/>
+              </w:rPr>
+              <w:t>targetUtente</w:t>
+            </w:r>
+            <w:proofErr w:type="spellEnd"/>
+            <w:r>
+              <w:rPr>
+                <w:lang w:val="en-GB"/>
+              </w:rPr>
+              <w:t xml:space="preserve"> &lt;&gt; null </w:t>
+            </w:r>
+          </w:p>
+          <w:p>
+            <w:pPr>
+              <w:rPr>
+                <w:lang w:val="en-GB"/>
+              </w:rPr>
+            </w:pPr>
+          </w:p>
+          <w:p>
+            <w:pPr>
+              <w:rPr>
+                <w:lang w:val="en-GB"/>
+              </w:rPr>
+            </w:pPr>
+            <w:r>
+              <w:rPr>
+                <w:lang w:val="en-GB"/>
+              </w:rPr>
+              <w:t xml:space="preserve">   result = </w:t>
+            </w:r>
+            <w:proofErr w:type="spellStart"/>
+            <w:r>
+              <w:rPr>
+                <w:lang w:val="en-GB"/>
+              </w:rPr>
+              <w:t>targetUtente</w:t>
+            </w:r>
+            <w:proofErr w:type="spellEnd"/>
+          </w:p>
+          <w:p>
+            <w:pPr>
+              <w:rPr>
+                <w:lang w:val="en-GB"/>
+              </w:rPr>
+            </w:pPr>
+          </w:p>
+          <w:p>
+            <w:pPr>
+              <w:rPr>
+                <w:lang w:val="en-GB"/>
+              </w:rPr>
+            </w:pPr>
+            <w:r>
+              <w:rPr>
+                <w:lang w:val="en-GB"/>
+              </w:rPr>
+              <w:t>else</w:t>
+            </w:r>
+          </w:p>
+          <w:p>
+            <w:pPr>
+              <w:rPr>
+                <w:lang w:val="en-GB"/>
+              </w:rPr>
+            </w:pPr>
+          </w:p>
+          <w:p>
+            <w:pPr>
+              <w:rPr>
+                <w:lang w:val="en-GB"/>
+              </w:rPr>
+            </w:pPr>
+            <w:r>
+              <w:rPr>
+                <w:lang w:val="en-GB"/>
+              </w:rPr>
+              <w:t xml:space="preserve">  result = null</w:t>
+            </w:r>
+          </w:p>
+          <w:p>
+            <w:pPr>
+              <w:rPr>
+                <w:lang w:val="en-GB"/>
+              </w:rPr>
+            </w:pPr>
+          </w:p>
+          <w:p>
             <w:pPr>
               <w:spacing w:after="160" w:line="259" w:lineRule="auto"/>
               <w:rPr>
@@ -22008,61 +22233,7 @@
               <w:rPr>
                 <w:lang w:val="en-GB"/>
               </w:rPr>
-              <w:t xml:space="preserve">result = </w:t>
-            </w:r>
-            <w:proofErr w:type="spellStart"/>
-            <w:r>
-              <w:rPr>
-                <w:lang w:val="en-GB"/>
-              </w:rPr>
-              <w:t>Utente.allInstances</w:t>
-            </w:r>
-            <w:proofErr w:type="spellEnd"/>
-            <w:r>
-              <w:rPr>
-                <w:lang w:val="en-GB"/>
-              </w:rPr>
-              <w:t xml:space="preserve">()-&gt;any(u | </w:t>
-            </w:r>
-            <w:proofErr w:type="spellStart"/>
-            <w:r>
-              <w:rPr>
-                <w:lang w:val="en-GB"/>
-              </w:rPr>
-              <w:t>u.</w:t>
-            </w:r>
-            <w:r>
-              <w:rPr>
-                <w:lang w:val="en-GB"/>
-              </w:rPr>
-              <w:t>matricola</w:t>
-            </w:r>
-            <w:proofErr w:type="spellEnd"/>
-            <w:r>
-              <w:rPr>
-                <w:lang w:val="en-GB"/>
-              </w:rPr>
-              <w:t xml:space="preserve"> =</w:t>
-            </w:r>
-            <w:r>
-              <w:rPr>
-                <w:lang w:val="en-GB"/>
-              </w:rPr>
-              <w:t xml:space="preserve"> </w:t>
-            </w:r>
-            <w:proofErr w:type="spellStart"/>
-            <w:r>
-              <w:rPr>
-                <w:lang w:val="en-GB"/>
-              </w:rPr>
-              <w:t>matricola</w:t>
-            </w:r>
-            <w:proofErr w:type="spellEnd"/>
-            <w:r>
-              <w:rPr>
-                <w:lang w:val="en-GB"/>
-              </w:rPr>
-              <w:t>)</w:t>
+              <w:t>endif</w:t>
             </w:r>
           </w:p>
         </w:tc>
@@ -22321,26 +22492,184 @@
                 <w:lang w:val="en-GB"/>
               </w:rPr>
             </w:pPr>
-            <w:r>
-              <w:rPr>
-                <w:lang w:val="en-GB"/>
-              </w:rPr>
-              <w:t xml:space="preserve">Result = null OR </w:t>
-            </w:r>
-            <w:proofErr w:type="spellStart"/>
-            <w:r>
-              <w:rPr>
-                <w:lang w:val="en-GB"/>
-              </w:rPr>
-              <w:t>result.email</w:t>
-            </w:r>
-            <w:proofErr w:type="spellEnd"/>
-            <w:r>
-              <w:rPr>
-                <w:lang w:val="en-GB"/>
-              </w:rPr>
-              <w:t xml:space="preserve"> = email </w:t>
-            </w:r>
+          </w:p>
+          <w:p>
+            <w:pPr>
+              <w:rPr>
+                <w:lang w:val="en-GB"/>
+              </w:rPr>
+            </w:pPr>
+            <w:proofErr w:type="spellStart"/>
+            <w:r>
+              <w:rPr>
+                <w:lang w:val="en-GB"/>
+              </w:rPr>
+              <w:t>targetUtente</w:t>
+            </w:r>
+            <w:proofErr w:type="spellEnd"/>
+            <w:r>
+              <w:rPr>
+                <w:lang w:val="en-GB"/>
+              </w:rPr>
+              <w:t xml:space="preserve"> = </w:t>
+            </w:r>
+            <w:proofErr w:type="spellStart"/>
+            <w:r>
+              <w:rPr>
+                <w:lang w:val="en-GB"/>
+              </w:rPr>
+              <w:t>Utente.allIstances</w:t>
+            </w:r>
+            <w:proofErr w:type="spellEnd"/>
+            <w:r>
+              <w:rPr>
+                <w:lang w:val="en-GB"/>
+              </w:rPr>
+              <w:t xml:space="preserve">()-&gt;select(u | </w:t>
+            </w:r>
+            <w:proofErr w:type="spellStart"/>
+            <w:r>
+              <w:rPr>
+                <w:lang w:val="en-GB"/>
+              </w:rPr>
+              <w:t>u.email</w:t>
+            </w:r>
+            <w:proofErr w:type="spellEnd"/>
+            <w:r>
+              <w:rPr>
+                <w:lang w:val="en-GB"/>
+              </w:rPr>
+              <w:t xml:space="preserve"> = email)</w:t>
+            </w:r>
+          </w:p>
+          <w:p>
+            <w:pPr>
+              <w:rPr>
+                <w:lang w:val="en-GB"/>
+              </w:rPr>
+            </w:pPr>
+          </w:p>
+          <w:p>
+            <w:pPr>
+              <w:rPr>
+                <w:lang w:val="en-GB"/>
+              </w:rPr>
+            </w:pPr>
+            <w:r>
+              <w:rPr>
+                <w:lang w:val="en-GB"/>
+              </w:rPr>
+              <w:t xml:space="preserve">if </w:t>
+            </w:r>
+            <w:proofErr w:type="spellStart"/>
+            <w:r>
+              <w:rPr>
+                <w:lang w:val="en-GB"/>
+              </w:rPr>
+              <w:t>targetUtente</w:t>
+            </w:r>
+            <w:proofErr w:type="spellEnd"/>
+            <w:r>
+              <w:rPr>
+                <w:lang w:val="en-GB"/>
+              </w:rPr>
+              <w:t xml:space="preserve"> &lt;&gt; null </w:t>
+            </w:r>
+          </w:p>
+          <w:p>
+            <w:pPr>
+              <w:rPr>
+                <w:lang w:val="en-GB"/>
+              </w:rPr>
+            </w:pPr>
+          </w:p>
+          <w:p>
+            <w:pPr>
+              <w:rPr>
+                <w:lang w:val="en-GB"/>
+              </w:rPr>
+            </w:pPr>
+            <w:r>
+              <w:rPr>
+                <w:lang w:val="en-GB"/>
+              </w:rPr>
+              <w:t xml:space="preserve">   result = </w:t>
+            </w:r>
+            <w:proofErr w:type="spellStart"/>
+            <w:r>
+              <w:rPr>
+                <w:lang w:val="en-GB"/>
+              </w:rPr>
+              <w:t>targetUtente</w:t>
+            </w:r>
+            <w:proofErr w:type="spellEnd"/>
+          </w:p>
+          <w:p>
+            <w:pPr>
+              <w:rPr>
+                <w:lang w:val="en-GB"/>
+              </w:rPr>
+            </w:pPr>
+          </w:p>
+          <w:p>
+            <w:pPr>
+              <w:rPr>
+                <w:lang w:val="en-GB"/>
+              </w:rPr>
+            </w:pPr>
+            <w:r>
+              <w:rPr>
+                <w:lang w:val="en-GB"/>
+              </w:rPr>
+              <w:t>else</w:t>
+            </w:r>
+          </w:p>
+          <w:p>
+            <w:pPr>
+              <w:rPr>
+                <w:lang w:val="en-GB"/>
+              </w:rPr>
+            </w:pPr>
+          </w:p>
+          <w:p>
+            <w:pPr>
+              <w:rPr>
+                <w:lang w:val="en-GB"/>
+              </w:rPr>
+            </w:pPr>
+            <w:r>
+              <w:rPr>
+                <w:lang w:val="en-GB"/>
+              </w:rPr>
+              <w:t xml:space="preserve">  result = null</w:t>
+            </w:r>
+          </w:p>
+          <w:p>
+            <w:pPr>
+              <w:rPr>
+                <w:lang w:val="en-GB"/>
+              </w:rPr>
+            </w:pPr>
+          </w:p>
+          <w:p>
+            <w:pPr>
+              <w:rPr>
+                <w:lang w:val="en-GB"/>
+              </w:rPr>
+            </w:pPr>
+            <w:r>
+              <w:rPr>
+                <w:lang w:val="en-GB"/>
+              </w:rPr>
+              <w:t>endif</w:t>
+            </w:r>
+          </w:p>
+          <w:p>
+            <w:pPr>
+              <w:rPr>
+                <w:lang w:val="en-GB"/>
+              </w:rPr>
+            </w:pPr>
           </w:p>
         </w:tc>
       </w:tr>
@@ -22505,6 +22834,7 @@
               <w:spacing w:after="160" w:line="259" w:lineRule="auto"/>
             </w:pPr>
             <w:r>
+              <w:lastRenderedPageBreak/>
               <w:t xml:space="preserve">matricola </w:t>
             </w:r>
             <w:r>
@@ -24803,6 +25133,7 @@
           <w:p>
             <w:proofErr w:type="spellStart"/>
             <w:r>
+              <w:lastRenderedPageBreak/>
               <w:t>Dipendente.allInstances</w:t>
             </w:r>
             <w:proofErr w:type="spellEnd"/>
@@ -26064,7 +26395,6 @@
         <w:rPr>
           <w:lang w:val="en-GB"/>
         </w:rPr>
-        <w:lastRenderedPageBreak/>
         <w:t>TaskDAO</w:t>
       </w:r>
       <w:proofErr w:type="spellEnd"/>
@@ -27346,7 +27676,6 @@
               </w:rPr>
             </w:pPr>
             <w:r>
-              <w:lastRenderedPageBreak/>
               <w:t>Firma metodo</w:t>
             </w:r>
           </w:p>
@@ -28569,7 +28898,6 @@
           </w:tcPr>
           <w:p>
             <w:r>
-              <w:lastRenderedPageBreak/>
               <w:t>Descrizione</w:t>
             </w:r>
           </w:p>
@@ -31743,7 +32071,6 @@
   <w:style w:type="character" w:default="1" w:styleId="Carpredefinitoparagrafo">
     <w:name w:val="Default Paragraph Font"/>
     <w:uiPriority w:val="1"/>
-    <w:semiHidden/>
     <w:unhideWhenUsed/>
   </w:style>
   <w:style w:type="table" w:default="1" w:styleId="Tabellanormale">

</xml_diff>

<commit_message>
Add: aggiunti task service test plan
</commit_message>
<xml_diff>
--- a/Workspace/ODD/ODD_EWMS.docx
+++ b/Workspace/ODD/ODD_EWMS.docx
@@ -11846,7 +11846,7 @@
               <w:rPr>
                 <w:lang w:val="en-GB"/>
               </w:rPr>
-              <w:t>FileStream</w:t>
+              <w:t>Allegato</w:t>
             </w:r>
             <w:proofErr w:type="spellEnd"/>
           </w:p>
@@ -12903,47 +12903,85 @@
             </w:r>
           </w:p>
           <w:p>
-            <w:r>
+            <w:pPr>
+              <w:rPr>
+                <w:lang w:val="en-GB"/>
+              </w:rPr>
+            </w:pPr>
+            <w:r>
+              <w:rPr>
+                <w:lang w:val="en-GB"/>
+              </w:rPr>
               <w:t xml:space="preserve">   </w:t>
             </w:r>
             <w:proofErr w:type="spellStart"/>
             <w:r>
+              <w:rPr>
+                <w:lang w:val="en-GB"/>
+              </w:rPr>
               <w:t>targetTask.stato</w:t>
             </w:r>
             <w:proofErr w:type="spellEnd"/>
             <w:r>
+              <w:rPr>
+                <w:lang w:val="en-GB"/>
+              </w:rPr>
               <w:t xml:space="preserve"> = </w:t>
             </w:r>
             <w:proofErr w:type="gramStart"/>
             <w:r>
-              <w:t>Tipi::stato::</w:t>
+              <w:rPr>
+                <w:lang w:val="en-GB"/>
+              </w:rPr>
+              <w:t>Tipi::</w:t>
+            </w:r>
+            <w:proofErr w:type="spellStart"/>
+            <w:r>
+              <w:rPr>
+                <w:lang w:val="en-GB"/>
+              </w:rPr>
+              <w:t>stato</w:t>
+            </w:r>
+            <w:proofErr w:type="spellEnd"/>
+            <w:r>
+              <w:rPr>
+                <w:lang w:val="en-GB"/>
+              </w:rPr>
+              <w:t>::</w:t>
             </w:r>
             <w:proofErr w:type="gramEnd"/>
             <w:r>
-              <w:t xml:space="preserve">IN_SOSPENSIONE and </w:t>
-            </w:r>
-            <w:proofErr w:type="spellStart"/>
-            <w:r>
-              <w:t>result</w:t>
-            </w:r>
-            <w:proofErr w:type="spellEnd"/>
-            <w:r>
-              <w:t xml:space="preserve"> = </w:t>
-            </w:r>
-            <w:proofErr w:type="spellStart"/>
-            <w:r>
-              <w:t>true</w:t>
-            </w:r>
-            <w:proofErr w:type="spellEnd"/>
-          </w:p>
-          <w:p/>
-          <w:p>
-            <w:r>
+              <w:rPr>
+                <w:lang w:val="en-GB"/>
+              </w:rPr>
+              <w:t>IN_SOSPENSIONE and result = true</w:t>
+            </w:r>
+          </w:p>
+          <w:p>
+            <w:pPr>
+              <w:rPr>
+                <w:lang w:val="en-GB"/>
+              </w:rPr>
+            </w:pPr>
+          </w:p>
+          <w:p>
+            <w:pPr>
+              <w:rPr>
+                <w:lang w:val="en-GB"/>
+              </w:rPr>
+            </w:pPr>
+            <w:r>
+              <w:rPr>
+                <w:lang w:val="en-GB"/>
+              </w:rPr>
               <w:t xml:space="preserve">   else </w:t>
             </w:r>
           </w:p>
           <w:p>
             <w:r>
+              <w:rPr>
+                <w:lang w:val="en-GB"/>
+              </w:rPr>
               <w:t xml:space="preserve">   </w:t>
             </w:r>
             <w:proofErr w:type="spellStart"/>
@@ -13042,11 +13080,9 @@
             <w:r>
               <w:t xml:space="preserve">) : </w:t>
             </w:r>
-            <w:proofErr w:type="spellStart"/>
-            <w:r>
-              <w:t>FileStream</w:t>
-            </w:r>
-            <w:proofErr w:type="spellEnd"/>
+            <w:r>
+              <w:t>Allegato</w:t>
+            </w:r>
           </w:p>
         </w:tc>
       </w:tr>
@@ -13184,84 +13220,7 @@
               <w:rPr>
                 <w:lang w:val="en-GB"/>
               </w:rPr>
-              <w:t xml:space="preserve"> &gt; 0 and</w:t>
-            </w:r>
-          </w:p>
-          <w:p>
-            <w:pPr>
-              <w:rPr>
-                <w:lang w:val="en-GB"/>
-              </w:rPr>
-            </w:pPr>
-            <w:proofErr w:type="spellStart"/>
-            <w:r>
-              <w:rPr>
-                <w:lang w:val="en-GB"/>
-              </w:rPr>
-              <w:t>Allegato</w:t>
-            </w:r>
-            <w:r>
-              <w:rPr>
-                <w:lang w:val="en-GB"/>
-              </w:rPr>
-              <w:t>.allInstances</w:t>
-            </w:r>
-            <w:proofErr w:type="spellEnd"/>
-            <w:r>
-              <w:rPr>
-                <w:lang w:val="en-GB"/>
-              </w:rPr>
-              <w:t xml:space="preserve">() -&gt; </w:t>
-            </w:r>
-            <w:r>
-              <w:rPr>
-                <w:lang w:val="en-GB"/>
-              </w:rPr>
-              <w:t>exists</w:t>
-            </w:r>
-            <w:r>
-              <w:rPr>
-                <w:lang w:val="en-GB"/>
-              </w:rPr>
-              <w:t>(</w:t>
-            </w:r>
-            <w:r>
-              <w:rPr>
-                <w:lang w:val="en-GB"/>
-              </w:rPr>
-              <w:t>a</w:t>
-            </w:r>
-            <w:r>
-              <w:rPr>
-                <w:lang w:val="en-GB"/>
-              </w:rPr>
-              <w:t xml:space="preserve"> | </w:t>
-            </w:r>
-            <w:r>
-              <w:rPr>
-                <w:lang w:val="en-GB"/>
-              </w:rPr>
-              <w:t>a</w:t>
-            </w:r>
-            <w:r>
-              <w:rPr>
-                <w:lang w:val="en-GB"/>
-              </w:rPr>
-              <w:t xml:space="preserve">.id = </w:t>
-            </w:r>
-            <w:proofErr w:type="spellStart"/>
-            <w:r>
-              <w:rPr>
-                <w:lang w:val="en-GB"/>
-              </w:rPr>
-              <w:t>taskID</w:t>
-            </w:r>
-            <w:proofErr w:type="spellEnd"/>
-            <w:r>
-              <w:rPr>
-                <w:lang w:val="en-GB"/>
-              </w:rPr>
-              <w:t>)</w:t>
+              <w:t xml:space="preserve"> &gt; 0 </w:t>
             </w:r>
           </w:p>
         </w:tc>
@@ -13344,40 +13303,217 @@
           <w:p>
             <w:pPr>
               <w:rPr>
-                <w:u w:val="single"/>
-                <w:lang w:val="en-GB"/>
-              </w:rPr>
-            </w:pPr>
-          </w:p>
-          <w:p>
-            <w:pPr>
-              <w:rPr>
-                <w:u w:val="single"/>
-                <w:lang w:val="en-GB"/>
-              </w:rPr>
-            </w:pPr>
-            <w:proofErr w:type="spellStart"/>
-            <w:r>
-              <w:rPr>
-                <w:u w:val="single"/>
-              </w:rPr>
-              <w:t>result</w:t>
-            </w:r>
-            <w:proofErr w:type="spellEnd"/>
-            <w:r>
-              <w:rPr>
-                <w:u w:val="single"/>
-              </w:rPr>
-              <w:t xml:space="preserve"> &lt;&gt; </w:t>
-            </w:r>
-            <w:proofErr w:type="spellStart"/>
-            <w:r>
-              <w:rPr>
-                <w:u w:val="single"/>
-              </w:rPr>
-              <w:t>null</w:t>
-            </w:r>
-            <w:proofErr w:type="spellEnd"/>
+                <w:lang w:val="en-GB"/>
+              </w:rPr>
+            </w:pPr>
+            <w:proofErr w:type="spellStart"/>
+            <w:r>
+              <w:rPr>
+                <w:lang w:val="en-GB"/>
+              </w:rPr>
+              <w:t>targetAllegato</w:t>
+            </w:r>
+            <w:proofErr w:type="spellEnd"/>
+            <w:r>
+              <w:rPr>
+                <w:lang w:val="en-GB"/>
+              </w:rPr>
+              <w:t xml:space="preserve"> = </w:t>
+            </w:r>
+            <w:proofErr w:type="spellStart"/>
+            <w:r>
+              <w:rPr>
+                <w:lang w:val="en-GB"/>
+              </w:rPr>
+              <w:t>Allegato.allInstances</w:t>
+            </w:r>
+            <w:proofErr w:type="spellEnd"/>
+            <w:r>
+              <w:rPr>
+                <w:lang w:val="en-GB"/>
+              </w:rPr>
+              <w:t xml:space="preserve">() -&gt; </w:t>
+            </w:r>
+            <w:r>
+              <w:rPr>
+                <w:lang w:val="en-GB"/>
+              </w:rPr>
+              <w:t>any</w:t>
+            </w:r>
+            <w:r>
+              <w:rPr>
+                <w:lang w:val="en-GB"/>
+              </w:rPr>
+              <w:t xml:space="preserve">(a | </w:t>
+            </w:r>
+            <w:proofErr w:type="spellStart"/>
+            <w:r>
+              <w:rPr>
+                <w:lang w:val="en-GB"/>
+              </w:rPr>
+              <w:t>a.</w:t>
+            </w:r>
+            <w:r>
+              <w:rPr>
+                <w:lang w:val="en-GB"/>
+              </w:rPr>
+              <w:t>taskID</w:t>
+            </w:r>
+            <w:proofErr w:type="spellEnd"/>
+            <w:r>
+              <w:rPr>
+                <w:lang w:val="en-GB"/>
+              </w:rPr>
+              <w:t xml:space="preserve"> = </w:t>
+            </w:r>
+            <w:proofErr w:type="spellStart"/>
+            <w:r>
+              <w:rPr>
+                <w:lang w:val="en-GB"/>
+              </w:rPr>
+              <w:t>taskID</w:t>
+            </w:r>
+            <w:proofErr w:type="spellEnd"/>
+            <w:r>
+              <w:rPr>
+                <w:lang w:val="en-GB"/>
+              </w:rPr>
+              <w:t>)</w:t>
+            </w:r>
+          </w:p>
+          <w:p>
+            <w:pPr>
+              <w:rPr>
+                <w:lang w:val="en-GB"/>
+              </w:rPr>
+            </w:pPr>
+          </w:p>
+          <w:p>
+            <w:pPr>
+              <w:rPr>
+                <w:lang w:val="en-GB"/>
+              </w:rPr>
+            </w:pPr>
+            <w:r>
+              <w:rPr>
+                <w:lang w:val="en-GB"/>
+              </w:rPr>
+              <w:t xml:space="preserve">If </w:t>
+            </w:r>
+            <w:proofErr w:type="spellStart"/>
+            <w:r>
+              <w:rPr>
+                <w:lang w:val="en-GB"/>
+              </w:rPr>
+              <w:t>targetAllegato</w:t>
+            </w:r>
+            <w:proofErr w:type="spellEnd"/>
+            <w:r>
+              <w:rPr>
+                <w:lang w:val="en-GB"/>
+              </w:rPr>
+              <w:t xml:space="preserve"> &lt;&gt; null</w:t>
+            </w:r>
+          </w:p>
+          <w:p>
+            <w:pPr>
+              <w:rPr>
+                <w:lang w:val="en-GB"/>
+              </w:rPr>
+            </w:pPr>
+          </w:p>
+          <w:p>
+            <w:pPr>
+              <w:rPr>
+                <w:lang w:val="en-GB"/>
+              </w:rPr>
+            </w:pPr>
+            <w:r>
+              <w:rPr>
+                <w:lang w:val="en-GB"/>
+              </w:rPr>
+              <w:t xml:space="preserve">    </w:t>
+            </w:r>
+            <w:r>
+              <w:rPr>
+                <w:lang w:val="en-GB"/>
+              </w:rPr>
+              <w:t xml:space="preserve">result </w:t>
+            </w:r>
+            <w:r>
+              <w:rPr>
+                <w:lang w:val="en-GB"/>
+              </w:rPr>
+              <w:t xml:space="preserve">= </w:t>
+            </w:r>
+            <w:proofErr w:type="spellStart"/>
+            <w:r>
+              <w:rPr>
+                <w:lang w:val="en-GB"/>
+              </w:rPr>
+              <w:t>targetAllegato</w:t>
+            </w:r>
+            <w:proofErr w:type="spellEnd"/>
+          </w:p>
+          <w:p>
+            <w:pPr>
+              <w:rPr>
+                <w:lang w:val="en-GB"/>
+              </w:rPr>
+            </w:pPr>
+          </w:p>
+          <w:p>
+            <w:pPr>
+              <w:rPr>
+                <w:lang w:val="en-GB"/>
+              </w:rPr>
+            </w:pPr>
+            <w:r>
+              <w:rPr>
+                <w:lang w:val="en-GB"/>
+              </w:rPr>
+              <w:t>else</w:t>
+            </w:r>
+          </w:p>
+          <w:p>
+            <w:pPr>
+              <w:rPr>
+                <w:lang w:val="en-GB"/>
+              </w:rPr>
+            </w:pPr>
+          </w:p>
+          <w:p>
+            <w:pPr>
+              <w:rPr>
+                <w:lang w:val="en-GB"/>
+              </w:rPr>
+            </w:pPr>
+            <w:r>
+              <w:rPr>
+                <w:lang w:val="en-GB"/>
+              </w:rPr>
+              <w:t xml:space="preserve">   result = null</w:t>
+            </w:r>
+          </w:p>
+          <w:p>
+            <w:pPr>
+              <w:rPr>
+                <w:lang w:val="en-GB"/>
+              </w:rPr>
+            </w:pPr>
+          </w:p>
+          <w:p>
+            <w:pPr>
+              <w:rPr>
+                <w:lang w:val="en-GB"/>
+              </w:rPr>
+            </w:pPr>
+            <w:r>
+              <w:rPr>
+                <w:lang w:val="en-GB"/>
+              </w:rPr>
+              <w:t>endif</w:t>
+            </w:r>
           </w:p>
         </w:tc>
       </w:tr>
@@ -13730,7 +13866,10 @@
             </w:r>
             <w:proofErr w:type="spellStart"/>
             <w:r>
-              <w:t>matricolaSup:String</w:t>
+              <w:t>matricolaSup:</w:t>
+            </w:r>
+            <w:r>
+              <w:t>int</w:t>
             </w:r>
             <w:proofErr w:type="spellEnd"/>
             <w:r>
@@ -13756,6 +13895,7 @@
               <w:rPr>
                 <w:lang w:val="en-GB"/>
               </w:rPr>
+              <w:lastRenderedPageBreak/>
               <w:t xml:space="preserve">+ </w:t>
             </w:r>
             <w:proofErr w:type="spellStart"/>
@@ -13784,8 +13924,84 @@
               <w:rPr>
                 <w:lang w:val="en-GB"/>
               </w:rPr>
-              <w:t>: int) : bool</w:t>
-            </w:r>
+              <w:t xml:space="preserve">: </w:t>
+            </w:r>
+            <w:r>
+              <w:rPr>
+                <w:lang w:val="en-GB"/>
+              </w:rPr>
+              <w:t>long</w:t>
+            </w:r>
+            <w:r>
+              <w:rPr>
+                <w:lang w:val="en-GB"/>
+              </w:rPr>
+              <w:t>) : bool</w:t>
+            </w:r>
+          </w:p>
+          <w:p>
+            <w:pPr>
+              <w:spacing w:after="160" w:line="259" w:lineRule="auto"/>
+              <w:rPr>
+                <w:lang w:val="en-GB"/>
+              </w:rPr>
+            </w:pPr>
+            <w:r>
+              <w:rPr>
+                <w:lang w:val="en-GB"/>
+              </w:rPr>
+              <w:t xml:space="preserve">+ </w:t>
+            </w:r>
+            <w:proofErr w:type="spellStart"/>
+            <w:r>
+              <w:rPr>
+                <w:lang w:val="en-GB"/>
+              </w:rPr>
+              <w:t>uploadAllegato</w:t>
+            </w:r>
+            <w:proofErr w:type="spellEnd"/>
+            <w:r>
+              <w:rPr>
+                <w:lang w:val="en-GB"/>
+              </w:rPr>
+              <w:t>(</w:t>
+            </w:r>
+            <w:proofErr w:type="spellStart"/>
+            <w:r>
+              <w:rPr>
+                <w:lang w:val="en-GB"/>
+              </w:rPr>
+              <w:t>fileItem:FileItem</w:t>
+            </w:r>
+            <w:proofErr w:type="spellEnd"/>
+            <w:r>
+              <w:rPr>
+                <w:lang w:val="en-GB"/>
+              </w:rPr>
+              <w:t xml:space="preserve">, </w:t>
+            </w:r>
+            <w:proofErr w:type="spellStart"/>
+            <w:r>
+              <w:rPr>
+                <w:lang w:val="en-GB"/>
+              </w:rPr>
+              <w:t>uploadDir:String</w:t>
+            </w:r>
+            <w:proofErr w:type="spellEnd"/>
+            <w:r>
+              <w:rPr>
+                <w:lang w:val="en-GB"/>
+              </w:rPr>
+              <w:t xml:space="preserve">) : </w:t>
+            </w:r>
+            <w:proofErr w:type="spellStart"/>
+            <w:r>
+              <w:rPr>
+                <w:lang w:val="en-GB"/>
+              </w:rPr>
+              <w:t>Allegato</w:t>
+            </w:r>
+            <w:proofErr w:type="spellEnd"/>
           </w:p>
           <w:p>
             <w:pPr>
@@ -13822,6 +14038,7 @@
                 <w:b/>
                 <w:bCs/>
               </w:rPr>
+              <w:lastRenderedPageBreak/>
               <w:t>Invariante di classe</w:t>
             </w:r>
           </w:p>
@@ -13981,7 +14198,6 @@
                 <w:b/>
                 <w:bCs/>
               </w:rPr>
-              <w:lastRenderedPageBreak/>
               <w:t xml:space="preserve">Descrizione </w:t>
             </w:r>
           </w:p>
@@ -14642,11 +14858,6 @@
           </w:p>
           <w:p/>
           <w:p>
-            <w:pPr>
-              <w:rPr>
-                <w:lang w:val="en-GB"/>
-              </w:rPr>
-            </w:pPr>
             <w:r>
               <w:t xml:space="preserve">titolo &lt;&gt; </w:t>
             </w:r>
@@ -14660,16 +14871,10 @@
             </w:r>
             <w:proofErr w:type="spellStart"/>
             <w:r>
-              <w:rPr>
-                <w:lang w:val="en-GB"/>
-              </w:rPr>
               <w:t>titolo.size</w:t>
             </w:r>
             <w:proofErr w:type="spellEnd"/>
             <w:r>
-              <w:rPr>
-                <w:lang w:val="en-GB"/>
-              </w:rPr>
               <w:t xml:space="preserve">() &gt; 0 and </w:t>
             </w:r>
           </w:p>
@@ -14737,18 +14942,205 @@
             </w:r>
           </w:p>
           <w:p>
-            <w:r>
-              <w:t>stato &lt;&gt;</w:t>
-            </w:r>
-            <w:r>
+            <w:pPr>
+              <w:rPr>
+                <w:lang w:val="en-GB"/>
+              </w:rPr>
+            </w:pPr>
+            <w:proofErr w:type="spellStart"/>
+            <w:r>
+              <w:rPr>
+                <w:lang w:val="en-GB"/>
+              </w:rPr>
+              <w:t>stato</w:t>
+            </w:r>
+            <w:proofErr w:type="spellEnd"/>
+            <w:r>
+              <w:rPr>
+                <w:lang w:val="en-GB"/>
+              </w:rPr>
+              <w:t xml:space="preserve"> &lt;&gt;</w:t>
+            </w:r>
+            <w:r>
+              <w:rPr>
+                <w:lang w:val="en-GB"/>
+              </w:rPr>
               <w:t xml:space="preserve"> </w:t>
             </w:r>
-            <w:proofErr w:type="spellStart"/>
-            <w:r>
-              <w:t>null</w:t>
-            </w:r>
-            <w:proofErr w:type="spellEnd"/>
-            <w:r>
+            <w:r>
+              <w:rPr>
+                <w:lang w:val="en-GB"/>
+              </w:rPr>
+              <w:t>null and</w:t>
+            </w:r>
+          </w:p>
+          <w:p>
+            <w:pPr>
+              <w:rPr>
+                <w:lang w:val="en-GB"/>
+              </w:rPr>
+            </w:pPr>
+            <w:proofErr w:type="spellStart"/>
+            <w:r>
+              <w:rPr>
+                <w:lang w:val="en-GB"/>
+              </w:rPr>
+              <w:t>matricolaDip</w:t>
+            </w:r>
+            <w:proofErr w:type="spellEnd"/>
+            <w:r>
+              <w:rPr>
+                <w:lang w:val="en-GB"/>
+              </w:rPr>
+              <w:t xml:space="preserve"> </w:t>
+            </w:r>
+            <w:r>
+              <w:rPr>
+                <w:lang w:val="en-GB"/>
+              </w:rPr>
+              <w:t xml:space="preserve">&gt; 0 </w:t>
+            </w:r>
+            <w:r>
+              <w:rPr>
+                <w:lang w:val="en-GB"/>
+              </w:rPr>
+              <w:t xml:space="preserve">and </w:t>
+            </w:r>
+          </w:p>
+          <w:p>
+            <w:pPr>
+              <w:rPr>
+                <w:lang w:val="en-GB"/>
+              </w:rPr>
+            </w:pPr>
+            <w:proofErr w:type="spellStart"/>
+            <w:r>
+              <w:rPr>
+                <w:lang w:val="en-GB"/>
+              </w:rPr>
+              <w:t>matricolaSup</w:t>
+            </w:r>
+            <w:proofErr w:type="spellEnd"/>
+            <w:r>
+              <w:rPr>
+                <w:lang w:val="en-GB"/>
+              </w:rPr>
+              <w:t xml:space="preserve"> &gt; 0 an</w:t>
+            </w:r>
+            <w:r>
+              <w:rPr>
+                <w:lang w:val="en-GB"/>
+              </w:rPr>
+              <w:t>d</w:t>
+            </w:r>
+          </w:p>
+          <w:p>
+            <w:pPr>
+              <w:rPr>
+                <w:lang w:val="en-GB"/>
+              </w:rPr>
+            </w:pPr>
+            <w:proofErr w:type="spellStart"/>
+            <w:r>
+              <w:rPr>
+                <w:lang w:val="en-GB"/>
+              </w:rPr>
+              <w:t>priorita</w:t>
+            </w:r>
+            <w:proofErr w:type="spellEnd"/>
+            <w:r>
+              <w:rPr>
+                <w:lang w:val="en-GB"/>
+              </w:rPr>
+              <w:t xml:space="preserve"> &lt;&gt; null and</w:t>
+            </w:r>
+            <w:r>
+              <w:rPr>
+                <w:lang w:val="en-GB"/>
+              </w:rPr>
+              <w:br/>
+            </w:r>
+            <w:proofErr w:type="spellStart"/>
+            <w:r>
+              <w:rPr>
+                <w:lang w:val="en-GB"/>
+              </w:rPr>
+              <w:t>dataScadenza</w:t>
+            </w:r>
+            <w:proofErr w:type="spellEnd"/>
+            <w:r>
+              <w:rPr>
+                <w:lang w:val="en-GB"/>
+              </w:rPr>
+              <w:t xml:space="preserve"> &gt; </w:t>
+            </w:r>
+            <w:proofErr w:type="gramStart"/>
+            <w:r>
+              <w:rPr>
+                <w:lang w:val="en-GB"/>
+              </w:rPr>
+              <w:t>Date::</w:t>
+            </w:r>
+            <w:proofErr w:type="gramEnd"/>
+            <w:r>
+              <w:rPr>
+                <w:lang w:val="en-GB"/>
+              </w:rPr>
+              <w:t xml:space="preserve">now() and </w:t>
+            </w:r>
+          </w:p>
+          <w:p>
+            <w:pPr>
+              <w:rPr>
+                <w:lang w:val="en-GB"/>
+              </w:rPr>
+            </w:pPr>
+            <w:proofErr w:type="spellStart"/>
+            <w:r>
+              <w:rPr>
+                <w:lang w:val="en-GB"/>
+              </w:rPr>
+              <w:t>Dipendente.allInstances</w:t>
+            </w:r>
+            <w:proofErr w:type="spellEnd"/>
+            <w:r>
+              <w:rPr>
+                <w:lang w:val="en-GB"/>
+              </w:rPr>
+              <w:t xml:space="preserve">()-&gt;exists(d | </w:t>
+            </w:r>
+            <w:proofErr w:type="spellStart"/>
+            <w:r>
+              <w:rPr>
+                <w:lang w:val="en-GB"/>
+              </w:rPr>
+              <w:t>d.matricola</w:t>
+            </w:r>
+            <w:proofErr w:type="spellEnd"/>
+            <w:r>
+              <w:rPr>
+                <w:lang w:val="en-GB"/>
+              </w:rPr>
+              <w:t xml:space="preserve"> = </w:t>
+            </w:r>
+            <w:proofErr w:type="spellStart"/>
+            <w:r>
+              <w:rPr>
+                <w:lang w:val="en-GB"/>
+              </w:rPr>
+              <w:t>matricolaDip</w:t>
+            </w:r>
+            <w:proofErr w:type="spellEnd"/>
+            <w:r>
+              <w:rPr>
+                <w:lang w:val="en-GB"/>
+              </w:rPr>
+              <w:t>)</w:t>
+            </w:r>
+            <w:r>
+              <w:rPr>
+                <w:lang w:val="en-GB"/>
+              </w:rPr>
               <w:t xml:space="preserve"> and</w:t>
             </w:r>
           </w:p>
@@ -14763,34 +15155,29 @@
               <w:rPr>
                 <w:lang w:val="en-GB"/>
               </w:rPr>
-              <w:t>matricolaDip</w:t>
-            </w:r>
-            <w:proofErr w:type="spellEnd"/>
-            <w:r>
-              <w:rPr>
-                <w:lang w:val="en-GB"/>
-              </w:rPr>
-              <w:t xml:space="preserve"> </w:t>
-            </w:r>
-            <w:r>
-              <w:rPr>
-                <w:lang w:val="en-GB"/>
-              </w:rPr>
-              <w:t xml:space="preserve">&gt; 0 </w:t>
-            </w:r>
-            <w:r>
-              <w:rPr>
-                <w:lang w:val="en-GB"/>
-              </w:rPr>
-              <w:t xml:space="preserve">and </w:t>
-            </w:r>
-          </w:p>
-          <w:p>
-            <w:pPr>
-              <w:rPr>
-                <w:lang w:val="en-GB"/>
-              </w:rPr>
-            </w:pPr>
+              <w:t>Supervisore.allIstances</w:t>
+            </w:r>
+            <w:proofErr w:type="spellEnd"/>
+            <w:r>
+              <w:rPr>
+                <w:lang w:val="en-GB"/>
+              </w:rPr>
+              <w:t xml:space="preserve">()-&gt; exists(s | </w:t>
+            </w:r>
+            <w:proofErr w:type="spellStart"/>
+            <w:r>
+              <w:rPr>
+                <w:lang w:val="en-GB"/>
+              </w:rPr>
+              <w:t>s.matricola</w:t>
+            </w:r>
+            <w:proofErr w:type="spellEnd"/>
+            <w:r>
+              <w:rPr>
+                <w:lang w:val="en-GB"/>
+              </w:rPr>
+              <w:t xml:space="preserve"> = </w:t>
+            </w:r>
             <w:proofErr w:type="spellStart"/>
             <w:r>
               <w:rPr>
@@ -14803,132 +15190,16 @@
               <w:rPr>
                 <w:lang w:val="en-GB"/>
               </w:rPr>
-              <w:t xml:space="preserve"> &gt; 0 an</w:t>
-            </w:r>
-            <w:r>
-              <w:rPr>
-                <w:lang w:val="en-GB"/>
-              </w:rPr>
-              <w:t>d</w:t>
-            </w:r>
-          </w:p>
-          <w:p>
-            <w:proofErr w:type="spellStart"/>
-            <w:r>
-              <w:t>prio</w:t>
-            </w:r>
-            <w:r>
-              <w:t>rita</w:t>
-            </w:r>
-            <w:proofErr w:type="spellEnd"/>
-            <w:r>
-              <w:t xml:space="preserve"> &lt;&gt; </w:t>
-            </w:r>
-            <w:proofErr w:type="spellStart"/>
-            <w:r>
-              <w:t>null</w:t>
-            </w:r>
-            <w:proofErr w:type="spellEnd"/>
-            <w:r>
-              <w:t xml:space="preserve"> and</w:t>
-            </w:r>
-            <w:r>
-              <w:br/>
-            </w:r>
-            <w:proofErr w:type="spellStart"/>
-            <w:r>
-              <w:t>dataScadenza</w:t>
-            </w:r>
-            <w:proofErr w:type="spellEnd"/>
-            <w:r>
-              <w:t xml:space="preserve"> &gt; </w:t>
-            </w:r>
-            <w:proofErr w:type="gramStart"/>
-            <w:r>
-              <w:t>Date::</w:t>
-            </w:r>
-            <w:proofErr w:type="spellStart"/>
-            <w:proofErr w:type="gramEnd"/>
-            <w:r>
-              <w:t>now</w:t>
-            </w:r>
-            <w:proofErr w:type="spellEnd"/>
-            <w:r>
-              <w:t xml:space="preserve">() and </w:t>
-            </w:r>
-          </w:p>
-          <w:p>
-            <w:proofErr w:type="spellStart"/>
-            <w:r>
-              <w:t>Dipendente.allInstances</w:t>
-            </w:r>
-            <w:proofErr w:type="spellEnd"/>
-            <w:r>
-              <w:t>()-&gt;</w:t>
-            </w:r>
-            <w:proofErr w:type="spellStart"/>
-            <w:r>
-              <w:t>exists</w:t>
-            </w:r>
-            <w:proofErr w:type="spellEnd"/>
-            <w:r>
-              <w:t xml:space="preserve">(d | </w:t>
-            </w:r>
-            <w:proofErr w:type="spellStart"/>
-            <w:r>
-              <w:t>d.matricola</w:t>
-            </w:r>
-            <w:proofErr w:type="spellEnd"/>
-            <w:r>
-              <w:t xml:space="preserve"> = </w:t>
-            </w:r>
-            <w:proofErr w:type="spellStart"/>
-            <w:r>
-              <w:t>matricolaDip</w:t>
-            </w:r>
-            <w:proofErr w:type="spellEnd"/>
-            <w:r>
               <w:t>)</w:t>
             </w:r>
-            <w:r>
-              <w:t xml:space="preserve"> and</w:t>
-            </w:r>
-          </w:p>
-          <w:p>
-            <w:proofErr w:type="spellStart"/>
-            <w:r>
-              <w:t>Supervisore.allIstances</w:t>
-            </w:r>
-            <w:proofErr w:type="spellEnd"/>
-            <w:r>
-              <w:t xml:space="preserve">()-&gt; </w:t>
-            </w:r>
-            <w:proofErr w:type="spellStart"/>
-            <w:r>
-              <w:t>exists</w:t>
-            </w:r>
-            <w:proofErr w:type="spellEnd"/>
-            <w:r>
-              <w:t xml:space="preserve">(s | </w:t>
-            </w:r>
-            <w:proofErr w:type="spellStart"/>
-            <w:r>
-              <w:t>s.matricola</w:t>
-            </w:r>
-            <w:proofErr w:type="spellEnd"/>
-            <w:r>
-              <w:t xml:space="preserve"> = </w:t>
-            </w:r>
-            <w:proofErr w:type="spellStart"/>
-            <w:r>
-              <w:t>matricolaSup</w:t>
-            </w:r>
-            <w:proofErr w:type="spellEnd"/>
-            <w:r>
-              <w:t>)</w:t>
-            </w:r>
-          </w:p>
-          <w:p/>
+          </w:p>
+          <w:p>
+            <w:pPr>
+              <w:rPr>
+                <w:lang w:val="en-GB"/>
+              </w:rPr>
+            </w:pPr>
+          </w:p>
         </w:tc>
       </w:tr>
       <w:tr>
@@ -15047,35 +15318,22 @@
             <w:pPr>
               <w:rPr>
                 <w:u w:val="single"/>
-                <w:lang w:val="en-GB"/>
-              </w:rPr>
-            </w:pPr>
-            <w:proofErr w:type="spellStart"/>
-            <w:r>
-              <w:rPr>
-                <w:lang w:val="en-GB"/>
-              </w:rPr>
+              </w:rPr>
+            </w:pPr>
+            <w:proofErr w:type="spellStart"/>
+            <w:r>
               <w:t>Task.allInstances</w:t>
             </w:r>
             <w:proofErr w:type="spellEnd"/>
             <w:r>
-              <w:rPr>
-                <w:lang w:val="en-GB"/>
-              </w:rPr>
               <w:t xml:space="preserve">()-&gt;size() = </w:t>
             </w:r>
             <w:proofErr w:type="spellStart"/>
             <w:r>
-              <w:rPr>
-                <w:lang w:val="en-GB"/>
-              </w:rPr>
               <w:t>Task.allInstances</w:t>
             </w:r>
             <w:proofErr w:type="spellEnd"/>
             <w:r>
-              <w:rPr>
-                <w:lang w:val="en-GB"/>
-              </w:rPr>
               <w:t>()@pre-&gt;size() + 1</w:t>
             </w:r>
           </w:p>
@@ -15090,13 +15348,7 @@
             <w:tcW w:w="9627" w:type="dxa"/>
             <w:gridSpan w:val="2"/>
           </w:tcPr>
-          <w:p>
-            <w:pPr>
-              <w:rPr>
-                <w:lang w:val="en-GB"/>
-              </w:rPr>
-            </w:pPr>
-          </w:p>
+          <w:p/>
         </w:tc>
       </w:tr>
       <w:tr>
@@ -15228,7 +15480,6 @@
                 <w:b/>
                 <w:bCs/>
               </w:rPr>
-              <w:lastRenderedPageBreak/>
               <w:t>Pre-condizione</w:t>
             </w:r>
           </w:p>
@@ -15946,11 +16197,512 @@
           </w:p>
         </w:tc>
       </w:tr>
+      <w:tr>
+        <w:tc>
+          <w:tcPr>
+            <w:tcW w:w="9627" w:type="dxa"/>
+            <w:gridSpan w:val="2"/>
+          </w:tcPr>
+          <w:p>
+            <w:pPr>
+              <w:rPr>
+                <w:lang w:val="en-GB"/>
+              </w:rPr>
+            </w:pPr>
+          </w:p>
+        </w:tc>
+      </w:tr>
+      <w:tr>
+        <w:tc>
+          <w:tcPr>
+            <w:tcW w:w="2547" w:type="dxa"/>
+          </w:tcPr>
+          <w:p>
+            <w:pPr>
+              <w:rPr>
+                <w:b/>
+                <w:bCs/>
+              </w:rPr>
+            </w:pPr>
+            <w:r>
+              <w:rPr>
+                <w:b/>
+                <w:bCs/>
+              </w:rPr>
+              <w:t>Firma Metodo</w:t>
+            </w:r>
+          </w:p>
+        </w:tc>
+        <w:tc>
+          <w:tcPr>
+            <w:tcW w:w="7080" w:type="dxa"/>
+          </w:tcPr>
+          <w:p>
+            <w:pPr>
+              <w:rPr>
+                <w:lang w:val="en-GB"/>
+              </w:rPr>
+            </w:pPr>
+            <w:r>
+              <w:rPr>
+                <w:lang w:val="en-GB"/>
+              </w:rPr>
+              <w:t xml:space="preserve">+ </w:t>
+            </w:r>
+            <w:proofErr w:type="spellStart"/>
+            <w:r>
+              <w:rPr>
+                <w:lang w:val="en-GB"/>
+              </w:rPr>
+              <w:t>uploadAllegato</w:t>
+            </w:r>
+            <w:proofErr w:type="spellEnd"/>
+            <w:r>
+              <w:rPr>
+                <w:lang w:val="en-GB"/>
+              </w:rPr>
+              <w:t>(</w:t>
+            </w:r>
+            <w:proofErr w:type="spellStart"/>
+            <w:r>
+              <w:rPr>
+                <w:lang w:val="en-GB"/>
+              </w:rPr>
+              <w:t>fileItem</w:t>
+            </w:r>
+            <w:proofErr w:type="spellEnd"/>
+            <w:r>
+              <w:rPr>
+                <w:lang w:val="en-GB"/>
+              </w:rPr>
+              <w:t xml:space="preserve">: </w:t>
+            </w:r>
+            <w:proofErr w:type="spellStart"/>
+            <w:r>
+              <w:rPr>
+                <w:lang w:val="en-GB"/>
+              </w:rPr>
+              <w:t>FileItem</w:t>
+            </w:r>
+            <w:proofErr w:type="spellEnd"/>
+            <w:r>
+              <w:rPr>
+                <w:lang w:val="en-GB"/>
+              </w:rPr>
+              <w:t xml:space="preserve">, </w:t>
+            </w:r>
+            <w:proofErr w:type="spellStart"/>
+            <w:r>
+              <w:rPr>
+                <w:lang w:val="en-GB"/>
+              </w:rPr>
+              <w:t>uploadDir</w:t>
+            </w:r>
+            <w:proofErr w:type="spellEnd"/>
+            <w:r>
+              <w:rPr>
+                <w:lang w:val="en-GB"/>
+              </w:rPr>
+              <w:t>: String</w:t>
+            </w:r>
+            <w:r>
+              <w:rPr>
+                <w:lang w:val="en-GB"/>
+              </w:rPr>
+              <w:t xml:space="preserve">) : </w:t>
+            </w:r>
+            <w:proofErr w:type="spellStart"/>
+            <w:r>
+              <w:rPr>
+                <w:lang w:val="en-GB"/>
+              </w:rPr>
+              <w:t>Allegato</w:t>
+            </w:r>
+            <w:proofErr w:type="spellEnd"/>
+          </w:p>
+        </w:tc>
+      </w:tr>
+      <w:tr>
+        <w:tc>
+          <w:tcPr>
+            <w:tcW w:w="2547" w:type="dxa"/>
+          </w:tcPr>
+          <w:p>
+            <w:pPr>
+              <w:rPr>
+                <w:b/>
+                <w:bCs/>
+              </w:rPr>
+            </w:pPr>
+            <w:r>
+              <w:rPr>
+                <w:b/>
+                <w:bCs/>
+              </w:rPr>
+              <w:t xml:space="preserve">Descrizione </w:t>
+            </w:r>
+          </w:p>
+        </w:tc>
+        <w:tc>
+          <w:tcPr>
+            <w:tcW w:w="7080" w:type="dxa"/>
+          </w:tcPr>
+          <w:p>
+            <w:r>
+              <w:t>Permette di caricare all’interno d</w:t>
+            </w:r>
+            <w:r>
+              <w:t xml:space="preserve">el filesystem un file inviato dal supervisore durante la creazione di un task, restituisce Allegato per permettere di salvare le </w:t>
+            </w:r>
+          </w:p>
+        </w:tc>
+      </w:tr>
+      <w:tr>
+        <w:tc>
+          <w:tcPr>
+            <w:tcW w:w="2547" w:type="dxa"/>
+          </w:tcPr>
+          <w:p>
+            <w:pPr>
+              <w:rPr>
+                <w:b/>
+                <w:bCs/>
+              </w:rPr>
+            </w:pPr>
+            <w:r>
+              <w:rPr>
+                <w:b/>
+                <w:bCs/>
+              </w:rPr>
+              <w:t>Pre-condizione</w:t>
+            </w:r>
+          </w:p>
+        </w:tc>
+        <w:tc>
+          <w:tcPr>
+            <w:tcW w:w="7080" w:type="dxa"/>
+          </w:tcPr>
+          <w:p>
+            <w:pPr>
+              <w:rPr>
+                <w:lang w:val="en-GB"/>
+              </w:rPr>
+            </w:pPr>
+            <w:r>
+              <w:rPr>
+                <w:lang w:val="en-GB"/>
+              </w:rPr>
+              <w:t xml:space="preserve">context </w:t>
+            </w:r>
+            <w:proofErr w:type="spellStart"/>
+            <w:proofErr w:type="gramStart"/>
+            <w:r>
+              <w:rPr>
+                <w:lang w:val="en-GB"/>
+              </w:rPr>
+              <w:t>AllegatoService</w:t>
+            </w:r>
+            <w:proofErr w:type="spellEnd"/>
+            <w:r>
+              <w:rPr>
+                <w:lang w:val="en-GB"/>
+              </w:rPr>
+              <w:t>::</w:t>
+            </w:r>
+            <w:proofErr w:type="spellStart"/>
+            <w:proofErr w:type="gramEnd"/>
+            <w:r>
+              <w:rPr>
+                <w:lang w:val="en-GB"/>
+              </w:rPr>
+              <w:t>uploadAllegato</w:t>
+            </w:r>
+            <w:proofErr w:type="spellEnd"/>
+            <w:r>
+              <w:rPr>
+                <w:lang w:val="en-GB"/>
+              </w:rPr>
+              <w:t>(</w:t>
+            </w:r>
+            <w:proofErr w:type="spellStart"/>
+            <w:r>
+              <w:rPr>
+                <w:lang w:val="en-GB"/>
+              </w:rPr>
+              <w:t>fileItem</w:t>
+            </w:r>
+            <w:proofErr w:type="spellEnd"/>
+            <w:r>
+              <w:rPr>
+                <w:lang w:val="en-GB"/>
+              </w:rPr>
+              <w:t xml:space="preserve">: </w:t>
+            </w:r>
+            <w:proofErr w:type="spellStart"/>
+            <w:r>
+              <w:rPr>
+                <w:lang w:val="en-GB"/>
+              </w:rPr>
+              <w:t>FileItem</w:t>
+            </w:r>
+            <w:proofErr w:type="spellEnd"/>
+            <w:r>
+              <w:rPr>
+                <w:lang w:val="en-GB"/>
+              </w:rPr>
+              <w:t xml:space="preserve">, </w:t>
+            </w:r>
+            <w:proofErr w:type="spellStart"/>
+            <w:r>
+              <w:rPr>
+                <w:lang w:val="en-GB"/>
+              </w:rPr>
+              <w:t>uploadDir</w:t>
+            </w:r>
+            <w:proofErr w:type="spellEnd"/>
+            <w:r>
+              <w:rPr>
+                <w:lang w:val="en-GB"/>
+              </w:rPr>
+              <w:t>: String)</w:t>
+            </w:r>
+          </w:p>
+          <w:p>
+            <w:pPr>
+              <w:rPr>
+                <w:lang w:val="en-GB"/>
+              </w:rPr>
+            </w:pPr>
+          </w:p>
+          <w:p>
+            <w:pPr>
+              <w:rPr>
+                <w:lang w:val="en-GB"/>
+              </w:rPr>
+            </w:pPr>
+            <w:proofErr w:type="spellStart"/>
+            <w:r>
+              <w:rPr>
+                <w:lang w:val="en-GB"/>
+              </w:rPr>
+              <w:t>fileItem</w:t>
+            </w:r>
+            <w:proofErr w:type="spellEnd"/>
+            <w:r>
+              <w:rPr>
+                <w:lang w:val="en-GB"/>
+              </w:rPr>
+              <w:t xml:space="preserve"> &lt;&gt; null and </w:t>
+            </w:r>
+          </w:p>
+          <w:p>
+            <w:pPr>
+              <w:rPr>
+                <w:lang w:val="en-GB"/>
+              </w:rPr>
+            </w:pPr>
+            <w:proofErr w:type="spellStart"/>
+            <w:r>
+              <w:rPr>
+                <w:lang w:val="en-GB"/>
+              </w:rPr>
+              <w:t>fileItem.getName</w:t>
+            </w:r>
+            <w:proofErr w:type="spellEnd"/>
+            <w:r>
+              <w:rPr>
+                <w:lang w:val="en-GB"/>
+              </w:rPr>
+              <w:t xml:space="preserve">() &lt;&gt; null and </w:t>
+            </w:r>
+          </w:p>
+          <w:p>
+            <w:pPr>
+              <w:rPr>
+                <w:lang w:val="en-GB"/>
+              </w:rPr>
+            </w:pPr>
+            <w:r>
+              <w:rPr>
+                <w:lang w:val="en-GB"/>
+              </w:rPr>
+              <w:lastRenderedPageBreak/>
+              <w:t xml:space="preserve">    </w:t>
+            </w:r>
+            <w:proofErr w:type="spellStart"/>
+            <w:r>
+              <w:rPr>
+                <w:lang w:val="en-GB"/>
+              </w:rPr>
+              <w:t>uploadDir</w:t>
+            </w:r>
+            <w:proofErr w:type="spellEnd"/>
+            <w:r>
+              <w:rPr>
+                <w:lang w:val="en-GB"/>
+              </w:rPr>
+              <w:t xml:space="preserve"> &lt;&gt; null</w:t>
+            </w:r>
+          </w:p>
+          <w:p>
+            <w:pPr>
+              <w:rPr>
+                <w:lang w:val="en-GB"/>
+              </w:rPr>
+            </w:pPr>
+          </w:p>
+        </w:tc>
+      </w:tr>
+      <w:tr>
+        <w:tc>
+          <w:tcPr>
+            <w:tcW w:w="2547" w:type="dxa"/>
+          </w:tcPr>
+          <w:p>
+            <w:pPr>
+              <w:rPr>
+                <w:b/>
+                <w:bCs/>
+              </w:rPr>
+            </w:pPr>
+            <w:r>
+              <w:rPr>
+                <w:b/>
+                <w:bCs/>
+              </w:rPr>
+              <w:lastRenderedPageBreak/>
+              <w:t>Post-condizione</w:t>
+            </w:r>
+          </w:p>
+        </w:tc>
+        <w:tc>
+          <w:tcPr>
+            <w:tcW w:w="7080" w:type="dxa"/>
+          </w:tcPr>
+          <w:p>
+            <w:pPr>
+              <w:rPr>
+                <w:lang w:val="en-GB"/>
+              </w:rPr>
+            </w:pPr>
+            <w:r>
+              <w:rPr>
+                <w:lang w:val="en-GB"/>
+              </w:rPr>
+              <w:t xml:space="preserve">context </w:t>
+            </w:r>
+            <w:proofErr w:type="spellStart"/>
+            <w:proofErr w:type="gramStart"/>
+            <w:r>
+              <w:rPr>
+                <w:lang w:val="en-GB"/>
+              </w:rPr>
+              <w:t>AllegatoService</w:t>
+            </w:r>
+            <w:proofErr w:type="spellEnd"/>
+            <w:r>
+              <w:rPr>
+                <w:lang w:val="en-GB"/>
+              </w:rPr>
+              <w:t>::</w:t>
+            </w:r>
+            <w:proofErr w:type="spellStart"/>
+            <w:proofErr w:type="gramEnd"/>
+            <w:r>
+              <w:rPr>
+                <w:lang w:val="en-GB"/>
+              </w:rPr>
+              <w:t>uploadAllegato</w:t>
+            </w:r>
+            <w:proofErr w:type="spellEnd"/>
+            <w:r>
+              <w:rPr>
+                <w:lang w:val="en-GB"/>
+              </w:rPr>
+              <w:t>(</w:t>
+            </w:r>
+            <w:proofErr w:type="spellStart"/>
+            <w:r>
+              <w:rPr>
+                <w:lang w:val="en-GB"/>
+              </w:rPr>
+              <w:t>fileItem</w:t>
+            </w:r>
+            <w:proofErr w:type="spellEnd"/>
+            <w:r>
+              <w:rPr>
+                <w:lang w:val="en-GB"/>
+              </w:rPr>
+              <w:t xml:space="preserve">: </w:t>
+            </w:r>
+            <w:proofErr w:type="spellStart"/>
+            <w:r>
+              <w:rPr>
+                <w:lang w:val="en-GB"/>
+              </w:rPr>
+              <w:t>FileItem</w:t>
+            </w:r>
+            <w:proofErr w:type="spellEnd"/>
+            <w:r>
+              <w:rPr>
+                <w:lang w:val="en-GB"/>
+              </w:rPr>
+              <w:t xml:space="preserve">, </w:t>
+            </w:r>
+            <w:proofErr w:type="spellStart"/>
+            <w:r>
+              <w:rPr>
+                <w:lang w:val="en-GB"/>
+              </w:rPr>
+              <w:t>uploadDir</w:t>
+            </w:r>
+            <w:proofErr w:type="spellEnd"/>
+            <w:r>
+              <w:rPr>
+                <w:lang w:val="en-GB"/>
+              </w:rPr>
+              <w:t>: String)</w:t>
+            </w:r>
+          </w:p>
+          <w:p>
+            <w:pPr>
+              <w:rPr>
+                <w:lang w:val="en-GB"/>
+              </w:rPr>
+            </w:pPr>
+          </w:p>
+          <w:p>
+            <w:pPr>
+              <w:rPr>
+                <w:lang w:val="en-GB"/>
+              </w:rPr>
+            </w:pPr>
+            <w:r>
+              <w:rPr>
+                <w:lang w:val="en-GB"/>
+              </w:rPr>
+              <w:t xml:space="preserve">result &lt;&gt; null and </w:t>
+            </w:r>
+            <w:proofErr w:type="spellStart"/>
+            <w:r>
+              <w:rPr>
+                <w:lang w:val="en-GB"/>
+              </w:rPr>
+              <w:t>result.oclIsNew</w:t>
+            </w:r>
+            <w:proofErr w:type="spellEnd"/>
+            <w:r>
+              <w:rPr>
+                <w:lang w:val="en-GB"/>
+              </w:rPr>
+              <w:t>()</w:t>
+            </w:r>
+          </w:p>
+        </w:tc>
+      </w:tr>
     </w:tbl>
     <w:p>
       <w:pPr>
-        <w:pStyle w:val="Titolo4"/>
-        <w:ind w:left="284"/>
         <w:rPr>
           <w:lang w:val="en-GB"/>
         </w:rPr>
@@ -16294,7 +17046,6 @@
                 <w:b/>
                 <w:bCs/>
               </w:rPr>
-              <w:lastRenderedPageBreak/>
               <w:t>Invariante di classe</w:t>
             </w:r>
           </w:p>
@@ -16844,6 +17595,7 @@
                 <w:b/>
                 <w:bCs/>
               </w:rPr>
+              <w:lastRenderedPageBreak/>
               <w:t>Pre-condizione</w:t>
             </w:r>
           </w:p>
@@ -16886,13 +17638,7 @@
               <w:t>)</w:t>
             </w:r>
           </w:p>
-          <w:p>
-            <w:pPr>
-              <w:rPr>
-                <w:lang w:val="en-GB"/>
-              </w:rPr>
-            </w:pPr>
-          </w:p>
+          <w:p/>
           <w:p>
             <w:pPr>
               <w:rPr>
@@ -16981,13 +17727,7 @@
               <w:rPr>
                 <w:lang w:val="en-GB"/>
               </w:rPr>
-              <w:t>COMPLETATO</w:t>
-            </w:r>
-            <w:r>
-              <w:rPr>
-                <w:lang w:val="en-GB"/>
-              </w:rPr>
-              <w:t xml:space="preserve"> </w:t>
+              <w:t xml:space="preserve">COMPLETATO </w:t>
             </w:r>
           </w:p>
           <w:p>
@@ -17059,13 +17799,7 @@
               <w:t>)</w:t>
             </w:r>
           </w:p>
-          <w:p>
-            <w:pPr>
-              <w:rPr>
-                <w:lang w:val="en-GB"/>
-              </w:rPr>
-            </w:pPr>
-          </w:p>
+          <w:p/>
           <w:p>
             <w:pPr>
               <w:rPr>
@@ -17389,7 +18123,6 @@
           </w:tcPr>
           <w:p>
             <w:r>
-              <w:lastRenderedPageBreak/>
               <w:t>Pre-condizione</w:t>
             </w:r>
           </w:p>
@@ -17912,6 +18645,7 @@
         <w:rPr>
           <w:lang w:val="en-GB"/>
         </w:rPr>
+        <w:lastRenderedPageBreak/>
         <w:t>NotificheService</w:t>
       </w:r>
       <w:proofErr w:type="spellEnd"/>
@@ -18404,7 +19138,6 @@
               <w:spacing w:after="160" w:line="259" w:lineRule="auto"/>
             </w:pPr>
             <w:r>
-              <w:lastRenderedPageBreak/>
               <w:t>Post-condizione</w:t>
             </w:r>
           </w:p>
@@ -19265,7 +19998,6 @@
               <w:spacing w:after="160" w:line="259" w:lineRule="auto"/>
             </w:pPr>
             <w:r>
-              <w:lastRenderedPageBreak/>
               <w:t>Nome classe</w:t>
             </w:r>
           </w:p>
@@ -19843,6 +20575,7 @@
               <w:spacing w:after="160" w:line="259" w:lineRule="auto"/>
             </w:pPr>
             <w:r>
+              <w:lastRenderedPageBreak/>
               <w:t>Post-condizione</w:t>
             </w:r>
           </w:p>
@@ -20232,11 +20965,7 @@
       </w:r>
       <w:proofErr w:type="spellEnd"/>
       <w:r>
-        <w:t xml:space="preserve"> punteranno a mantenere coerente il database sottostante, non conosceranno quindi la logica di business del sistema ma effettueranno controlli </w:t>
-      </w:r>
-      <w:r>
-        <w:lastRenderedPageBreak/>
-        <w:t xml:space="preserve">esclusivamente per assicurarsi un corretto inserimento all’interno delle tabelle dei dati passati dal service. </w:t>
+        <w:t xml:space="preserve"> punteranno a mantenere coerente il database sottostante, non conosceranno quindi la logica di business del sistema ma effettueranno controlli esclusivamente per assicurarsi un corretto inserimento all’interno delle tabelle dei dati passati dal service. </w:t>
       </w:r>
     </w:p>
     <w:p/>
@@ -20687,6 +21416,7 @@
               <w:spacing w:after="160" w:line="259" w:lineRule="auto"/>
             </w:pPr>
             <w:r>
+              <w:lastRenderedPageBreak/>
               <w:t xml:space="preserve">+ </w:t>
             </w:r>
             <w:proofErr w:type="spellStart"/>
@@ -21187,6 +21917,7 @@
                 <w:b/>
                 <w:bCs/>
               </w:rPr>
+              <w:lastRenderedPageBreak/>
               <w:t>Invariante</w:t>
             </w:r>
           </w:p>
@@ -21374,7 +22105,6 @@
                 <w:b/>
                 <w:bCs/>
               </w:rPr>
-              <w:lastRenderedPageBreak/>
               <w:t>Pre-condizione</w:t>
             </w:r>
           </w:p>
@@ -22050,6 +22780,7 @@
           <w:p>
             <w:proofErr w:type="spellStart"/>
             <w:r>
+              <w:lastRenderedPageBreak/>
               <w:t>Utente.allIstances</w:t>
             </w:r>
             <w:proofErr w:type="spellEnd"/>
@@ -22721,7 +23452,6 @@
                 <w:b/>
                 <w:bCs/>
               </w:rPr>
-              <w:lastRenderedPageBreak/>
               <w:t>Pre-condizione</w:t>
             </w:r>
           </w:p>
@@ -23570,6 +24300,7 @@
               <w:rPr>
                 <w:lang w:val="en-GB"/>
               </w:rPr>
+              <w:lastRenderedPageBreak/>
               <w:t xml:space="preserve">if </w:t>
             </w:r>
             <w:proofErr w:type="spellStart"/>
@@ -24538,6 +25269,7 @@
                 <w:b/>
                 <w:bCs/>
               </w:rPr>
+              <w:lastRenderedPageBreak/>
               <w:t>Firma metodo</w:t>
             </w:r>
           </w:p>
@@ -25018,7 +25750,6 @@
                 <w:b/>
                 <w:bCs/>
               </w:rPr>
-              <w:lastRenderedPageBreak/>
               <w:t>Pre-condizione</w:t>
             </w:r>
           </w:p>
@@ -25687,6 +26418,7 @@
           </w:p>
           <w:p>
             <w:r>
+              <w:lastRenderedPageBreak/>
               <w:t>(</w:t>
             </w:r>
             <w:proofErr w:type="spellStart"/>
@@ -25760,6 +26492,7 @@
                 <w:b/>
                 <w:bCs/>
               </w:rPr>
+              <w:lastRenderedPageBreak/>
               <w:t>Post-condizione</w:t>
             </w:r>
           </w:p>
@@ -26977,6 +27710,7 @@
           <w:p>
             <w:proofErr w:type="spellStart"/>
             <w:r>
+              <w:lastRenderedPageBreak/>
               <w:t>Dipendente.allIstances</w:t>
             </w:r>
             <w:proofErr w:type="spellEnd"/>
@@ -27602,7 +28336,6 @@
                 <w:b/>
                 <w:bCs/>
               </w:rPr>
-              <w:lastRenderedPageBreak/>
               <w:t>Pre-condizione</w:t>
             </w:r>
           </w:p>
@@ -28432,6 +29165,7 @@
                 <w:b/>
                 <w:bCs/>
               </w:rPr>
+              <w:lastRenderedPageBreak/>
               <w:t>Descrizione</w:t>
             </w:r>
           </w:p>
@@ -28885,7 +29619,6 @@
               <w:spacing w:after="160" w:line="259" w:lineRule="auto"/>
             </w:pPr>
             <w:r>
-              <w:lastRenderedPageBreak/>
               <w:t>Descrizione</w:t>
             </w:r>
           </w:p>
@@ -29493,6 +30226,7 @@
               <w:rPr>
                 <w:lang w:val="en-GB"/>
               </w:rPr>
+              <w:lastRenderedPageBreak/>
               <w:t>task.supervisore</w:t>
             </w:r>
             <w:proofErr w:type="spellEnd"/>
@@ -29618,6 +30352,7 @@
           </w:tcPr>
           <w:p>
             <w:r>
+              <w:lastRenderedPageBreak/>
               <w:t>Post-condizione</w:t>
             </w:r>
           </w:p>
@@ -30080,7 +30815,6 @@
               <w:rPr>
                 <w:lang w:val="en-GB"/>
               </w:rPr>
-              <w:lastRenderedPageBreak/>
               <w:t xml:space="preserve">if </w:t>
             </w:r>
             <w:r>
@@ -31349,7 +32083,6 @@
           </w:tcPr>
           <w:p>
             <w:r>
-              <w:lastRenderedPageBreak/>
               <w:t>Post-condizione</w:t>
             </w:r>
           </w:p>
@@ -31767,6 +32500,7 @@
           </w:tcPr>
           <w:p>
             <w:r>
+              <w:lastRenderedPageBreak/>
               <w:t>Pre-condizione</w:t>
             </w:r>
           </w:p>

</xml_diff>

<commit_message>
Mod: mmodifiche a precondizione e postcondizioni di alcuni metodi
</commit_message>
<xml_diff>
--- a/Workspace/ODD/ODD_EWMS.docx
+++ b/Workspace/ODD/ODD_EWMS.docx
@@ -23614,7 +23614,13 @@
               <w:rPr>
                 <w:lang w:val="en-GB"/>
               </w:rPr>
-              <w:t>250</w:t>
+              <w:t>25</w:t>
+            </w:r>
+            <w:r>
+              <w:rPr>
+                <w:lang w:val="en-GB"/>
+              </w:rPr>
+              <w:t>5</w:t>
             </w:r>
             <w:r>
               <w:rPr>
@@ -23914,6 +23920,97 @@
           <w:tcPr>
             <w:tcW w:w="8647" w:type="dxa"/>
           </w:tcPr>
+          <w:p>
+            <w:pPr>
+              <w:rPr>
+                <w:lang w:val="en-GB"/>
+              </w:rPr>
+            </w:pPr>
+            <w:r>
+              <w:rPr>
+                <w:lang w:val="en-GB"/>
+              </w:rPr>
+              <w:t xml:space="preserve">Context </w:t>
+            </w:r>
+            <w:proofErr w:type="spellStart"/>
+            <w:proofErr w:type="gramStart"/>
+            <w:r>
+              <w:rPr>
+                <w:lang w:val="en-GB"/>
+              </w:rPr>
+              <w:t>UtenteDAO</w:t>
+            </w:r>
+            <w:proofErr w:type="spellEnd"/>
+            <w:r>
+              <w:rPr>
+                <w:lang w:val="en-GB"/>
+              </w:rPr>
+              <w:t>::</w:t>
+            </w:r>
+            <w:proofErr w:type="gramEnd"/>
+            <w:r>
+              <w:rPr>
+                <w:lang w:val="en-GB"/>
+              </w:rPr>
+              <w:t xml:space="preserve"> </w:t>
+            </w:r>
+            <w:proofErr w:type="spellStart"/>
+            <w:r>
+              <w:rPr>
+                <w:lang w:val="en-GB"/>
+              </w:rPr>
+              <w:t>insertUtenteGenerico</w:t>
+            </w:r>
+            <w:proofErr w:type="spellEnd"/>
+            <w:r>
+              <w:rPr>
+                <w:lang w:val="en-GB"/>
+              </w:rPr>
+              <w:t>(</w:t>
+            </w:r>
+            <w:proofErr w:type="spellStart"/>
+            <w:r>
+              <w:rPr>
+                <w:lang w:val="en-GB"/>
+              </w:rPr>
+              <w:t>connection:Connection</w:t>
+            </w:r>
+            <w:proofErr w:type="spellEnd"/>
+            <w:r>
+              <w:rPr>
+                <w:lang w:val="en-GB"/>
+              </w:rPr>
+              <w:t xml:space="preserve">, </w:t>
+            </w:r>
+            <w:proofErr w:type="spellStart"/>
+            <w:r>
+              <w:rPr>
+                <w:lang w:val="en-GB"/>
+              </w:rPr>
+              <w:t>utente:Utente</w:t>
+            </w:r>
+            <w:proofErr w:type="spellEnd"/>
+            <w:r>
+              <w:rPr>
+                <w:lang w:val="en-GB"/>
+              </w:rPr>
+              <w:t xml:space="preserve">, </w:t>
+            </w:r>
+            <w:proofErr w:type="spellStart"/>
+            <w:r>
+              <w:rPr>
+                <w:lang w:val="en-GB"/>
+              </w:rPr>
+              <w:t>password:String</w:t>
+            </w:r>
+            <w:proofErr w:type="spellEnd"/>
+            <w:r>
+              <w:rPr>
+                <w:lang w:val="en-GB"/>
+              </w:rPr>
+              <w:t>)</w:t>
+            </w:r>
+          </w:p>
           <w:p/>
           <w:p>
             <w:proofErr w:type="spellStart"/>
@@ -23931,6 +24028,59 @@
             <w:proofErr w:type="spellEnd"/>
             <w:r>
               <w:t>(utente)</w:t>
+            </w:r>
+          </w:p>
+          <w:p>
+            <w:pPr>
+              <w:rPr>
+                <w:lang w:val="en-GB"/>
+              </w:rPr>
+            </w:pPr>
+            <w:proofErr w:type="spellStart"/>
+            <w:r>
+              <w:rPr>
+                <w:lang w:val="en-GB"/>
+              </w:rPr>
+              <w:t>Utente.allIstances</w:t>
+            </w:r>
+            <w:proofErr w:type="spellEnd"/>
+            <w:r>
+              <w:rPr>
+                <w:lang w:val="en-GB"/>
+              </w:rPr>
+              <w:t>()-&gt;size()</w:t>
+            </w:r>
+            <w:r>
+              <w:rPr>
+                <w:lang w:val="en-GB"/>
+              </w:rPr>
+              <w:t xml:space="preserve"> = </w:t>
+            </w:r>
+            <w:proofErr w:type="spellStart"/>
+            <w:r>
+              <w:rPr>
+                <w:lang w:val="en-GB"/>
+              </w:rPr>
+              <w:t>Utente.allIstances</w:t>
+            </w:r>
+            <w:proofErr w:type="spellEnd"/>
+            <w:r>
+              <w:rPr>
+                <w:lang w:val="en-GB"/>
+              </w:rPr>
+              <w:t>()-&gt;size()@pre</w:t>
+            </w:r>
+            <w:r>
+              <w:rPr>
+                <w:lang w:val="en-GB"/>
+              </w:rPr>
+              <w:t xml:space="preserve"> </w:t>
+            </w:r>
+            <w:r>
+              <w:rPr>
+                <w:lang w:val="en-GB"/>
+              </w:rPr>
+              <w:t>+ 1</w:t>
             </w:r>
           </w:p>
         </w:tc>
@@ -23949,6 +24099,7 @@
               <w:rPr>
                 <w:b/>
                 <w:bCs/>
+                <w:lang w:val="en-GB"/>
               </w:rPr>
             </w:pPr>
           </w:p>
@@ -24202,6 +24353,7 @@
                 <w:b/>
                 <w:bCs/>
               </w:rPr>
+              <w:lastRenderedPageBreak/>
               <w:t>Post-condizione</w:t>
             </w:r>
           </w:p>
@@ -24300,7 +24452,6 @@
               <w:rPr>
                 <w:lang w:val="en-GB"/>
               </w:rPr>
-              <w:lastRenderedPageBreak/>
               <w:t xml:space="preserve">if </w:t>
             </w:r>
             <w:proofErr w:type="spellStart"/>
@@ -25177,6 +25328,7 @@
             </w:pPr>
             <w:proofErr w:type="spellStart"/>
             <w:r>
+              <w:lastRenderedPageBreak/>
               <w:t>result</w:t>
             </w:r>
             <w:proofErr w:type="spellEnd"/>
@@ -25269,7 +25421,6 @@
                 <w:b/>
                 <w:bCs/>
               </w:rPr>
-              <w:lastRenderedPageBreak/>
               <w:t>Firma metodo</w:t>
             </w:r>
           </w:p>
@@ -26418,7 +26569,6 @@
           </w:p>
           <w:p>
             <w:r>
-              <w:lastRenderedPageBreak/>
               <w:t>(</w:t>
             </w:r>
             <w:proofErr w:type="spellStart"/>
@@ -27608,6 +27758,7 @@
                 <w:b/>
                 <w:bCs/>
               </w:rPr>
+              <w:lastRenderedPageBreak/>
               <w:t>Pre-condizione</w:t>
             </w:r>
           </w:p>
@@ -27710,7 +27861,6 @@
           <w:p>
             <w:proofErr w:type="spellStart"/>
             <w:r>
-              <w:lastRenderedPageBreak/>
               <w:t>Dipendente.allIstances</w:t>
             </w:r>
             <w:proofErr w:type="spellEnd"/>
@@ -29001,6 +29151,7 @@
                 <w:b/>
                 <w:bCs/>
               </w:rPr>
+              <w:lastRenderedPageBreak/>
               <w:t>Post-condizione</w:t>
             </w:r>
           </w:p>
@@ -29165,7 +29316,6 @@
                 <w:b/>
                 <w:bCs/>
               </w:rPr>
-              <w:lastRenderedPageBreak/>
               <w:t>Descrizione</w:t>
             </w:r>
           </w:p>
@@ -30105,6 +30255,7 @@
           <w:p>
             <w:proofErr w:type="spellStart"/>
             <w:r>
+              <w:lastRenderedPageBreak/>
               <w:t>task.dataDiScadenza</w:t>
             </w:r>
             <w:proofErr w:type="spellEnd"/>
@@ -30226,7 +30377,6 @@
               <w:rPr>
                 <w:lang w:val="en-GB"/>
               </w:rPr>
-              <w:lastRenderedPageBreak/>
               <w:t>task.supervisore</w:t>
             </w:r>
             <w:proofErr w:type="spellEnd"/>
@@ -32405,6 +32555,7 @@
               <w:spacing w:after="160" w:line="259" w:lineRule="auto"/>
             </w:pPr>
             <w:r>
+              <w:lastRenderedPageBreak/>
               <w:t>Invariante</w:t>
             </w:r>
           </w:p>
@@ -32500,7 +32651,6 @@
           </w:tcPr>
           <w:p>
             <w:r>
-              <w:lastRenderedPageBreak/>
               <w:t>Pre-condizione</w:t>
             </w:r>
           </w:p>

</xml_diff>

<commit_message>
Mod: modificati svariati documenti per consistenza con codice
</commit_message>
<xml_diff>
--- a/Workspace/ODD/ODD_EWMS.docx
+++ b/Workspace/ODD/ODD_EWMS.docx
@@ -12451,7 +12451,7 @@
             </w:r>
             <w:proofErr w:type="spellStart"/>
             <w:r>
-              <w:t>void</w:t>
+              <w:t>boolean</w:t>
             </w:r>
             <w:proofErr w:type="spellEnd"/>
           </w:p>
@@ -14058,9 +14058,19 @@
             <w:pPr>
               <w:spacing w:after="160" w:line="259" w:lineRule="auto"/>
             </w:pPr>
-            <w:r>
-              <w:t>/</w:t>
-            </w:r>
+            <w:proofErr w:type="spellStart"/>
+            <w:r>
+              <w:t>service:PersistenceService</w:t>
+            </w:r>
+            <w:proofErr w:type="spellEnd"/>
+            <w:r>
+              <w:t xml:space="preserve"> &lt;&gt; </w:t>
+            </w:r>
+            <w:proofErr w:type="spellStart"/>
+            <w:r>
+              <w:t>null</w:t>
+            </w:r>
+            <w:proofErr w:type="spellEnd"/>
           </w:p>
         </w:tc>
       </w:tr>
@@ -15035,58 +15045,42 @@
             </w:r>
           </w:p>
           <w:p>
-            <w:pPr>
-              <w:rPr>
-                <w:lang w:val="en-GB"/>
-              </w:rPr>
-            </w:pPr>
-            <w:proofErr w:type="spellStart"/>
-            <w:r>
-              <w:rPr>
-                <w:lang w:val="en-GB"/>
-              </w:rPr>
+            <w:proofErr w:type="spellStart"/>
+            <w:r>
               <w:t>priorita</w:t>
             </w:r>
             <w:proofErr w:type="spellEnd"/>
             <w:r>
-              <w:rPr>
-                <w:lang w:val="en-GB"/>
-              </w:rPr>
-              <w:t xml:space="preserve"> &lt;&gt; null and</w:t>
-            </w:r>
-            <w:r>
-              <w:rPr>
-                <w:lang w:val="en-GB"/>
-              </w:rPr>
+              <w:t xml:space="preserve"> &lt;&gt; </w:t>
+            </w:r>
+            <w:proofErr w:type="spellStart"/>
+            <w:r>
+              <w:t>null</w:t>
+            </w:r>
+            <w:proofErr w:type="spellEnd"/>
+            <w:r>
+              <w:t xml:space="preserve"> and</w:t>
+            </w:r>
+            <w:r>
               <w:br/>
             </w:r>
             <w:proofErr w:type="spellStart"/>
             <w:r>
-              <w:rPr>
-                <w:lang w:val="en-GB"/>
-              </w:rPr>
               <w:t>dataScadenza</w:t>
             </w:r>
             <w:proofErr w:type="spellEnd"/>
             <w:r>
-              <w:rPr>
-                <w:lang w:val="en-GB"/>
-              </w:rPr>
               <w:t xml:space="preserve"> &gt; </w:t>
             </w:r>
+            <w:proofErr w:type="spellStart"/>
             <w:proofErr w:type="gramStart"/>
             <w:r>
-              <w:rPr>
-                <w:lang w:val="en-GB"/>
-              </w:rPr>
-              <w:t>Date::</w:t>
-            </w:r>
+              <w:t>dataCreazione</w:t>
+            </w:r>
+            <w:proofErr w:type="spellEnd"/>
             <w:proofErr w:type="gramEnd"/>
             <w:r>
-              <w:rPr>
-                <w:lang w:val="en-GB"/>
-              </w:rPr>
-              <w:t xml:space="preserve">now() and </w:t>
+              <w:t xml:space="preserve"> and </w:t>
             </w:r>
           </w:p>
           <w:p>
@@ -17065,9 +17059,19 @@
             <w:pPr>
               <w:spacing w:after="160" w:line="259" w:lineRule="auto"/>
             </w:pPr>
-            <w:r>
-              <w:t>/</w:t>
-            </w:r>
+            <w:proofErr w:type="spellStart"/>
+            <w:r>
+              <w:t>service:PersistenceService</w:t>
+            </w:r>
+            <w:proofErr w:type="spellEnd"/>
+            <w:r>
+              <w:t xml:space="preserve"> &lt;&gt; </w:t>
+            </w:r>
+            <w:proofErr w:type="spellStart"/>
+            <w:r>
+              <w:t>null</w:t>
+            </w:r>
+            <w:proofErr w:type="spellEnd"/>
           </w:p>
         </w:tc>
       </w:tr>
@@ -18577,6 +18581,13 @@
         </w:tc>
       </w:tr>
     </w:tbl>
+    <w:p>
+      <w:pPr>
+        <w:rPr>
+          <w:lang w:val="en-GB"/>
+        </w:rPr>
+      </w:pPr>
+    </w:p>
     <w:p>
       <w:pPr>
         <w:rPr>
@@ -18616,6 +18627,7 @@
         <w:rPr>
           <w:lang w:val="en-GB"/>
         </w:rPr>
+        <w:lastRenderedPageBreak/>
         <w:t>NotificheManagement</w:t>
       </w:r>
       <w:bookmarkEnd w:id="10"/>
@@ -18645,7 +18657,6 @@
         <w:rPr>
           <w:lang w:val="en-GB"/>
         </w:rPr>
-        <w:lastRenderedPageBreak/>
         <w:t>NotificheService</w:t>
       </w:r>
       <w:proofErr w:type="spellEnd"/>
@@ -20541,6 +20552,7 @@
               <w:spacing w:after="160" w:line="259" w:lineRule="auto"/>
             </w:pPr>
             <w:r>
+              <w:lastRenderedPageBreak/>
               <w:t>Pre-condizione</w:t>
             </w:r>
           </w:p>
@@ -20575,7 +20587,6 @@
               <w:spacing w:after="160" w:line="259" w:lineRule="auto"/>
             </w:pPr>
             <w:r>
-              <w:lastRenderedPageBreak/>
               <w:t>Post-condizione</w:t>
             </w:r>
           </w:p>
@@ -21400,6 +21411,7 @@
               <w:spacing w:after="160" w:line="259" w:lineRule="auto"/>
             </w:pPr>
             <w:r>
+              <w:lastRenderedPageBreak/>
               <w:t xml:space="preserve">+ </w:t>
             </w:r>
             <w:proofErr w:type="spellStart"/>
@@ -21416,7 +21428,6 @@
               <w:spacing w:after="160" w:line="259" w:lineRule="auto"/>
             </w:pPr>
             <w:r>
-              <w:lastRenderedPageBreak/>
               <w:t xml:space="preserve">+ </w:t>
             </w:r>
             <w:proofErr w:type="spellStart"/>
@@ -22700,6 +22711,7 @@
                 <w:b/>
                 <w:bCs/>
               </w:rPr>
+              <w:lastRenderedPageBreak/>
               <w:t>Post-condizione</w:t>
             </w:r>
           </w:p>
@@ -22780,7 +22792,6 @@
           <w:p>
             <w:proofErr w:type="spellStart"/>
             <w:r>
-              <w:lastRenderedPageBreak/>
               <w:t>Utente.allIstances</w:t>
             </w:r>
             <w:proofErr w:type="spellEnd"/>
@@ -24011,23 +24022,46 @@
               <w:t>)</w:t>
             </w:r>
           </w:p>
-          <w:p/>
-          <w:p>
-            <w:proofErr w:type="spellStart"/>
-            <w:r>
+          <w:p>
+            <w:pPr>
+              <w:rPr>
+                <w:lang w:val="en-GB"/>
+              </w:rPr>
+            </w:pPr>
+          </w:p>
+          <w:p>
+            <w:pPr>
+              <w:rPr>
+                <w:lang w:val="en-GB"/>
+              </w:rPr>
+            </w:pPr>
+            <w:proofErr w:type="spellStart"/>
+            <w:r>
+              <w:rPr>
+                <w:lang w:val="en-GB"/>
+              </w:rPr>
               <w:t>Utente.allIstances</w:t>
             </w:r>
             <w:proofErr w:type="spellEnd"/>
             <w:r>
-              <w:t>()-&gt;</w:t>
-            </w:r>
-            <w:proofErr w:type="spellStart"/>
-            <w:r>
-              <w:t>includes</w:t>
-            </w:r>
-            <w:proofErr w:type="spellEnd"/>
-            <w:r>
-              <w:t>(utente)</w:t>
+              <w:rPr>
+                <w:lang w:val="en-GB"/>
+              </w:rPr>
+              <w:t>()-&gt;includes(</w:t>
+            </w:r>
+            <w:proofErr w:type="spellStart"/>
+            <w:r>
+              <w:rPr>
+                <w:lang w:val="en-GB"/>
+              </w:rPr>
+              <w:t>utente</w:t>
+            </w:r>
+            <w:proofErr w:type="spellEnd"/>
+            <w:r>
+              <w:rPr>
+                <w:lang w:val="en-GB"/>
+              </w:rPr>
+              <w:t>)</w:t>
             </w:r>
           </w:p>
           <w:p>
@@ -24048,13 +24082,7 @@
               <w:rPr>
                 <w:lang w:val="en-GB"/>
               </w:rPr>
-              <w:t>()-&gt;size()</w:t>
-            </w:r>
-            <w:r>
-              <w:rPr>
-                <w:lang w:val="en-GB"/>
-              </w:rPr>
-              <w:t xml:space="preserve"> = </w:t>
+              <w:t xml:space="preserve">()-&gt;size() = </w:t>
             </w:r>
             <w:proofErr w:type="spellStart"/>
             <w:r>
@@ -24068,13 +24096,7 @@
               <w:rPr>
                 <w:lang w:val="en-GB"/>
               </w:rPr>
-              <w:t>()-&gt;size()@pre</w:t>
-            </w:r>
-            <w:r>
-              <w:rPr>
-                <w:lang w:val="en-GB"/>
-              </w:rPr>
-              <w:t xml:space="preserve"> </w:t>
+              <w:t xml:space="preserve">()-&gt;size()@pre </w:t>
             </w:r>
             <w:r>
               <w:rPr>
@@ -24317,6 +24339,7 @@
               <w:rPr>
                 <w:lang w:val="en-GB"/>
               </w:rPr>
+              <w:lastRenderedPageBreak/>
               <w:t>matricola</w:t>
             </w:r>
             <w:proofErr w:type="spellEnd"/>
@@ -25307,6 +25330,7 @@
             </w:pPr>
             <w:proofErr w:type="spellStart"/>
             <w:r>
+              <w:lastRenderedPageBreak/>
               <w:t>result</w:t>
             </w:r>
             <w:proofErr w:type="spellEnd"/>
@@ -25328,7 +25352,6 @@
             </w:pPr>
             <w:proofErr w:type="spellStart"/>
             <w:r>
-              <w:lastRenderedPageBreak/>
               <w:t>result</w:t>
             </w:r>
             <w:proofErr w:type="spellEnd"/>
@@ -26420,6 +26443,7 @@
                 <w:b/>
                 <w:bCs/>
               </w:rPr>
+              <w:lastRenderedPageBreak/>
               <w:t>Pre-condizione</w:t>
             </w:r>
           </w:p>
@@ -26642,7 +26666,6 @@
                 <w:b/>
                 <w:bCs/>
               </w:rPr>
-              <w:lastRenderedPageBreak/>
               <w:t>Post-condizione</w:t>
             </w:r>
           </w:p>
@@ -27715,6 +27738,7 @@
                 <w:b/>
                 <w:bCs/>
               </w:rPr>
+              <w:lastRenderedPageBreak/>
               <w:t>Descrizione</w:t>
             </w:r>
           </w:p>
@@ -27758,7 +27782,6 @@
                 <w:b/>
                 <w:bCs/>
               </w:rPr>
-              <w:lastRenderedPageBreak/>
               <w:t>Pre-condizione</w:t>
             </w:r>
           </w:p>
@@ -29129,6 +29152,7 @@
           </w:p>
           <w:p>
             <w:r>
+              <w:lastRenderedPageBreak/>
               <w:t>[precondizione necessaria considerando l’integrità referenziale]</w:t>
             </w:r>
           </w:p>
@@ -30228,6 +30252,7 @@
               <w:rPr>
                 <w:lang w:val="en-GB"/>
               </w:rPr>
+              <w:lastRenderedPageBreak/>
               <w:t>task.titolo</w:t>
             </w:r>
             <w:proofErr w:type="spellEnd"/>
@@ -30255,7 +30280,6 @@
           <w:p>
             <w:proofErr w:type="spellStart"/>
             <w:r>
-              <w:lastRenderedPageBreak/>
               <w:t>task.dataDiScadenza</w:t>
             </w:r>
             <w:proofErr w:type="spellEnd"/>
@@ -31395,6 +31419,7 @@
               <w:rPr>
                 <w:lang w:val="en-GB"/>
               </w:rPr>
+              <w:lastRenderedPageBreak/>
               <w:t xml:space="preserve">result = </w:t>
             </w:r>
             <w:proofErr w:type="spellStart"/>
@@ -35802,6 +35827,7 @@
   <w:style w:type="character" w:default="1" w:styleId="Carpredefinitoparagrafo">
     <w:name w:val="Default Paragraph Font"/>
     <w:uiPriority w:val="1"/>
+    <w:semiHidden/>
     <w:unhideWhenUsed/>
   </w:style>
   <w:style w:type="table" w:default="1" w:styleId="Tabellanormale">

</xml_diff>